<commit_message>
chore: add zoho-first admin guides and assets
</commit_message>
<xml_diff>
--- a/outputs/manual-20260601-prospecting-guides/documents/user-guide/output/Guide_Utilisateur_Prospection_V3_Validation_Envoi_Prospect_TransferAI_2026-06-01.docx
+++ b/outputs/manual-20260601-prospecting-guides/documents/user-guide/output/Guide_Utilisateur_Prospection_V3_Validation_Envoi_Prospect_TransferAI_2026-06-01.docx
@@ -93,6 +93,62 @@
           <w:spacing w:val="0"/>
           <w:color w:val="181E2A"/>
         </w:rPr>
+        <w:t xml:space="preserve">Workflow de référence pour cette mise à jour :</w:t>
+      </w:r>
+      <w:r>
+        <w:rPr>
+          <w:rFonts w:ascii="Helvetica" w:hAnsi="Helvetica" w:cs="Helvetica"/>
+          <w:sz w:val="29"/>
+          <w:sz-cs w:val="29"/>
+          <w:spacing w:val="0"/>
+          <w:color w:val="181E2A"/>
+        </w:rPr>
+        <w:t xml:space="preserve"> </w:t>
+      </w:r>
+      <w:r>
+        <w:rPr>
+          <w:rFonts w:ascii="Menlo" w:hAnsi="Menlo" w:cs="Menlo"/>
+          <w:sz w:val="25"/>
+          <w:sz-cs w:val="25"/>
+          <w:spacing w:val="0"/>
+          <w:color w:val="181E2A"/>
+        </w:rPr>
+        <w:t xml:space="preserve">TransferAI Prospecting V3 CRM Enhanced [FINAL]-10.json</w:t>
+      </w:r>
+      <w:r>
+        <w:rPr>
+          <w:rFonts w:ascii="Helvetica" w:hAnsi="Helvetica" w:cs="Helvetica"/>
+          <w:sz w:val="29"/>
+          <w:sz-cs w:val="29"/>
+          <w:spacing w:val="0"/>
+          <w:color w:val="181E2A"/>
+        </w:rPr>
+        <w:t xml:space="preserve"> exporté depuis n8n, 53 nœuds.</w:t>
+      </w:r>
+      <w:r>
+        <w:rPr>
+          <w:rFonts w:ascii="Helvetica" w:hAnsi="Helvetica" w:cs="Helvetica"/>
+          <w:sz w:val="29"/>
+          <w:sz-cs w:val="29"/>
+          <w:spacing w:val="0"/>
+          <w:color w:val="181E2A"/>
+        </w:rPr>
+        <w:t xml:space="preserve"/>
+      </w:r>
+    </w:p>
+    <w:p>
+      <w:pPr>
+        <w:spacing w:after="213"/>
+      </w:pPr>
+      <w:r>
+        <w:rPr>
+          <w:rFonts w:ascii="Helvetica" w:hAnsi="Helvetica" w:cs="Helvetica"/>
+          <w:sz w:val="29"/>
+          <w:sz-cs w:val="29"/>
+          <w:b/>
+          <w:spacing w:val="0"/>
+          <w:color w:val="181E2A"/>
+        </w:rPr>
         <w:t xml:space="preserve">Portée :</w:t>
       </w:r>
       <w:r>
@@ -103,7 +159,27 @@
           <w:spacing w:val="0"/>
           <w:color w:val="181E2A"/>
         </w:rPr>
-        <w:t xml:space="preserve"> ce document fusionne les guides utilisateur, administrateur, batch CRM et exploitation n8n créés depuis le début du projet jusqu’à la stabilisation actuelle.</w:t>
+        <w:t xml:space="preserve"> ce document fusionne les guides utilisateur, administrateur, batch CRM et exploitation n8n créés depuis le début du projet jusqu’à la stabilisation actuelle, puis les aligne sur l’export </w:t>
+      </w:r>
+      <w:r>
+        <w:rPr>
+          <w:rFonts w:ascii="Menlo" w:hAnsi="Menlo" w:cs="Menlo"/>
+          <w:sz w:val="25"/>
+          <w:sz-cs w:val="25"/>
+          <w:spacing w:val="0"/>
+          <w:color w:val="181E2A"/>
+        </w:rPr>
+        <w:t xml:space="preserve">FINAL-10</w:t>
+      </w:r>
+      <w:r>
+        <w:rPr>
+          <w:rFonts w:ascii="Helvetica" w:hAnsi="Helvetica" w:cs="Helvetica"/>
+          <w:sz w:val="29"/>
+          <w:sz-cs w:val="29"/>
+          <w:spacing w:val="0"/>
+          <w:color w:val="181E2A"/>
+        </w:rPr>
+        <w:t xml:space="preserve">.</w:t>
       </w:r>
       <w:r>
         <w:rPr>
@@ -139,7 +215,7 @@
           <w:spacing w:val="0"/>
           <w:color w:val="181E2A"/>
         </w:rPr>
-        <w:t xml:space="preserve"> donner un document unique pour comprendre le dispositif, l’utiliser au quotidien, préparer un envoi prospect, maintenir les bons secrets et savoir quel workflow joue quel rôle.</w:t>
+        <w:t xml:space="preserve"> donner un document unique pour comprendre le dispositif, l’utiliser au quotidien, préparer un envoi prospect, maintenir les bons secrets et savoir quel workflow joue quel rôle, y compris quand un export n8n conserve encore des nœuds de compatibilité.</w:t>
       </w:r>
       <w:r>
         <w:rPr>
@@ -165,7 +241,7 @@
           <w:spacing w:val="0"/>
           <w:color w:val="0F3A6E"/>
         </w:rPr>
-        <w:t xml:space="preserve">1. Objet et perimetre</w:t>
+        <w:t xml:space="preserve">1. Objet et périmètre</w:t>
       </w:r>
     </w:p>
     <w:p>
@@ -180,7 +256,7 @@
           <w:spacing w:val="0"/>
           <w:color w:val="181E2A"/>
         </w:rPr>
-        <w:t xml:space="preserve">Le systeme TransferAI ne se limite pas a un simple workflow n8n. Il s agit d une chaine complete qui couvre :</w:t>
+        <w:t xml:space="preserve">Le système TransferAI ne se limite pas à un simple workflow n8n. Il s’agit d’une chaîne complète qui couvre :</w:t>
       </w:r>
     </w:p>
     <w:p>
@@ -238,7 +314,7 @@
           <w:spacing w:val="0"/>
           <w:color w:val="181E2A"/>
         </w:rPr>
-        <w:t xml:space="preserve">la protection des donnees avant appel LLM,</w:t>
+        <w:t xml:space="preserve">la protection des données avant appel LLM,</w:t>
       </w:r>
     </w:p>
     <w:p>
@@ -267,7 +343,7 @@
           <w:spacing w:val="0"/>
           <w:color w:val="181E2A"/>
         </w:rPr>
-        <w:t xml:space="preserve">la generation de livrables commerciaux,</w:t>
+        <w:t xml:space="preserve">la génération de livrables commerciaux,</w:t>
       </w:r>
     </w:p>
     <w:p>
@@ -325,7 +401,7 @@
           <w:spacing w:val="0"/>
           <w:color w:val="181E2A"/>
         </w:rPr>
-        <w:t xml:space="preserve">l envoi prospect apres approbation,</w:t>
+        <w:t xml:space="preserve">l’envoi prospect après approbation,</w:t>
       </w:r>
     </w:p>
     <w:p>
@@ -383,7 +459,7 @@
           <w:spacing w:val="0"/>
           <w:color w:val="181E2A"/>
         </w:rPr>
-        <w:t xml:space="preserve">le back-office de contenu et d operations,</w:t>
+        <w:t xml:space="preserve">le back-office de contenu et d’opérations,</w:t>
       </w:r>
     </w:p>
     <w:p>
@@ -427,7 +503,27 @@
           <w:spacing w:val="0"/>
           <w:color w:val="181E2A"/>
         </w:rPr>
-        <w:t xml:space="preserve">Ce guide couvre les usages reels et les decisions structurelles valides a date. Il sert de reference utilisateur pour la V3, mais aussi de point d entree pour comprendre la logique V1, V2, V4 et V5.</w:t>
+        <w:t xml:space="preserve">Ce guide couvre les usages réels et les décisions structurelles validées à date. Il sert de référence utilisateur pour la V3, mais aussi de point d’entrée pour comprendre la logique V1, V2, V4 et V5. Cette version documente l’état concret de l’export </w:t>
+      </w:r>
+      <w:r>
+        <w:rPr>
+          <w:rFonts w:ascii="Menlo" w:hAnsi="Menlo" w:cs="Menlo"/>
+          <w:sz w:val="25"/>
+          <w:sz-cs w:val="25"/>
+          <w:spacing w:val="0"/>
+          <w:color w:val="181E2A"/>
+        </w:rPr>
+        <w:t xml:space="preserve">FINAL-10</w:t>
+      </w:r>
+      <w:r>
+        <w:rPr>
+          <w:rFonts w:ascii="Helvetica" w:hAnsi="Helvetica" w:cs="Helvetica"/>
+          <w:sz w:val="29"/>
+          <w:sz-cs w:val="29"/>
+          <w:spacing w:val="0"/>
+          <w:color w:val="181E2A"/>
+        </w:rPr>
+        <w:t xml:space="preserve">, y compris les écarts restant à corriger avant un passage complet en production.</w:t>
       </w:r>
     </w:p>
     <w:p>
@@ -1236,6 +1332,132 @@
       </w:r>
     </w:p>
     <w:p>
+      <w:pPr/>
+      <w:r>
+        <w:rPr>
+          <w:rFonts w:ascii="Helvetica" w:hAnsi="Helvetica" w:cs="Helvetica"/>
+          <w:sz w:val="29"/>
+          <w:sz-cs w:val="29"/>
+          <w:b/>
+          <w:spacing w:val="0"/>
+          <w:color w:val="181E2A"/>
+        </w:rPr>
+        <w:t xml:space="preserve">Point important pour le workflow </w:t>
+      </w:r>
+      <w:r>
+        <w:rPr>
+          <w:rFonts w:ascii="Menlo" w:hAnsi="Menlo" w:cs="Menlo"/>
+          <w:sz w:val="25"/>
+          <w:sz-cs w:val="25"/>
+          <w:b/>
+          <w:spacing w:val="0"/>
+          <w:color w:val="181E2A"/>
+        </w:rPr>
+        <w:t xml:space="preserve">FINAL-10</w:t>
+      </w:r>
+      <w:r>
+        <w:rPr>
+          <w:rFonts w:ascii="Helvetica" w:hAnsi="Helvetica" w:cs="Helvetica"/>
+          <w:sz w:val="29"/>
+          <w:sz-cs w:val="29"/>
+          <w:b/>
+          <w:spacing w:val="0"/>
+          <w:color w:val="181E2A"/>
+        </w:rPr>
+        <w:t xml:space="preserve"> :</w:t>
+      </w:r>
+      <w:r>
+        <w:rPr>
+          <w:rFonts w:ascii="Helvetica" w:hAnsi="Helvetica" w:cs="Helvetica"/>
+          <w:sz w:val="29"/>
+          <w:sz-cs w:val="29"/>
+          <w:spacing w:val="0"/>
+          <w:color w:val="181E2A"/>
+        </w:rPr>
+        <w:t xml:space="preserve"> l’export conserve encore des nœuds de compatibilité hérités de l’ancienne logique catalogue statique, notamment </w:t>
+      </w:r>
+      <w:r>
+        <w:rPr>
+          <w:rFonts w:ascii="Menlo" w:hAnsi="Menlo" w:cs="Menlo"/>
+          <w:sz w:val="25"/>
+          <w:sz-cs w:val="25"/>
+          <w:spacing w:val="0"/>
+          <w:color w:val="181E2A"/>
+        </w:rPr>
+        <w:t xml:space="preserve">Resolve Domain Catalogue</w:t>
+      </w:r>
+      <w:r>
+        <w:rPr>
+          <w:rFonts w:ascii="Helvetica" w:hAnsi="Helvetica" w:cs="Helvetica"/>
+          <w:sz w:val="29"/>
+          <w:sz-cs w:val="29"/>
+          <w:spacing w:val="0"/>
+          <w:color w:val="181E2A"/>
+        </w:rPr>
+        <w:t xml:space="preserve">, </w:t>
+      </w:r>
+      <w:r>
+        <w:rPr>
+          <w:rFonts w:ascii="Menlo" w:hAnsi="Menlo" w:cs="Menlo"/>
+          <w:sz w:val="25"/>
+          <w:sz-cs w:val="25"/>
+          <w:spacing w:val="0"/>
+          <w:color w:val="181E2A"/>
+        </w:rPr>
+        <w:t xml:space="preserve">Download Catalogue PDF</w:t>
+      </w:r>
+      <w:r>
+        <w:rPr>
+          <w:rFonts w:ascii="Helvetica" w:hAnsi="Helvetica" w:cs="Helvetica"/>
+          <w:sz w:val="29"/>
+          <w:sz-cs w:val="29"/>
+          <w:spacing w:val="0"/>
+          <w:color w:val="181E2A"/>
+        </w:rPr>
+        <w:t xml:space="preserve"> et </w:t>
+      </w:r>
+      <w:r>
+        <w:rPr>
+          <w:rFonts w:ascii="Menlo" w:hAnsi="Menlo" w:cs="Menlo"/>
+          <w:sz w:val="25"/>
+          <w:sz-cs w:val="25"/>
+          <w:spacing w:val="0"/>
+          <w:color w:val="181E2A"/>
+        </w:rPr>
+        <w:t xml:space="preserve">Assemble Mail Attachments</w:t>
+      </w:r>
+      <w:r>
+        <w:rPr>
+          <w:rFonts w:ascii="Helvetica" w:hAnsi="Helvetica" w:cs="Helvetica"/>
+          <w:sz w:val="29"/>
+          <w:sz-cs w:val="29"/>
+          <w:spacing w:val="0"/>
+          <w:color w:val="181E2A"/>
+        </w:rPr>
+        <w:t xml:space="preserve">. Ils sont toujours présents dans le canvas, mais la chaîne cible pour les pièces jointes finales est désormais la chaîne dynamique </w:t>
+      </w:r>
+      <w:r>
+        <w:rPr>
+          <w:rFonts w:ascii="Menlo" w:hAnsi="Menlo" w:cs="Menlo"/>
+          <w:sz w:val="25"/>
+          <w:sz-cs w:val="25"/>
+          <w:spacing w:val="0"/>
+          <w:color w:val="181E2A"/>
+        </w:rPr>
+        <w:t xml:space="preserve">Build Catalogue Render Payload -&gt; render Catalogue Artifact -&gt; Merge Catalogue Artifact -&gt; Build Deck Render Payload -&gt; Render Deck Artifact -&gt; Merge Deck Artifact</w:t>
+      </w:r>
+      <w:r>
+        <w:rPr>
+          <w:rFonts w:ascii="Helvetica" w:hAnsi="Helvetica" w:cs="Helvetica"/>
+          <w:sz w:val="29"/>
+          <w:sz-cs w:val="29"/>
+          <w:spacing w:val="0"/>
+          <w:color w:val="181E2A"/>
+        </w:rPr>
+        <w:t xml:space="preserve">.</w:t>
+      </w:r>
+    </w:p>
+    <w:p>
       <w:pPr>
         <w:spacing w:after="160"/>
       </w:pPr>
@@ -1339,7 +1561,7 @@
           <w:spacing w:val="0"/>
           <w:color w:val="181E2A"/>
         </w:rPr>
-        <w:t xml:space="preserve">base de donnees pour les packs et le CRM,</w:t>
+        <w:t xml:space="preserve">base de données pour les packs et le CRM,</w:t>
       </w:r>
     </w:p>
     <w:p>
@@ -1408,6 +1630,26 @@
           <w:color w:val="181E2A"/>
         </w:rPr>
         <w:t xml:space="preserve">catalogue-renderer</w:t>
+      </w:r>
+      <w:r>
+        <w:rPr>
+          <w:rFonts w:ascii="Helvetica" w:hAnsi="Helvetica" w:cs="Helvetica"/>
+          <w:sz w:val="29"/>
+          <w:sz-cs w:val="29"/>
+          <w:spacing w:val="0"/>
+          <w:color w:val="181E2A"/>
+        </w:rPr>
+        <w:t xml:space="preserve"> et </w:t>
+      </w:r>
+      <w:r>
+        <w:rPr>
+          <w:rFonts w:ascii="Menlo" w:hAnsi="Menlo" w:cs="Menlo"/>
+          <w:sz w:val="25"/>
+          <w:sz-cs w:val="25"/>
+          <w:spacing w:val="0"/>
+          <w:color w:val="181E2A"/>
+        </w:rPr>
+        <w:t xml:space="preserve">deck-renderer</w:t>
       </w:r>
       <w:r>
         <w:rPr>
@@ -2075,6 +2317,72 @@
       </w:r>
     </w:p>
     <w:p>
+      <w:pPr/>
+      <w:r>
+        <w:rPr>
+          <w:rFonts w:ascii="Helvetica" w:hAnsi="Helvetica" w:cs="Helvetica"/>
+          <w:sz w:val="29"/>
+          <w:sz-cs w:val="29"/>
+          <w:b/>
+          <w:spacing w:val="0"/>
+          <w:color w:val="181E2A"/>
+        </w:rPr>
+        <w:t xml:space="preserve">Constat sur l’export </w:t>
+      </w:r>
+      <w:r>
+        <w:rPr>
+          <w:rFonts w:ascii="Menlo" w:hAnsi="Menlo" w:cs="Menlo"/>
+          <w:sz w:val="25"/>
+          <w:sz-cs w:val="25"/>
+          <w:b/>
+          <w:spacing w:val="0"/>
+          <w:color w:val="181E2A"/>
+        </w:rPr>
+        <w:t xml:space="preserve">FINAL-10</w:t>
+      </w:r>
+      <w:r>
+        <w:rPr>
+          <w:rFonts w:ascii="Helvetica" w:hAnsi="Helvetica" w:cs="Helvetica"/>
+          <w:sz w:val="29"/>
+          <w:sz-cs w:val="29"/>
+          <w:b/>
+          <w:spacing w:val="0"/>
+          <w:color w:val="181E2A"/>
+        </w:rPr>
+        <w:t xml:space="preserve"> :</w:t>
+      </w:r>
+      <w:r>
+        <w:rPr>
+          <w:rFonts w:ascii="Helvetica" w:hAnsi="Helvetica" w:cs="Helvetica"/>
+          <w:sz w:val="29"/>
+          <w:sz-cs w:val="29"/>
+          <w:spacing w:val="0"/>
+          <w:color w:val="181E2A"/>
+        </w:rPr>
+        <w:t xml:space="preserve"> plusieurs secrets restent encore écrits en dur dans le fichier exporté, notamment des tokens Supabase, des valeurs </w:t>
+      </w:r>
+      <w:r>
+        <w:rPr>
+          <w:rFonts w:ascii="Menlo" w:hAnsi="Menlo" w:cs="Menlo"/>
+          <w:sz w:val="25"/>
+          <w:sz-cs w:val="25"/>
+          <w:spacing w:val="0"/>
+          <w:color w:val="181E2A"/>
+        </w:rPr>
+        <w:t xml:space="preserve">x-admin-token</w:t>
+      </w:r>
+      <w:r>
+        <w:rPr>
+          <w:rFonts w:ascii="Helvetica" w:hAnsi="Helvetica" w:cs="Helvetica"/>
+          <w:sz w:val="29"/>
+          <w:sz-cs w:val="29"/>
+          <w:spacing w:val="0"/>
+          <w:color w:val="181E2A"/>
+        </w:rPr>
+        <w:t xml:space="preserve"> et une clé Resend. Le guide utilisateur doit donc être lu avec une vigilance particulière : le workflow fonctionne en test, mais ces valeurs doivent être externalisées avant toute généralisation.</w:t>
+      </w:r>
+    </w:p>
+    <w:p>
       <w:pPr>
         <w:spacing w:after="160"/>
       </w:pPr>
@@ -2087,7 +2395,7 @@
           <w:spacing w:val="0"/>
           <w:color w:val="0F3A6E"/>
         </w:rPr>
-        <w:t xml:space="preserve">6. Cles, valeurs et comportements a remplacer pour la stabilite</w:t>
+        <w:t xml:space="preserve">6. Clés, valeurs et comportements à remplacer pour la stabilité</w:t>
       </w:r>
     </w:p>
     <w:p>
@@ -2116,6 +2424,164 @@
           <w:spacing w:val="0"/>
           <w:color w:val="181E2A"/>
         </w:rPr>
+        <w:t xml:space="preserve">Remplacer les valeurs </w:t>
+      </w:r>
+      <w:r>
+        <w:rPr>
+          <w:rFonts w:ascii="Menlo" w:hAnsi="Menlo" w:cs="Menlo"/>
+          <w:sz w:val="25"/>
+          <w:sz-cs w:val="25"/>
+          <w:spacing w:val="0"/>
+          <w:color w:val="181E2A"/>
+        </w:rPr>
+        <w:t xml:space="preserve">x-admin-token</w:t>
+      </w:r>
+      <w:r>
+        <w:rPr>
+          <w:rFonts w:ascii="Helvetica" w:hAnsi="Helvetica" w:cs="Helvetica"/>
+          <w:sz w:val="29"/>
+          <w:sz-cs w:val="29"/>
+          <w:spacing w:val="0"/>
+          <w:color w:val="181E2A"/>
+        </w:rPr>
+        <w:t xml:space="preserve"> écrites en dur dans </w:t>
+      </w:r>
+      <w:r>
+        <w:rPr>
+          <w:rFonts w:ascii="Menlo" w:hAnsi="Menlo" w:cs="Menlo"/>
+          <w:sz w:val="25"/>
+          <w:sz-cs w:val="25"/>
+          <w:spacing w:val="0"/>
+          <w:color w:val="181E2A"/>
+        </w:rPr>
+        <w:t xml:space="preserve">render Catalogue Artifact</w:t>
+      </w:r>
+      <w:r>
+        <w:rPr>
+          <w:rFonts w:ascii="Helvetica" w:hAnsi="Helvetica" w:cs="Helvetica"/>
+          <w:sz w:val="29"/>
+          <w:sz-cs w:val="29"/>
+          <w:spacing w:val="0"/>
+          <w:color w:val="181E2A"/>
+        </w:rPr>
+        <w:t xml:space="preserve"> et </w:t>
+      </w:r>
+      <w:r>
+        <w:rPr>
+          <w:rFonts w:ascii="Menlo" w:hAnsi="Menlo" w:cs="Menlo"/>
+          <w:sz w:val="25"/>
+          <w:sz-cs w:val="25"/>
+          <w:spacing w:val="0"/>
+          <w:color w:val="181E2A"/>
+        </w:rPr>
+        <w:t xml:space="preserve">Render Deck Artifact</w:t>
+      </w:r>
+      <w:r>
+        <w:rPr>
+          <w:rFonts w:ascii="Helvetica" w:hAnsi="Helvetica" w:cs="Helvetica"/>
+          <w:sz w:val="29"/>
+          <w:sz-cs w:val="29"/>
+          <w:spacing w:val="0"/>
+          <w:color w:val="181E2A"/>
+        </w:rPr>
+        <w:t xml:space="preserve"> par </w:t>
+      </w:r>
+      <w:r>
+        <w:rPr>
+          <w:rFonts w:ascii="Menlo" w:hAnsi="Menlo" w:cs="Menlo"/>
+          <w:sz w:val="25"/>
+          <w:sz-cs w:val="25"/>
+          <w:spacing w:val="0"/>
+          <w:color w:val="181E2A"/>
+        </w:rPr>
+        <w:t xml:space="preserve">{{$env.CONTENT_ADMIN_TOKEN}}</w:t>
+      </w:r>
+      <w:r>
+        <w:rPr>
+          <w:rFonts w:ascii="Helvetica" w:hAnsi="Helvetica" w:cs="Helvetica"/>
+          <w:sz w:val="29"/>
+          <w:sz-cs w:val="29"/>
+          <w:spacing w:val="0"/>
+          <w:color w:val="181E2A"/>
+        </w:rPr>
+        <w:t xml:space="preserve"> ou par une credential équivalente.</w:t>
+      </w:r>
+    </w:p>
+    <w:p>
+      <w:pPr>
+        <w:ind w:left="720" w:first-line="-720"/>
+        <w:spacing w:after="106"/>
+      </w:pPr>
+      <w:r>
+        <w:rPr>
+          <w:rFonts w:ascii="Helvetica" w:hAnsi="Helvetica" w:cs="Helvetica"/>
+          <w:sz w:val="29"/>
+          <w:sz-cs w:val="29"/>
+          <w:color w:val="181E2A"/>
+        </w:rPr>
+        <w:t xml:space="preserve"/>
+        <w:tab/>
+        <w:t xml:space="preserve">•</w:t>
+        <w:tab/>
+        <w:t xml:space="preserve"/>
+      </w:r>
+      <w:r>
+        <w:rPr>
+          <w:rFonts w:ascii="Helvetica" w:hAnsi="Helvetica" w:cs="Helvetica"/>
+          <w:sz w:val="29"/>
+          <w:sz-cs w:val="29"/>
+          <w:spacing w:val="0"/>
+          <w:color w:val="181E2A"/>
+        </w:rPr>
+        <w:t xml:space="preserve">Externaliser les clés Supabase et Resend encore écrites en dur dans l’export </w:t>
+      </w:r>
+      <w:r>
+        <w:rPr>
+          <w:rFonts w:ascii="Menlo" w:hAnsi="Menlo" w:cs="Menlo"/>
+          <w:sz w:val="25"/>
+          <w:sz-cs w:val="25"/>
+          <w:spacing w:val="0"/>
+          <w:color w:val="181E2A"/>
+        </w:rPr>
+        <w:t xml:space="preserve">FINAL-10</w:t>
+      </w:r>
+      <w:r>
+        <w:rPr>
+          <w:rFonts w:ascii="Helvetica" w:hAnsi="Helvetica" w:cs="Helvetica"/>
+          <w:sz w:val="29"/>
+          <w:sz-cs w:val="29"/>
+          <w:spacing w:val="0"/>
+          <w:color w:val="181E2A"/>
+        </w:rPr>
+        <w:t xml:space="preserve">.</w:t>
+      </w:r>
+    </w:p>
+    <w:p>
+      <w:pPr>
+        <w:ind w:left="720" w:first-line="-720"/>
+        <w:spacing w:after="106"/>
+      </w:pPr>
+      <w:r>
+        <w:rPr>
+          <w:rFonts w:ascii="Helvetica" w:hAnsi="Helvetica" w:cs="Helvetica"/>
+          <w:sz w:val="29"/>
+          <w:sz-cs w:val="29"/>
+          <w:color w:val="181E2A"/>
+        </w:rPr>
+        <w:t xml:space="preserve"/>
+        <w:tab/>
+        <w:t xml:space="preserve">•</w:t>
+        <w:tab/>
+        <w:t xml:space="preserve"/>
+      </w:r>
+      <w:r>
+        <w:rPr>
+          <w:rFonts w:ascii="Helvetica" w:hAnsi="Helvetica" w:cs="Helvetica"/>
+          <w:sz w:val="29"/>
+          <w:sz-cs w:val="29"/>
+          <w:spacing w:val="0"/>
+          <w:color w:val="181E2A"/>
+        </w:rPr>
         <w:t xml:space="preserve">Supprimer l ancien schema d auth du renderer par </w:t>
       </w:r>
       <w:r>
@@ -2234,7 +2700,47 @@
           <w:spacing w:val="0"/>
           <w:color w:val="181E2A"/>
         </w:rPr>
-        <w:t xml:space="preserve"> comme source finale de piece jointe.</w:t>
+        <w:t xml:space="preserve"> comme source finale de pièce jointe, même si </w:t>
+      </w:r>
+      <w:r>
+        <w:rPr>
+          <w:rFonts w:ascii="Menlo" w:hAnsi="Menlo" w:cs="Menlo"/>
+          <w:sz w:val="25"/>
+          <w:sz-cs w:val="25"/>
+          <w:spacing w:val="0"/>
+          <w:color w:val="181E2A"/>
+        </w:rPr>
+        <w:t xml:space="preserve">Download Catalogue PDF</w:t>
+      </w:r>
+      <w:r>
+        <w:rPr>
+          <w:rFonts w:ascii="Helvetica" w:hAnsi="Helvetica" w:cs="Helvetica"/>
+          <w:sz w:val="29"/>
+          <w:sz-cs w:val="29"/>
+          <w:spacing w:val="0"/>
+          <w:color w:val="181E2A"/>
+        </w:rPr>
+        <w:t xml:space="preserve"> et </w:t>
+      </w:r>
+      <w:r>
+        <w:rPr>
+          <w:rFonts w:ascii="Menlo" w:hAnsi="Menlo" w:cs="Menlo"/>
+          <w:sz w:val="25"/>
+          <w:sz-cs w:val="25"/>
+          <w:spacing w:val="0"/>
+          <w:color w:val="181E2A"/>
+        </w:rPr>
+        <w:t xml:space="preserve">Assemble Mail Attachments</w:t>
+      </w:r>
+      <w:r>
+        <w:rPr>
+          <w:rFonts w:ascii="Helvetica" w:hAnsi="Helvetica" w:cs="Helvetica"/>
+          <w:sz w:val="29"/>
+          <w:sz-cs w:val="29"/>
+          <w:spacing w:val="0"/>
+          <w:color w:val="181E2A"/>
+        </w:rPr>
+        <w:t xml:space="preserve"> restent visibles dans l’export.</w:t>
       </w:r>
     </w:p>
     <w:p>
@@ -2292,7 +2798,7 @@
           <w:spacing w:val="0"/>
           <w:color w:val="181E2A"/>
         </w:rPr>
-        <w:t xml:space="preserve">Ne plus dependre d un chemin disque local Mac pour les livrables ; toute generation doit passer par service backend + storage.</w:t>
+        <w:t xml:space="preserve">Ne plus dépendre d un chemin disque local Mac pour les livrables ; toute génération doit passer par service backend + storage.</w:t>
       </w:r>
     </w:p>
     <w:p>
@@ -2324,872 +2830,19 @@
           <w:spacing w:val="0"/>
           <w:color w:val="0F3A6E"/>
         </w:rPr>
-        <w:t xml:space="preserve">7.1 Nœuds clés</w:t>
-      </w:r>
-    </w:p>
-    <w:p>
-      <w:pPr>
-        <w:ind w:left="720" w:first-line="-720"/>
-        <w:spacing w:after="106"/>
-      </w:pPr>
-      <w:r>
-        <w:rPr>
-          <w:rFonts w:ascii="Helvetica" w:hAnsi="Helvetica" w:cs="Helvetica"/>
-          <w:sz w:val="29"/>
-          <w:sz-cs w:val="29"/>
-          <w:b/>
-          <w:color w:val="181E2A"/>
-        </w:rPr>
-        <w:t xml:space="preserve"/>
-        <w:tab/>
-        <w:t xml:space="preserve">•</w:t>
-        <w:tab/>
-        <w:t xml:space="preserve"/>
-      </w:r>
-      <w:r>
-        <w:rPr>
-          <w:rFonts w:ascii="Helvetica" w:hAnsi="Helvetica" w:cs="Helvetica"/>
-          <w:sz w:val="29"/>
-          <w:sz-cs w:val="29"/>
-          <w:b/>
-          <w:spacing w:val="0"/>
-          <w:color w:val="181E2A"/>
-        </w:rPr>
-        <w:t xml:space="preserve">Generate Executive Letter</w:t>
-      </w:r>
-      <w:r>
-        <w:rPr>
-          <w:rFonts w:ascii="Helvetica" w:hAnsi="Helvetica" w:cs="Helvetica"/>
-          <w:sz w:val="29"/>
-          <w:sz-cs w:val="29"/>
-          <w:spacing w:val="0"/>
-          <w:color w:val="181E2A"/>
-        </w:rPr>
-        <w:t xml:space="preserve"> : courrier exécutif.</w:t>
-      </w:r>
-    </w:p>
-    <w:p>
-      <w:pPr>
-        <w:ind w:left="720" w:first-line="-720"/>
-        <w:spacing w:after="106"/>
-      </w:pPr>
-      <w:r>
-        <w:rPr>
-          <w:rFonts w:ascii="Helvetica" w:hAnsi="Helvetica" w:cs="Helvetica"/>
-          <w:sz w:val="29"/>
-          <w:sz-cs w:val="29"/>
-          <w:b/>
-          <w:color w:val="181E2A"/>
-        </w:rPr>
-        <w:t xml:space="preserve"/>
-        <w:tab/>
-        <w:t xml:space="preserve">•</w:t>
-        <w:tab/>
-        <w:t xml:space="preserve"/>
-      </w:r>
-      <w:r>
-        <w:rPr>
-          <w:rFonts w:ascii="Helvetica" w:hAnsi="Helvetica" w:cs="Helvetica"/>
-          <w:sz w:val="29"/>
-          <w:sz-cs w:val="29"/>
-          <w:b/>
-          <w:spacing w:val="0"/>
-          <w:color w:val="181E2A"/>
-        </w:rPr>
-        <w:t xml:space="preserve">Generate Tailored Catalogue</w:t>
-      </w:r>
-      <w:r>
-        <w:rPr>
-          <w:rFonts w:ascii="Helvetica" w:hAnsi="Helvetica" w:cs="Helvetica"/>
-          <w:sz w:val="29"/>
-          <w:sz-cs w:val="29"/>
-          <w:spacing w:val="0"/>
-          <w:color w:val="181E2A"/>
-        </w:rPr>
-        <w:t xml:space="preserve"> : source de personnalisation commerciale.</w:t>
-      </w:r>
-    </w:p>
-    <w:p>
-      <w:pPr>
-        <w:ind w:left="720" w:first-line="-720"/>
-        <w:spacing w:after="106"/>
-      </w:pPr>
-      <w:r>
-        <w:rPr>
-          <w:rFonts w:ascii="Helvetica" w:hAnsi="Helvetica" w:cs="Helvetica"/>
-          <w:sz w:val="29"/>
-          <w:sz-cs w:val="29"/>
-          <w:b/>
-          <w:color w:val="181E2A"/>
-        </w:rPr>
-        <w:t xml:space="preserve"/>
-        <w:tab/>
-        <w:t xml:space="preserve">•</w:t>
-        <w:tab/>
-        <w:t xml:space="preserve"/>
-      </w:r>
-      <w:r>
-        <w:rPr>
-          <w:rFonts w:ascii="Helvetica" w:hAnsi="Helvetica" w:cs="Helvetica"/>
-          <w:sz w:val="29"/>
-          <w:sz-cs w:val="29"/>
-          <w:b/>
-          <w:spacing w:val="0"/>
-          <w:color w:val="181E2A"/>
-        </w:rPr>
-        <w:t xml:space="preserve">Generate Tailored Audit Form</w:t>
-      </w:r>
-      <w:r>
-        <w:rPr>
-          <w:rFonts w:ascii="Helvetica" w:hAnsi="Helvetica" w:cs="Helvetica"/>
-          <w:sz w:val="29"/>
-          <w:sz-cs w:val="29"/>
-          <w:spacing w:val="0"/>
-          <w:color w:val="181E2A"/>
-        </w:rPr>
-        <w:t xml:space="preserve"> : source métier pour le formulaire d’audit.</w:t>
-      </w:r>
-    </w:p>
-    <w:p>
-      <w:pPr>
-        <w:ind w:left="720" w:first-line="-720"/>
-        <w:spacing w:after="106"/>
-      </w:pPr>
-      <w:r>
-        <w:rPr>
-          <w:rFonts w:ascii="Helvetica" w:hAnsi="Helvetica" w:cs="Helvetica"/>
-          <w:sz w:val="29"/>
-          <w:sz-cs w:val="29"/>
-          <w:b/>
-          <w:color w:val="181E2A"/>
-        </w:rPr>
-        <w:t xml:space="preserve"/>
-        <w:tab/>
-        <w:t xml:space="preserve">•</w:t>
-        <w:tab/>
-        <w:t xml:space="preserve"/>
-      </w:r>
-      <w:r>
-        <w:rPr>
-          <w:rFonts w:ascii="Helvetica" w:hAnsi="Helvetica" w:cs="Helvetica"/>
-          <w:sz w:val="29"/>
-          <w:sz-cs w:val="29"/>
-          <w:b/>
-          <w:spacing w:val="0"/>
-          <w:color w:val="181E2A"/>
-        </w:rPr>
-        <w:t xml:space="preserve">Generate Deck Brief</w:t>
-      </w:r>
-      <w:r>
-        <w:rPr>
-          <w:rFonts w:ascii="Helvetica" w:hAnsi="Helvetica" w:cs="Helvetica"/>
-          <w:sz w:val="29"/>
-          <w:sz-cs w:val="29"/>
-          <w:spacing w:val="0"/>
-          <w:color w:val="181E2A"/>
-        </w:rPr>
-        <w:t xml:space="preserve"> : structure et argumentaire du deck.</w:t>
-      </w:r>
-    </w:p>
-    <w:p>
-      <w:pPr>
-        <w:ind w:left="720" w:first-line="-720"/>
-        <w:spacing w:after="106"/>
-      </w:pPr>
-      <w:r>
-        <w:rPr>
-          <w:rFonts w:ascii="Helvetica" w:hAnsi="Helvetica" w:cs="Helvetica"/>
-          <w:sz w:val="29"/>
-          <w:sz-cs w:val="29"/>
-          <w:b/>
-          <w:color w:val="181E2A"/>
-        </w:rPr>
-        <w:t xml:space="preserve"/>
-        <w:tab/>
-        <w:t xml:space="preserve">•</w:t>
-        <w:tab/>
-        <w:t xml:space="preserve"/>
-      </w:r>
-      <w:r>
-        <w:rPr>
-          <w:rFonts w:ascii="Helvetica" w:hAnsi="Helvetica" w:cs="Helvetica"/>
-          <w:sz w:val="29"/>
-          <w:sz-cs w:val="29"/>
-          <w:b/>
-          <w:spacing w:val="0"/>
-          <w:color w:val="181E2A"/>
-        </w:rPr>
-        <w:t xml:space="preserve">Assemble Prospect Pack</w:t>
-      </w:r>
-      <w:r>
-        <w:rPr>
-          <w:rFonts w:ascii="Helvetica" w:hAnsi="Helvetica" w:cs="Helvetica"/>
-          <w:sz w:val="29"/>
-          <w:sz-cs w:val="29"/>
-          <w:spacing w:val="0"/>
-          <w:color w:val="181E2A"/>
-        </w:rPr>
-        <w:t xml:space="preserve"> : assemble les sorties LLM et le contexte prospect.</w:t>
-      </w:r>
-    </w:p>
-    <w:p>
-      <w:pPr>
-        <w:ind w:left="720" w:first-line="-720"/>
-        <w:spacing w:after="106"/>
-      </w:pPr>
-      <w:r>
-        <w:rPr>
-          <w:rFonts w:ascii="Helvetica" w:hAnsi="Helvetica" w:cs="Helvetica"/>
-          <w:sz w:val="29"/>
-          <w:sz-cs w:val="29"/>
-          <w:b/>
-          <w:color w:val="181E2A"/>
-        </w:rPr>
-        <w:t xml:space="preserve"/>
-        <w:tab/>
-        <w:t xml:space="preserve">•</w:t>
-        <w:tab/>
-        <w:t xml:space="preserve"/>
-      </w:r>
-      <w:r>
-        <w:rPr>
-          <w:rFonts w:ascii="Helvetica" w:hAnsi="Helvetica" w:cs="Helvetica"/>
-          <w:sz w:val="29"/>
-          <w:sz-cs w:val="29"/>
-          <w:b/>
-          <w:spacing w:val="0"/>
-          <w:color w:val="181E2A"/>
-        </w:rPr>
-        <w:t xml:space="preserve">Resolve Domain Catalogue</w:t>
-      </w:r>
-      <w:r>
-        <w:rPr>
-          <w:rFonts w:ascii="Helvetica" w:hAnsi="Helvetica" w:cs="Helvetica"/>
-          <w:sz w:val="29"/>
-          <w:sz-cs w:val="29"/>
-          <w:spacing w:val="0"/>
-          <w:color w:val="181E2A"/>
-        </w:rPr>
-        <w:t xml:space="preserve"> : détecte le domaine de base du catalogue.</w:t>
-      </w:r>
-    </w:p>
-    <w:p>
-      <w:pPr>
-        <w:ind w:left="720" w:first-line="-720"/>
-        <w:spacing w:after="106"/>
-      </w:pPr>
-      <w:r>
-        <w:rPr>
-          <w:rFonts w:ascii="Helvetica" w:hAnsi="Helvetica" w:cs="Helvetica"/>
-          <w:sz w:val="29"/>
-          <w:sz-cs w:val="29"/>
-          <w:b/>
-          <w:color w:val="181E2A"/>
-        </w:rPr>
-        <w:t xml:space="preserve"/>
-        <w:tab/>
-        <w:t xml:space="preserve">•</w:t>
-        <w:tab/>
-        <w:t xml:space="preserve"/>
-      </w:r>
-      <w:r>
-        <w:rPr>
-          <w:rFonts w:ascii="Helvetica" w:hAnsi="Helvetica" w:cs="Helvetica"/>
-          <w:sz w:val="29"/>
-          <w:sz-cs w:val="29"/>
-          <w:b/>
-          <w:spacing w:val="0"/>
-          <w:color w:val="181E2A"/>
-        </w:rPr>
-        <w:t xml:space="preserve">Build Catalogue Render Payload</w:t>
-      </w:r>
-      <w:r>
-        <w:rPr>
-          <w:rFonts w:ascii="Helvetica" w:hAnsi="Helvetica" w:cs="Helvetica"/>
-          <w:sz w:val="29"/>
-          <w:sz-cs w:val="29"/>
-          <w:spacing w:val="0"/>
-          <w:color w:val="181E2A"/>
-        </w:rPr>
-        <w:t xml:space="preserve"> : fabrique le payload complet pour </w:t>
-      </w:r>
-      <w:r>
-        <w:rPr>
-          <w:rFonts w:ascii="Menlo" w:hAnsi="Menlo" w:cs="Menlo"/>
-          <w:sz w:val="25"/>
-          <w:sz-cs w:val="25"/>
-          <w:spacing w:val="0"/>
-          <w:color w:val="181E2A"/>
-        </w:rPr>
-        <w:t xml:space="preserve">catalogue-renderer</w:t>
-      </w:r>
-      <w:r>
-        <w:rPr>
-          <w:rFonts w:ascii="Helvetica" w:hAnsi="Helvetica" w:cs="Helvetica"/>
-          <w:sz w:val="29"/>
-          <w:sz-cs w:val="29"/>
-          <w:spacing w:val="0"/>
-          <w:color w:val="181E2A"/>
-        </w:rPr>
-        <w:t xml:space="preserve">.</w:t>
-      </w:r>
-    </w:p>
-    <w:p>
-      <w:pPr>
-        <w:ind w:left="720" w:first-line="-720"/>
-        <w:spacing w:after="106"/>
-      </w:pPr>
-      <w:r>
-        <w:rPr>
-          <w:rFonts w:ascii="Helvetica" w:hAnsi="Helvetica" w:cs="Helvetica"/>
-          <w:sz w:val="29"/>
-          <w:sz-cs w:val="29"/>
-          <w:b/>
-          <w:color w:val="181E2A"/>
-        </w:rPr>
-        <w:t xml:space="preserve"/>
-        <w:tab/>
-        <w:t xml:space="preserve">•</w:t>
-        <w:tab/>
-        <w:t xml:space="preserve"/>
-      </w:r>
-      <w:r>
-        <w:rPr>
-          <w:rFonts w:ascii="Helvetica" w:hAnsi="Helvetica" w:cs="Helvetica"/>
-          <w:sz w:val="29"/>
-          <w:sz-cs w:val="29"/>
-          <w:b/>
-          <w:spacing w:val="0"/>
-          <w:color w:val="181E2A"/>
-        </w:rPr>
-        <w:t xml:space="preserve">Render Catalogue Artifact</w:t>
-      </w:r>
-      <w:r>
-        <w:rPr>
-          <w:rFonts w:ascii="Helvetica" w:hAnsi="Helvetica" w:cs="Helvetica"/>
-          <w:sz w:val="29"/>
-          <w:sz-cs w:val="29"/>
-          <w:spacing w:val="0"/>
-          <w:color w:val="181E2A"/>
-        </w:rPr>
-        <w:t xml:space="preserve"> : génère le PDF et le DOCX par </w:t>
-      </w:r>
-      <w:r>
-        <w:rPr>
-          <w:rFonts w:ascii="Menlo" w:hAnsi="Menlo" w:cs="Menlo"/>
-          <w:sz w:val="25"/>
-          <w:sz-cs w:val="25"/>
-          <w:spacing w:val="0"/>
-          <w:color w:val="181E2A"/>
-        </w:rPr>
-        <w:t xml:space="preserve">pack_id</w:t>
-      </w:r>
-      <w:r>
-        <w:rPr>
-          <w:rFonts w:ascii="Helvetica" w:hAnsi="Helvetica" w:cs="Helvetica"/>
-          <w:sz w:val="29"/>
-          <w:sz-cs w:val="29"/>
-          <w:spacing w:val="0"/>
-          <w:color w:val="181E2A"/>
-        </w:rPr>
-        <w:t xml:space="preserve">.</w:t>
-      </w:r>
-    </w:p>
-    <w:p>
-      <w:pPr>
-        <w:ind w:left="720" w:first-line="-720"/>
-        <w:spacing w:after="106"/>
-      </w:pPr>
-      <w:r>
-        <w:rPr>
-          <w:rFonts w:ascii="Helvetica" w:hAnsi="Helvetica" w:cs="Helvetica"/>
-          <w:sz w:val="29"/>
-          <w:sz-cs w:val="29"/>
-          <w:b/>
-          <w:color w:val="181E2A"/>
-        </w:rPr>
-        <w:t xml:space="preserve"/>
-        <w:tab/>
-        <w:t xml:space="preserve">•</w:t>
-        <w:tab/>
-        <w:t xml:space="preserve"/>
-      </w:r>
-      <w:r>
-        <w:rPr>
-          <w:rFonts w:ascii="Helvetica" w:hAnsi="Helvetica" w:cs="Helvetica"/>
-          <w:sz w:val="29"/>
-          <w:sz-cs w:val="29"/>
-          <w:b/>
-          <w:spacing w:val="0"/>
-          <w:color w:val="181E2A"/>
-        </w:rPr>
-        <w:t xml:space="preserve">Merge Catalogue Artifact</w:t>
-      </w:r>
-      <w:r>
-        <w:rPr>
-          <w:rFonts w:ascii="Helvetica" w:hAnsi="Helvetica" w:cs="Helvetica"/>
-          <w:sz w:val="29"/>
-          <w:sz-cs w:val="29"/>
-          <w:spacing w:val="0"/>
-          <w:color w:val="181E2A"/>
-        </w:rPr>
-        <w:t xml:space="preserve"> : injecte les URLs réelles du catalogue dans le pack.</w:t>
-      </w:r>
-    </w:p>
-    <w:p>
-      <w:pPr>
-        <w:ind w:left="720" w:first-line="-720"/>
-        <w:spacing w:after="106"/>
-      </w:pPr>
-      <w:r>
-        <w:rPr>
-          <w:rFonts w:ascii="Helvetica" w:hAnsi="Helvetica" w:cs="Helvetica"/>
-          <w:sz w:val="29"/>
-          <w:sz-cs w:val="29"/>
-          <w:b/>
-          <w:color w:val="181E2A"/>
-        </w:rPr>
-        <w:t xml:space="preserve"/>
-        <w:tab/>
-        <w:t xml:space="preserve">•</w:t>
-        <w:tab/>
-        <w:t xml:space="preserve"/>
-      </w:r>
-      <w:r>
-        <w:rPr>
-          <w:rFonts w:ascii="Helvetica" w:hAnsi="Helvetica" w:cs="Helvetica"/>
-          <w:sz w:val="29"/>
-          <w:sz-cs w:val="29"/>
-          <w:b/>
-          <w:spacing w:val="0"/>
-          <w:color w:val="181E2A"/>
-        </w:rPr>
-        <w:t xml:space="preserve">Build Deck Render Payload</w:t>
-      </w:r>
-      <w:r>
-        <w:rPr>
-          <w:rFonts w:ascii="Helvetica" w:hAnsi="Helvetica" w:cs="Helvetica"/>
-          <w:sz w:val="29"/>
-          <w:sz-cs w:val="29"/>
-          <w:spacing w:val="0"/>
-          <w:color w:val="181E2A"/>
-        </w:rPr>
-        <w:t xml:space="preserve"> : prépare le payload PPTX à partir du pack enrichi catalogue.</w:t>
-      </w:r>
-    </w:p>
-    <w:p>
-      <w:pPr>
-        <w:ind w:left="720" w:first-line="-720"/>
-        <w:spacing w:after="106"/>
-      </w:pPr>
-      <w:r>
-        <w:rPr>
-          <w:rFonts w:ascii="Helvetica" w:hAnsi="Helvetica" w:cs="Helvetica"/>
-          <w:sz w:val="29"/>
-          <w:sz-cs w:val="29"/>
-          <w:b/>
-          <w:color w:val="181E2A"/>
-        </w:rPr>
-        <w:t xml:space="preserve"/>
-        <w:tab/>
-        <w:t xml:space="preserve">•</w:t>
-        <w:tab/>
-        <w:t xml:space="preserve"/>
-      </w:r>
-      <w:r>
-        <w:rPr>
-          <w:rFonts w:ascii="Helvetica" w:hAnsi="Helvetica" w:cs="Helvetica"/>
-          <w:sz w:val="29"/>
-          <w:sz-cs w:val="29"/>
-          <w:b/>
-          <w:spacing w:val="0"/>
-          <w:color w:val="181E2A"/>
-        </w:rPr>
-        <w:t xml:space="preserve">Render Deck Artifact</w:t>
-      </w:r>
-      <w:r>
-        <w:rPr>
-          <w:rFonts w:ascii="Helvetica" w:hAnsi="Helvetica" w:cs="Helvetica"/>
-          <w:sz w:val="29"/>
-          <w:sz-cs w:val="29"/>
-          <w:spacing w:val="0"/>
-          <w:color w:val="181E2A"/>
-        </w:rPr>
-        <w:t xml:space="preserve"> : appelle </w:t>
-      </w:r>
-      <w:r>
-        <w:rPr>
-          <w:rFonts w:ascii="Menlo" w:hAnsi="Menlo" w:cs="Menlo"/>
-          <w:sz w:val="25"/>
-          <w:sz-cs w:val="25"/>
-          <w:spacing w:val="0"/>
-          <w:color w:val="181E2A"/>
-        </w:rPr>
-        <w:t xml:space="preserve">deck-renderer</w:t>
-      </w:r>
-      <w:r>
-        <w:rPr>
-          <w:rFonts w:ascii="Helvetica" w:hAnsi="Helvetica" w:cs="Helvetica"/>
-          <w:sz w:val="29"/>
-          <w:sz-cs w:val="29"/>
-          <w:spacing w:val="0"/>
-          <w:color w:val="181E2A"/>
-        </w:rPr>
-        <w:t xml:space="preserve"> pour produire le fichier </w:t>
-      </w:r>
-      <w:r>
-        <w:rPr>
-          <w:rFonts w:ascii="Menlo" w:hAnsi="Menlo" w:cs="Menlo"/>
-          <w:sz w:val="25"/>
-          <w:sz-cs w:val="25"/>
-          <w:spacing w:val="0"/>
-          <w:color w:val="181E2A"/>
-        </w:rPr>
-        <w:t xml:space="preserve">.pptx</w:t>
-      </w:r>
-      <w:r>
-        <w:rPr>
-          <w:rFonts w:ascii="Helvetica" w:hAnsi="Helvetica" w:cs="Helvetica"/>
-          <w:sz w:val="29"/>
-          <w:sz-cs w:val="29"/>
-          <w:spacing w:val="0"/>
-          <w:color w:val="181E2A"/>
-        </w:rPr>
-        <w:t xml:space="preserve">.</w:t>
-      </w:r>
-    </w:p>
-    <w:p>
-      <w:pPr>
-        <w:ind w:left="720" w:first-line="-720"/>
-        <w:spacing w:after="106"/>
-      </w:pPr>
-      <w:r>
-        <w:rPr>
-          <w:rFonts w:ascii="Helvetica" w:hAnsi="Helvetica" w:cs="Helvetica"/>
-          <w:sz w:val="29"/>
-          <w:sz-cs w:val="29"/>
-          <w:b/>
-          <w:color w:val="181E2A"/>
-        </w:rPr>
-        <w:t xml:space="preserve"/>
-        <w:tab/>
-        <w:t xml:space="preserve">•</w:t>
-        <w:tab/>
-        <w:t xml:space="preserve"/>
-      </w:r>
-      <w:r>
-        <w:rPr>
-          <w:rFonts w:ascii="Helvetica" w:hAnsi="Helvetica" w:cs="Helvetica"/>
-          <w:sz w:val="29"/>
-          <w:sz-cs w:val="29"/>
-          <w:b/>
-          <w:spacing w:val="0"/>
-          <w:color w:val="181E2A"/>
-        </w:rPr>
-        <w:t xml:space="preserve">Merge Deck Artifact</w:t>
-      </w:r>
-      <w:r>
-        <w:rPr>
-          <w:rFonts w:ascii="Helvetica" w:hAnsi="Helvetica" w:cs="Helvetica"/>
-          <w:sz w:val="29"/>
-          <w:sz-cs w:val="29"/>
-          <w:spacing w:val="0"/>
-          <w:color w:val="181E2A"/>
-        </w:rPr>
-        <w:t xml:space="preserve"> : fusionne le deck avec le pack et concatène les pièces jointes catalogue + deck.</w:t>
-      </w:r>
-    </w:p>
-    <w:p>
-      <w:pPr>
-        <w:ind w:left="720" w:first-line="-720"/>
-        <w:spacing w:after="106"/>
-      </w:pPr>
-      <w:r>
-        <w:rPr>
-          <w:rFonts w:ascii="Helvetica" w:hAnsi="Helvetica" w:cs="Helvetica"/>
-          <w:sz w:val="29"/>
-          <w:sz-cs w:val="29"/>
-          <w:b/>
-          <w:color w:val="181E2A"/>
-        </w:rPr>
-        <w:t xml:space="preserve"/>
-        <w:tab/>
-        <w:t xml:space="preserve">•</w:t>
-        <w:tab/>
-        <w:t xml:space="preserve"/>
-      </w:r>
-      <w:r>
-        <w:rPr>
-          <w:rFonts w:ascii="Helvetica" w:hAnsi="Helvetica" w:cs="Helvetica"/>
-          <w:sz w:val="29"/>
-          <w:sz-cs w:val="29"/>
-          <w:b/>
-          <w:spacing w:val="0"/>
-          <w:color w:val="181E2A"/>
-        </w:rPr>
-        <w:t xml:space="preserve">Store Pack In Supabase</w:t>
-      </w:r>
-      <w:r>
-        <w:rPr>
-          <w:rFonts w:ascii="Helvetica" w:hAnsi="Helvetica" w:cs="Helvetica"/>
-          <w:sz w:val="29"/>
-          <w:sz-cs w:val="29"/>
-          <w:spacing w:val="0"/>
-          <w:color w:val="181E2A"/>
-        </w:rPr>
-        <w:t xml:space="preserve"> : stocke le pack final avec </w:t>
-      </w:r>
-      <w:r>
-        <w:rPr>
-          <w:rFonts w:ascii="Menlo" w:hAnsi="Menlo" w:cs="Menlo"/>
-          <w:sz w:val="25"/>
-          <w:sz-cs w:val="25"/>
-          <w:spacing w:val="0"/>
-          <w:color w:val="181E2A"/>
-        </w:rPr>
-        <w:t xml:space="preserve">catalogue_artifact</w:t>
-      </w:r>
-      <w:r>
-        <w:rPr>
-          <w:rFonts w:ascii="Helvetica" w:hAnsi="Helvetica" w:cs="Helvetica"/>
-          <w:sz w:val="29"/>
-          <w:sz-cs w:val="29"/>
-          <w:spacing w:val="0"/>
-          <w:color w:val="181E2A"/>
-        </w:rPr>
-        <w:t xml:space="preserve">, </w:t>
-      </w:r>
-      <w:r>
-        <w:rPr>
-          <w:rFonts w:ascii="Menlo" w:hAnsi="Menlo" w:cs="Menlo"/>
-          <w:sz w:val="25"/>
-          <w:sz-cs w:val="25"/>
-          <w:spacing w:val="0"/>
-          <w:color w:val="181E2A"/>
-        </w:rPr>
-        <w:t xml:space="preserve">deck_artifact</w:t>
-      </w:r>
-      <w:r>
-        <w:rPr>
-          <w:rFonts w:ascii="Helvetica" w:hAnsi="Helvetica" w:cs="Helvetica"/>
-          <w:sz w:val="29"/>
-          <w:sz-cs w:val="29"/>
-          <w:spacing w:val="0"/>
-          <w:color w:val="181E2A"/>
-        </w:rPr>
-        <w:t xml:space="preserve">, </w:t>
-      </w:r>
-      <w:r>
-        <w:rPr>
-          <w:rFonts w:ascii="Menlo" w:hAnsi="Menlo" w:cs="Menlo"/>
-          <w:sz w:val="25"/>
-          <w:sz-cs w:val="25"/>
-          <w:spacing w:val="0"/>
-          <w:color w:val="181E2A"/>
-        </w:rPr>
-        <w:t xml:space="preserve">mail_attachments</w:t>
-      </w:r>
-      <w:r>
-        <w:rPr>
-          <w:rFonts w:ascii="Helvetica" w:hAnsi="Helvetica" w:cs="Helvetica"/>
-          <w:sz w:val="29"/>
-          <w:sz-cs w:val="29"/>
-          <w:spacing w:val="0"/>
-          <w:color w:val="181E2A"/>
-        </w:rPr>
-        <w:t xml:space="preserve"> et </w:t>
-      </w:r>
-      <w:r>
-        <w:rPr>
-          <w:rFonts w:ascii="Menlo" w:hAnsi="Menlo" w:cs="Menlo"/>
-          <w:sz w:val="25"/>
-          <w:sz-cs w:val="25"/>
-          <w:spacing w:val="0"/>
-          <w:color w:val="181E2A"/>
-        </w:rPr>
-        <w:t xml:space="preserve">attachments_count</w:t>
-      </w:r>
-      <w:r>
-        <w:rPr>
-          <w:rFonts w:ascii="Helvetica" w:hAnsi="Helvetica" w:cs="Helvetica"/>
-          <w:sz w:val="29"/>
-          <w:sz-cs w:val="29"/>
-          <w:spacing w:val="0"/>
-          <w:color w:val="181E2A"/>
-        </w:rPr>
-        <w:t xml:space="preserve">.</w:t>
-      </w:r>
-    </w:p>
-    <w:p>
-      <w:pPr>
-        <w:ind w:left="720" w:first-line="-720"/>
-        <w:spacing w:after="106"/>
-      </w:pPr>
-      <w:r>
-        <w:rPr>
-          <w:rFonts w:ascii="Helvetica" w:hAnsi="Helvetica" w:cs="Helvetica"/>
-          <w:sz w:val="29"/>
-          <w:sz-cs w:val="29"/>
-          <w:b/>
-          <w:color w:val="181E2A"/>
-        </w:rPr>
-        <w:t xml:space="preserve"/>
-        <w:tab/>
-        <w:t xml:space="preserve">•</w:t>
-        <w:tab/>
-        <w:t xml:space="preserve"/>
-      </w:r>
-      <w:r>
-        <w:rPr>
-          <w:rFonts w:ascii="Helvetica" w:hAnsi="Helvetica" w:cs="Helvetica"/>
-          <w:sz w:val="29"/>
-          <w:sz-cs w:val="29"/>
-          <w:b/>
-          <w:spacing w:val="0"/>
-          <w:color w:val="181E2A"/>
-        </w:rPr>
-        <w:t xml:space="preserve">Build Approval Email</w:t>
-      </w:r>
-      <w:r>
-        <w:rPr>
-          <w:rFonts w:ascii="Helvetica" w:hAnsi="Helvetica" w:cs="Helvetica"/>
-          <w:sz w:val="29"/>
-          <w:sz-cs w:val="29"/>
-          <w:spacing w:val="0"/>
-          <w:color w:val="181E2A"/>
-        </w:rPr>
-        <w:t xml:space="preserve"> et </w:t>
-      </w:r>
-      <w:r>
-        <w:rPr>
-          <w:rFonts w:ascii="Helvetica" w:hAnsi="Helvetica" w:cs="Helvetica"/>
-          <w:sz w:val="29"/>
-          <w:sz-cs w:val="29"/>
-          <w:b/>
-          <w:spacing w:val="0"/>
-          <w:color w:val="181E2A"/>
-        </w:rPr>
-        <w:t xml:space="preserve">Send Internal Approval Email</w:t>
-      </w:r>
-      <w:r>
-        <w:rPr>
-          <w:rFonts w:ascii="Helvetica" w:hAnsi="Helvetica" w:cs="Helvetica"/>
-          <w:sz w:val="29"/>
-          <w:sz-cs w:val="29"/>
-          <w:spacing w:val="0"/>
-          <w:color w:val="181E2A"/>
-        </w:rPr>
-        <w:t xml:space="preserve"> : validation interne.</w:t>
-      </w:r>
-    </w:p>
-    <w:p>
-      <w:pPr>
-        <w:ind w:left="720" w:first-line="-720"/>
-        <w:spacing w:after="106"/>
-      </w:pPr>
-      <w:r>
-        <w:rPr>
-          <w:rFonts w:ascii="Helvetica" w:hAnsi="Helvetica" w:cs="Helvetica"/>
-          <w:sz w:val="29"/>
-          <w:sz-cs w:val="29"/>
-          <w:b/>
-          <w:color w:val="181E2A"/>
-        </w:rPr>
-        <w:t xml:space="preserve"/>
-        <w:tab/>
-        <w:t xml:space="preserve">•</w:t>
-        <w:tab/>
-        <w:t xml:space="preserve"/>
-      </w:r>
-      <w:r>
-        <w:rPr>
-          <w:rFonts w:ascii="Helvetica" w:hAnsi="Helvetica" w:cs="Helvetica"/>
-          <w:sz w:val="29"/>
-          <w:sz-cs w:val="29"/>
-          <w:b/>
-          <w:spacing w:val="0"/>
-          <w:color w:val="181E2A"/>
-        </w:rPr>
-        <w:t xml:space="preserve">Approval Webhook</w:t>
-      </w:r>
-      <w:r>
-        <w:rPr>
-          <w:rFonts w:ascii="Helvetica" w:hAnsi="Helvetica" w:cs="Helvetica"/>
-          <w:sz w:val="29"/>
-          <w:sz-cs w:val="29"/>
-          <w:spacing w:val="0"/>
-          <w:color w:val="181E2A"/>
-        </w:rPr>
-        <w:t xml:space="preserve">, </w:t>
-      </w:r>
-      <w:r>
-        <w:rPr>
-          <w:rFonts w:ascii="Helvetica" w:hAnsi="Helvetica" w:cs="Helvetica"/>
-          <w:sz w:val="29"/>
-          <w:sz-cs w:val="29"/>
-          <w:b/>
-          <w:spacing w:val="0"/>
-          <w:color w:val="181E2A"/>
-        </w:rPr>
-        <w:t xml:space="preserve">Extract Pack Payload</w:t>
-      </w:r>
-      <w:r>
-        <w:rPr>
-          <w:rFonts w:ascii="Helvetica" w:hAnsi="Helvetica" w:cs="Helvetica"/>
-          <w:sz w:val="29"/>
-          <w:sz-cs w:val="29"/>
-          <w:spacing w:val="0"/>
-          <w:color w:val="181E2A"/>
-        </w:rPr>
-        <w:t xml:space="preserve">, </w:t>
-      </w:r>
-      <w:r>
-        <w:rPr>
-          <w:rFonts w:ascii="Helvetica" w:hAnsi="Helvetica" w:cs="Helvetica"/>
-          <w:sz w:val="29"/>
-          <w:sz-cs w:val="29"/>
-          <w:b/>
-          <w:spacing w:val="0"/>
-          <w:color w:val="181E2A"/>
-        </w:rPr>
-        <w:t xml:space="preserve">Build Send Context</w:t>
-      </w:r>
-      <w:r>
-        <w:rPr>
-          <w:rFonts w:ascii="Helvetica" w:hAnsi="Helvetica" w:cs="Helvetica"/>
-          <w:sz w:val="29"/>
-          <w:sz-cs w:val="29"/>
-          <w:spacing w:val="0"/>
-          <w:color w:val="181E2A"/>
-        </w:rPr>
-        <w:t xml:space="preserve">, </w:t>
-      </w:r>
-      <w:r>
-        <w:rPr>
-          <w:rFonts w:ascii="Helvetica" w:hAnsi="Helvetica" w:cs="Helvetica"/>
-          <w:sz w:val="29"/>
-          <w:sz-cs w:val="29"/>
-          <w:b/>
-          <w:spacing w:val="0"/>
-          <w:color w:val="181E2A"/>
-        </w:rPr>
-        <w:t xml:space="preserve">Send External Prospect Email</w:t>
-      </w:r>
-      <w:r>
-        <w:rPr>
-          <w:rFonts w:ascii="Helvetica" w:hAnsi="Helvetica" w:cs="Helvetica"/>
-          <w:sz w:val="29"/>
-          <w:sz-cs w:val="29"/>
-          <w:spacing w:val="0"/>
-          <w:color w:val="181E2A"/>
-        </w:rPr>
-        <w:t xml:space="preserve"> : envoi prospect.</w:t>
-      </w:r>
-    </w:p>
-    <w:p>
-      <w:pPr>
-        <w:spacing w:after="160"/>
-      </w:pPr>
+        <w:t xml:space="preserve">7.1 État réel du workflow </w:t>
+      </w:r>
+      <w:r>
+        <w:rPr>
+          <w:rFonts w:ascii="Menlo" w:hAnsi="Menlo" w:cs="Menlo"/>
+          <w:sz w:val="25"/>
+          <w:sz-cs w:val="25"/>
+          <w:b/>
+          <w:spacing w:val="0"/>
+          <w:color w:val="0F3A6E"/>
+        </w:rPr>
+        <w:t xml:space="preserve">FINAL-10</w:t>
+      </w:r>
       <w:r>
         <w:rPr>
           <w:rFonts w:ascii="Helvetica" w:hAnsi="Helvetica" w:cs="Helvetica"/>
@@ -3199,7 +2852,7 @@
           <w:spacing w:val="0"/>
           <w:color w:val="0F3A6E"/>
         </w:rPr>
-        <w:t xml:space="preserve">7.2 Chaîne principale de référence</w:t>
+        <w:t xml:space="preserve"/>
       </w:r>
     </w:p>
     <w:p>
@@ -3214,32 +2867,155 @@
           <w:spacing w:val="0"/>
           <w:color w:val="181E2A"/>
         </w:rPr>
-        <w:t xml:space="preserve">La chaîne principale V3 validée pour la phase 1 deck PPTX est la suivante :</w:t>
-      </w:r>
-    </w:p>
-    <w:p>
-      <w:pPr>
-        <w:spacing w:after="213"/>
-      </w:pPr>
-      <w:r>
-        <w:rPr>
-          <w:rFonts w:ascii="Menlo" w:hAnsi="Menlo" w:cs="Menlo"/>
-          <w:sz w:val="25"/>
-          <w:sz-cs w:val="25"/>
-          <w:spacing w:val="0"/>
-          <w:color w:val="181E2A"/>
-        </w:rPr>
-        <w:t xml:space="preserve">Assemble Prospect Pack -&gt; Resolve Domain Catalogue -&gt; Build Catalogue Render Payload -&gt; Render Catalogue Artifact -&gt; Merge Catalogue Artifact -&gt; Build Deck Render Payload -&gt; Render Deck Artifact -&gt; Merge Deck Artifact -&gt; Store Pack In Supabase -&gt; Build Approval Email -&gt; Send Internal Approval Email</w:t>
-      </w:r>
-      <w:r>
-        <w:rPr>
-          <w:rFonts w:ascii="Helvetica" w:hAnsi="Helvetica" w:cs="Helvetica"/>
-          <w:sz w:val="29"/>
-          <w:sz-cs w:val="29"/>
-          <w:spacing w:val="0"/>
-          <w:color w:val="181E2A"/>
-        </w:rPr>
-        <w:t xml:space="preserve"/>
+        <w:t xml:space="preserve">Le workflow exporté </w:t>
+      </w:r>
+      <w:r>
+        <w:rPr>
+          <w:rFonts w:ascii="Menlo" w:hAnsi="Menlo" w:cs="Menlo"/>
+          <w:sz w:val="25"/>
+          <w:sz-cs w:val="25"/>
+          <w:spacing w:val="0"/>
+          <w:color w:val="181E2A"/>
+        </w:rPr>
+        <w:t xml:space="preserve">TransferAI Prospecting V3 CRM Enhanced [FINAL]-10.json</w:t>
+      </w:r>
+      <w:r>
+        <w:rPr>
+          <w:rFonts w:ascii="Helvetica" w:hAnsi="Helvetica" w:cs="Helvetica"/>
+          <w:sz w:val="29"/>
+          <w:sz-cs w:val="29"/>
+          <w:spacing w:val="0"/>
+          <w:color w:val="181E2A"/>
+        </w:rPr>
+        <w:t xml:space="preserve"> contient </w:t>
+      </w:r>
+      <w:r>
+        <w:rPr>
+          <w:rFonts w:ascii="Helvetica" w:hAnsi="Helvetica" w:cs="Helvetica"/>
+          <w:sz w:val="29"/>
+          <w:sz-cs w:val="29"/>
+          <w:b/>
+          <w:spacing w:val="0"/>
+          <w:color w:val="181E2A"/>
+        </w:rPr>
+        <w:t xml:space="preserve">53 nœuds</w:t>
+      </w:r>
+      <w:r>
+        <w:rPr>
+          <w:rFonts w:ascii="Helvetica" w:hAnsi="Helvetica" w:cs="Helvetica"/>
+          <w:sz w:val="29"/>
+          <w:sz-cs w:val="29"/>
+          <w:spacing w:val="0"/>
+          <w:color w:val="181E2A"/>
+        </w:rPr>
+        <w:t xml:space="preserve">. Il reflète un état de transition avancé :</w:t>
+      </w:r>
+    </w:p>
+    <w:p>
+      <w:pPr>
+        <w:ind w:left="720" w:first-line="-720"/>
+        <w:spacing w:after="106"/>
+      </w:pPr>
+      <w:r>
+        <w:rPr>
+          <w:rFonts w:ascii="Helvetica" w:hAnsi="Helvetica" w:cs="Helvetica"/>
+          <w:sz w:val="29"/>
+          <w:sz-cs w:val="29"/>
+          <w:color w:val="181E2A"/>
+        </w:rPr>
+        <w:t xml:space="preserve"/>
+        <w:tab/>
+        <w:t xml:space="preserve">•</w:t>
+        <w:tab/>
+        <w:t xml:space="preserve"/>
+      </w:r>
+      <w:r>
+        <w:rPr>
+          <w:rFonts w:ascii="Helvetica" w:hAnsi="Helvetica" w:cs="Helvetica"/>
+          <w:sz w:val="29"/>
+          <w:sz-cs w:val="29"/>
+          <w:spacing w:val="0"/>
+          <w:color w:val="181E2A"/>
+        </w:rPr>
+        <w:t xml:space="preserve">la chaîne dynamique catalogue + deck est bien en place et fonctionne,</w:t>
+      </w:r>
+    </w:p>
+    <w:p>
+      <w:pPr>
+        <w:ind w:left="720" w:first-line="-720"/>
+        <w:spacing w:after="106"/>
+      </w:pPr>
+      <w:r>
+        <w:rPr>
+          <w:rFonts w:ascii="Helvetica" w:hAnsi="Helvetica" w:cs="Helvetica"/>
+          <w:sz w:val="29"/>
+          <w:sz-cs w:val="29"/>
+          <w:color w:val="181E2A"/>
+        </w:rPr>
+        <w:t xml:space="preserve"/>
+        <w:tab/>
+        <w:t xml:space="preserve">•</w:t>
+        <w:tab/>
+        <w:t xml:space="preserve"/>
+      </w:r>
+      <w:r>
+        <w:rPr>
+          <w:rFonts w:ascii="Helvetica" w:hAnsi="Helvetica" w:cs="Helvetica"/>
+          <w:sz w:val="29"/>
+          <w:sz-cs w:val="29"/>
+          <w:spacing w:val="0"/>
+          <w:color w:val="181E2A"/>
+        </w:rPr>
+        <w:t xml:space="preserve">la branche d’approbation / envoi impose bien </w:t>
+      </w:r>
+      <w:r>
+        <w:rPr>
+          <w:rFonts w:ascii="Menlo" w:hAnsi="Menlo" w:cs="Menlo"/>
+          <w:sz w:val="25"/>
+          <w:sz-cs w:val="25"/>
+          <w:spacing w:val="0"/>
+          <w:color w:val="181E2A"/>
+        </w:rPr>
+        <w:t xml:space="preserve">attachments_count = 2</w:t>
+      </w:r>
+      <w:r>
+        <w:rPr>
+          <w:rFonts w:ascii="Helvetica" w:hAnsi="Helvetica" w:cs="Helvetica"/>
+          <w:sz w:val="29"/>
+          <w:sz-cs w:val="29"/>
+          <w:spacing w:val="0"/>
+          <w:color w:val="181E2A"/>
+        </w:rPr>
+        <w:t xml:space="preserve">,</w:t>
+      </w:r>
+    </w:p>
+    <w:p>
+      <w:pPr>
+        <w:ind w:left="720" w:first-line="-720"/>
+        <w:spacing w:after="106"/>
+      </w:pPr>
+      <w:r>
+        <w:rPr>
+          <w:rFonts w:ascii="Helvetica" w:hAnsi="Helvetica" w:cs="Helvetica"/>
+          <w:sz w:val="29"/>
+          <w:sz-cs w:val="29"/>
+          <w:color w:val="181E2A"/>
+        </w:rPr>
+        <w:t xml:space="preserve"/>
+        <w:tab/>
+        <w:t xml:space="preserve">•</w:t>
+        <w:tab/>
+        <w:t xml:space="preserve"/>
+      </w:r>
+      <w:r>
+        <w:rPr>
+          <w:rFonts w:ascii="Helvetica" w:hAnsi="Helvetica" w:cs="Helvetica"/>
+          <w:sz w:val="29"/>
+          <w:sz-cs w:val="29"/>
+          <w:spacing w:val="0"/>
+          <w:color w:val="181E2A"/>
+        </w:rPr>
+        <w:t xml:space="preserve">mais quelques nœuds plus anciens restent dans le canvas à des fins de compatibilité ou d’historique opérationnel.</w:t>
       </w:r>
     </w:p>
     <w:p>
@@ -3255,146 +3031,832 @@
           <w:spacing w:val="0"/>
           <w:color w:val="0F3A6E"/>
         </w:rPr>
-        <w:t xml:space="preserve">7.3 Procédure normale d’utilisation</w:t>
-      </w:r>
-    </w:p>
-    <w:p>
-      <w:pPr>
-        <w:ind w:left="720" w:first-line="-720"/>
-        <w:spacing w:after="106"/>
-      </w:pPr>
-      <w:r>
-        <w:rPr>
-          <w:rFonts w:ascii="Helvetica" w:hAnsi="Helvetica" w:cs="Helvetica"/>
-          <w:sz w:val="29"/>
-          <w:sz-cs w:val="29"/>
-          <w:color w:val="181E2A"/>
-        </w:rPr>
-        <w:t xml:space="preserve"/>
-        <w:tab/>
-        <w:t xml:space="preserve">1</w:t>
-        <w:tab/>
-        <w:t xml:space="preserve"/>
-      </w:r>
-      <w:r>
-        <w:rPr>
-          <w:rFonts w:ascii="Helvetica" w:hAnsi="Helvetica" w:cs="Helvetica"/>
-          <w:sz w:val="29"/>
-          <w:sz-cs w:val="29"/>
-          <w:spacing w:val="0"/>
-          <w:color w:val="181E2A"/>
-        </w:rPr>
-        <w:t xml:space="preserve">Vérifier le prospect cible dans </w:t>
-      </w:r>
-      <w:r>
-        <w:rPr>
-          <w:rFonts w:ascii="Helvetica" w:hAnsi="Helvetica" w:cs="Helvetica"/>
-          <w:sz w:val="29"/>
-          <w:sz-cs w:val="29"/>
-          <w:b/>
-          <w:spacing w:val="0"/>
-          <w:color w:val="181E2A"/>
-        </w:rPr>
-        <w:t xml:space="preserve">Set Target</w:t>
-      </w:r>
-      <w:r>
-        <w:rPr>
-          <w:rFonts w:ascii="Helvetica" w:hAnsi="Helvetica" w:cs="Helvetica"/>
-          <w:sz w:val="29"/>
-          <w:sz-cs w:val="29"/>
-          <w:spacing w:val="0"/>
-          <w:color w:val="181E2A"/>
-        </w:rPr>
-        <w:t xml:space="preserve"> ou dans sa source CRM.</w:t>
-      </w:r>
-    </w:p>
-    <w:p>
-      <w:pPr>
-        <w:ind w:left="720" w:first-line="-720"/>
-        <w:spacing w:after="106"/>
-      </w:pPr>
-      <w:r>
-        <w:rPr>
-          <w:rFonts w:ascii="Helvetica" w:hAnsi="Helvetica" w:cs="Helvetica"/>
-          <w:sz w:val="29"/>
-          <w:sz-cs w:val="29"/>
-          <w:color w:val="181E2A"/>
-        </w:rPr>
-        <w:t xml:space="preserve"/>
-        <w:tab/>
-        <w:t xml:space="preserve">2</w:t>
-        <w:tab/>
-        <w:t xml:space="preserve"/>
-      </w:r>
-      <w:r>
-        <w:rPr>
-          <w:rFonts w:ascii="Helvetica" w:hAnsi="Helvetica" w:cs="Helvetica"/>
-          <w:sz w:val="29"/>
-          <w:sz-cs w:val="29"/>
-          <w:spacing w:val="0"/>
-          <w:color w:val="181E2A"/>
-        </w:rPr>
-        <w:t xml:space="preserve">Lancer le workflow de génération.</w:t>
-      </w:r>
-    </w:p>
-    <w:p>
-      <w:pPr>
-        <w:ind w:left="720" w:first-line="-720"/>
-        <w:spacing w:after="106"/>
-      </w:pPr>
-      <w:r>
-        <w:rPr>
-          <w:rFonts w:ascii="Helvetica" w:hAnsi="Helvetica" w:cs="Helvetica"/>
-          <w:sz w:val="29"/>
-          <w:sz-cs w:val="29"/>
-          <w:color w:val="181E2A"/>
-        </w:rPr>
-        <w:t xml:space="preserve"/>
-        <w:tab/>
-        <w:t xml:space="preserve">3</w:t>
-        <w:tab/>
-        <w:t xml:space="preserve"/>
-      </w:r>
-      <w:r>
-        <w:rPr>
-          <w:rFonts w:ascii="Helvetica" w:hAnsi="Helvetica" w:cs="Helvetica"/>
-          <w:sz w:val="29"/>
-          <w:sz-cs w:val="29"/>
-          <w:spacing w:val="0"/>
-          <w:color w:val="181E2A"/>
-        </w:rPr>
-        <w:t xml:space="preserve">Vérifier que </w:t>
-      </w:r>
-      <w:r>
-        <w:rPr>
-          <w:rFonts w:ascii="Helvetica" w:hAnsi="Helvetica" w:cs="Helvetica"/>
-          <w:sz w:val="29"/>
-          <w:sz-cs w:val="29"/>
-          <w:b/>
-          <w:spacing w:val="0"/>
-          <w:color w:val="181E2A"/>
-        </w:rPr>
-        <w:t xml:space="preserve">Render Catalogue Artifact</w:t>
-      </w:r>
-      <w:r>
-        <w:rPr>
-          <w:rFonts w:ascii="Helvetica" w:hAnsi="Helvetica" w:cs="Helvetica"/>
-          <w:sz w:val="29"/>
-          <w:sz-cs w:val="29"/>
-          <w:spacing w:val="0"/>
-          <w:color w:val="181E2A"/>
-        </w:rPr>
-        <w:t xml:space="preserve"> retourne </w:t>
-      </w:r>
-      <w:r>
-        <w:rPr>
-          <w:rFonts w:ascii="Menlo" w:hAnsi="Menlo" w:cs="Menlo"/>
-          <w:sz w:val="25"/>
-          <w:sz-cs w:val="25"/>
-          <w:spacing w:val="0"/>
-          <w:color w:val="181E2A"/>
-        </w:rPr>
-        <w:t xml:space="preserve">success = true</w:t>
+        <w:t xml:space="preserve">7.2 Nœuds clés</w:t>
+      </w:r>
+    </w:p>
+    <w:p>
+      <w:pPr>
+        <w:ind w:left="720" w:first-line="-720"/>
+        <w:spacing w:after="106"/>
+      </w:pPr>
+      <w:r>
+        <w:rPr>
+          <w:rFonts w:ascii="Helvetica" w:hAnsi="Helvetica" w:cs="Helvetica"/>
+          <w:sz w:val="29"/>
+          <w:sz-cs w:val="29"/>
+          <w:b/>
+          <w:color w:val="181E2A"/>
+        </w:rPr>
+        <w:t xml:space="preserve"/>
+        <w:tab/>
+        <w:t xml:space="preserve">•</w:t>
+        <w:tab/>
+        <w:t xml:space="preserve"/>
+      </w:r>
+      <w:r>
+        <w:rPr>
+          <w:rFonts w:ascii="Helvetica" w:hAnsi="Helvetica" w:cs="Helvetica"/>
+          <w:sz w:val="29"/>
+          <w:sz-cs w:val="29"/>
+          <w:b/>
+          <w:spacing w:val="0"/>
+          <w:color w:val="181E2A"/>
+        </w:rPr>
+        <w:t xml:space="preserve">Generate Executive Letter</w:t>
+      </w:r>
+      <w:r>
+        <w:rPr>
+          <w:rFonts w:ascii="Helvetica" w:hAnsi="Helvetica" w:cs="Helvetica"/>
+          <w:sz w:val="29"/>
+          <w:sz-cs w:val="29"/>
+          <w:spacing w:val="0"/>
+          <w:color w:val="181E2A"/>
+        </w:rPr>
+        <w:t xml:space="preserve"> : courrier exécutif.</w:t>
+      </w:r>
+    </w:p>
+    <w:p>
+      <w:pPr>
+        <w:ind w:left="720" w:first-line="-720"/>
+        <w:spacing w:after="106"/>
+      </w:pPr>
+      <w:r>
+        <w:rPr>
+          <w:rFonts w:ascii="Helvetica" w:hAnsi="Helvetica" w:cs="Helvetica"/>
+          <w:sz w:val="29"/>
+          <w:sz-cs w:val="29"/>
+          <w:b/>
+          <w:color w:val="181E2A"/>
+        </w:rPr>
+        <w:t xml:space="preserve"/>
+        <w:tab/>
+        <w:t xml:space="preserve">•</w:t>
+        <w:tab/>
+        <w:t xml:space="preserve"/>
+      </w:r>
+      <w:r>
+        <w:rPr>
+          <w:rFonts w:ascii="Helvetica" w:hAnsi="Helvetica" w:cs="Helvetica"/>
+          <w:sz w:val="29"/>
+          <w:sz-cs w:val="29"/>
+          <w:b/>
+          <w:spacing w:val="0"/>
+          <w:color w:val="181E2A"/>
+        </w:rPr>
+        <w:t xml:space="preserve">Generate Tailored Catalogue</w:t>
+      </w:r>
+      <w:r>
+        <w:rPr>
+          <w:rFonts w:ascii="Helvetica" w:hAnsi="Helvetica" w:cs="Helvetica"/>
+          <w:sz w:val="29"/>
+          <w:sz-cs w:val="29"/>
+          <w:spacing w:val="0"/>
+          <w:color w:val="181E2A"/>
+        </w:rPr>
+        <w:t xml:space="preserve"> : source de personnalisation commerciale.</w:t>
+      </w:r>
+    </w:p>
+    <w:p>
+      <w:pPr>
+        <w:ind w:left="720" w:first-line="-720"/>
+        <w:spacing w:after="106"/>
+      </w:pPr>
+      <w:r>
+        <w:rPr>
+          <w:rFonts w:ascii="Helvetica" w:hAnsi="Helvetica" w:cs="Helvetica"/>
+          <w:sz w:val="29"/>
+          <w:sz-cs w:val="29"/>
+          <w:b/>
+          <w:color w:val="181E2A"/>
+        </w:rPr>
+        <w:t xml:space="preserve"/>
+        <w:tab/>
+        <w:t xml:space="preserve">•</w:t>
+        <w:tab/>
+        <w:t xml:space="preserve"/>
+      </w:r>
+      <w:r>
+        <w:rPr>
+          <w:rFonts w:ascii="Helvetica" w:hAnsi="Helvetica" w:cs="Helvetica"/>
+          <w:sz w:val="29"/>
+          <w:sz-cs w:val="29"/>
+          <w:b/>
+          <w:spacing w:val="0"/>
+          <w:color w:val="181E2A"/>
+        </w:rPr>
+        <w:t xml:space="preserve">Generate Tailored Audit Form</w:t>
+      </w:r>
+      <w:r>
+        <w:rPr>
+          <w:rFonts w:ascii="Helvetica" w:hAnsi="Helvetica" w:cs="Helvetica"/>
+          <w:sz w:val="29"/>
+          <w:sz-cs w:val="29"/>
+          <w:spacing w:val="0"/>
+          <w:color w:val="181E2A"/>
+        </w:rPr>
+        <w:t xml:space="preserve"> : source métier pour le formulaire d’audit.</w:t>
+      </w:r>
+    </w:p>
+    <w:p>
+      <w:pPr>
+        <w:ind w:left="720" w:first-line="-720"/>
+        <w:spacing w:after="106"/>
+      </w:pPr>
+      <w:r>
+        <w:rPr>
+          <w:rFonts w:ascii="Helvetica" w:hAnsi="Helvetica" w:cs="Helvetica"/>
+          <w:sz w:val="29"/>
+          <w:sz-cs w:val="29"/>
+          <w:b/>
+          <w:color w:val="181E2A"/>
+        </w:rPr>
+        <w:t xml:space="preserve"/>
+        <w:tab/>
+        <w:t xml:space="preserve">•</w:t>
+        <w:tab/>
+        <w:t xml:space="preserve"/>
+      </w:r>
+      <w:r>
+        <w:rPr>
+          <w:rFonts w:ascii="Helvetica" w:hAnsi="Helvetica" w:cs="Helvetica"/>
+          <w:sz w:val="29"/>
+          <w:sz-cs w:val="29"/>
+          <w:b/>
+          <w:spacing w:val="0"/>
+          <w:color w:val="181E2A"/>
+        </w:rPr>
+        <w:t xml:space="preserve">Generate Deck Brief</w:t>
+      </w:r>
+      <w:r>
+        <w:rPr>
+          <w:rFonts w:ascii="Helvetica" w:hAnsi="Helvetica" w:cs="Helvetica"/>
+          <w:sz w:val="29"/>
+          <w:sz-cs w:val="29"/>
+          <w:spacing w:val="0"/>
+          <w:color w:val="181E2A"/>
+        </w:rPr>
+        <w:t xml:space="preserve"> : structure et argumentaire du deck.</w:t>
+      </w:r>
+    </w:p>
+    <w:p>
+      <w:pPr>
+        <w:ind w:left="720" w:first-line="-720"/>
+        <w:spacing w:after="106"/>
+      </w:pPr>
+      <w:r>
+        <w:rPr>
+          <w:rFonts w:ascii="Helvetica" w:hAnsi="Helvetica" w:cs="Helvetica"/>
+          <w:sz w:val="29"/>
+          <w:sz-cs w:val="29"/>
+          <w:b/>
+          <w:color w:val="181E2A"/>
+        </w:rPr>
+        <w:t xml:space="preserve"/>
+        <w:tab/>
+        <w:t xml:space="preserve">•</w:t>
+        <w:tab/>
+        <w:t xml:space="preserve"/>
+      </w:r>
+      <w:r>
+        <w:rPr>
+          <w:rFonts w:ascii="Helvetica" w:hAnsi="Helvetica" w:cs="Helvetica"/>
+          <w:sz w:val="29"/>
+          <w:sz-cs w:val="29"/>
+          <w:b/>
+          <w:spacing w:val="0"/>
+          <w:color w:val="181E2A"/>
+        </w:rPr>
+        <w:t xml:space="preserve">Assemble Prospect Pack</w:t>
+      </w:r>
+      <w:r>
+        <w:rPr>
+          <w:rFonts w:ascii="Helvetica" w:hAnsi="Helvetica" w:cs="Helvetica"/>
+          <w:sz w:val="29"/>
+          <w:sz-cs w:val="29"/>
+          <w:spacing w:val="0"/>
+          <w:color w:val="181E2A"/>
+        </w:rPr>
+        <w:t xml:space="preserve"> : assemble les sorties LLM et le contexte prospect.</w:t>
+      </w:r>
+    </w:p>
+    <w:p>
+      <w:pPr>
+        <w:ind w:left="720" w:first-line="-720"/>
+        <w:spacing w:after="106"/>
+      </w:pPr>
+      <w:r>
+        <w:rPr>
+          <w:rFonts w:ascii="Helvetica" w:hAnsi="Helvetica" w:cs="Helvetica"/>
+          <w:sz w:val="29"/>
+          <w:sz-cs w:val="29"/>
+          <w:b/>
+          <w:color w:val="181E2A"/>
+        </w:rPr>
+        <w:t xml:space="preserve"/>
+        <w:tab/>
+        <w:t xml:space="preserve">•</w:t>
+        <w:tab/>
+        <w:t xml:space="preserve"/>
+      </w:r>
+      <w:r>
+        <w:rPr>
+          <w:rFonts w:ascii="Helvetica" w:hAnsi="Helvetica" w:cs="Helvetica"/>
+          <w:sz w:val="29"/>
+          <w:sz-cs w:val="29"/>
+          <w:b/>
+          <w:spacing w:val="0"/>
+          <w:color w:val="181E2A"/>
+        </w:rPr>
+        <w:t xml:space="preserve">Resolve Domain Catalogue</w:t>
+      </w:r>
+      <w:r>
+        <w:rPr>
+          <w:rFonts w:ascii="Helvetica" w:hAnsi="Helvetica" w:cs="Helvetica"/>
+          <w:sz w:val="29"/>
+          <w:sz-cs w:val="29"/>
+          <w:spacing w:val="0"/>
+          <w:color w:val="181E2A"/>
+        </w:rPr>
+        <w:t xml:space="preserve"> : détecte le domaine de base du catalogue statique historique ; ce nœud reste présent dans </w:t>
+      </w:r>
+      <w:r>
+        <w:rPr>
+          <w:rFonts w:ascii="Menlo" w:hAnsi="Menlo" w:cs="Menlo"/>
+          <w:sz w:val="25"/>
+          <w:sz-cs w:val="25"/>
+          <w:spacing w:val="0"/>
+          <w:color w:val="181E2A"/>
+        </w:rPr>
+        <w:t xml:space="preserve">FINAL-10</w:t>
+      </w:r>
+      <w:r>
+        <w:rPr>
+          <w:rFonts w:ascii="Helvetica" w:hAnsi="Helvetica" w:cs="Helvetica"/>
+          <w:sz w:val="29"/>
+          <w:sz-cs w:val="29"/>
+          <w:spacing w:val="0"/>
+          <w:color w:val="181E2A"/>
+        </w:rPr>
+        <w:t xml:space="preserve">.</w:t>
+      </w:r>
+    </w:p>
+    <w:p>
+      <w:pPr>
+        <w:ind w:left="720" w:first-line="-720"/>
+        <w:spacing w:after="106"/>
+      </w:pPr>
+      <w:r>
+        <w:rPr>
+          <w:rFonts w:ascii="Helvetica" w:hAnsi="Helvetica" w:cs="Helvetica"/>
+          <w:sz w:val="29"/>
+          <w:sz-cs w:val="29"/>
+          <w:b/>
+          <w:color w:val="181E2A"/>
+        </w:rPr>
+        <w:t xml:space="preserve"/>
+        <w:tab/>
+        <w:t xml:space="preserve">•</w:t>
+        <w:tab/>
+        <w:t xml:space="preserve"/>
+      </w:r>
+      <w:r>
+        <w:rPr>
+          <w:rFonts w:ascii="Helvetica" w:hAnsi="Helvetica" w:cs="Helvetica"/>
+          <w:sz w:val="29"/>
+          <w:sz-cs w:val="29"/>
+          <w:b/>
+          <w:spacing w:val="0"/>
+          <w:color w:val="181E2A"/>
+        </w:rPr>
+        <w:t xml:space="preserve">Download Catalogue PDF</w:t>
+      </w:r>
+      <w:r>
+        <w:rPr>
+          <w:rFonts w:ascii="Helvetica" w:hAnsi="Helvetica" w:cs="Helvetica"/>
+          <w:sz w:val="29"/>
+          <w:sz-cs w:val="29"/>
+          <w:spacing w:val="0"/>
+          <w:color w:val="181E2A"/>
+        </w:rPr>
+        <w:t xml:space="preserve"> : télécharge le PDF catalogue côté site public ; présent dans l’export mais non retenu comme source finale cible des pièces jointes phase 1 deck.</w:t>
+      </w:r>
+    </w:p>
+    <w:p>
+      <w:pPr>
+        <w:ind w:left="720" w:first-line="-720"/>
+        <w:spacing w:after="106"/>
+      </w:pPr>
+      <w:r>
+        <w:rPr>
+          <w:rFonts w:ascii="Helvetica" w:hAnsi="Helvetica" w:cs="Helvetica"/>
+          <w:sz w:val="29"/>
+          <w:sz-cs w:val="29"/>
+          <w:b/>
+          <w:color w:val="181E2A"/>
+        </w:rPr>
+        <w:t xml:space="preserve"/>
+        <w:tab/>
+        <w:t xml:space="preserve">•</w:t>
+        <w:tab/>
+        <w:t xml:space="preserve"/>
+      </w:r>
+      <w:r>
+        <w:rPr>
+          <w:rFonts w:ascii="Helvetica" w:hAnsi="Helvetica" w:cs="Helvetica"/>
+          <w:sz w:val="29"/>
+          <w:sz-cs w:val="29"/>
+          <w:b/>
+          <w:spacing w:val="0"/>
+          <w:color w:val="181E2A"/>
+        </w:rPr>
+        <w:t xml:space="preserve">Assemble Mail Attachments</w:t>
+      </w:r>
+      <w:r>
+        <w:rPr>
+          <w:rFonts w:ascii="Helvetica" w:hAnsi="Helvetica" w:cs="Helvetica"/>
+          <w:sz w:val="29"/>
+          <w:sz-cs w:val="29"/>
+          <w:spacing w:val="0"/>
+          <w:color w:val="181E2A"/>
+        </w:rPr>
+        <w:t xml:space="preserve"> : ancienne logique d’assemblage PDF + </w:t>
+      </w:r>
+      <w:r>
+        <w:rPr>
+          <w:rFonts w:ascii="Menlo" w:hAnsi="Menlo" w:cs="Menlo"/>
+          <w:sz w:val="25"/>
+          <w:sz-cs w:val="25"/>
+          <w:spacing w:val="0"/>
+          <w:color w:val="181E2A"/>
+        </w:rPr>
+        <w:t xml:space="preserve">Deck_Brief</w:t>
+      </w:r>
+      <w:r>
+        <w:rPr>
+          <w:rFonts w:ascii="Helvetica" w:hAnsi="Helvetica" w:cs="Helvetica"/>
+          <w:sz w:val="29"/>
+          <w:sz-cs w:val="29"/>
+          <w:spacing w:val="0"/>
+          <w:color w:val="181E2A"/>
+        </w:rPr>
+        <w:t xml:space="preserve"> ; visible dans l’export, mais ne correspond plus au flux d’envoi cible.</w:t>
+      </w:r>
+    </w:p>
+    <w:p>
+      <w:pPr>
+        <w:ind w:left="720" w:first-line="-720"/>
+        <w:spacing w:after="106"/>
+      </w:pPr>
+      <w:r>
+        <w:rPr>
+          <w:rFonts w:ascii="Helvetica" w:hAnsi="Helvetica" w:cs="Helvetica"/>
+          <w:sz w:val="29"/>
+          <w:sz-cs w:val="29"/>
+          <w:b/>
+          <w:color w:val="181E2A"/>
+        </w:rPr>
+        <w:t xml:space="preserve"/>
+        <w:tab/>
+        <w:t xml:space="preserve">•</w:t>
+        <w:tab/>
+        <w:t xml:space="preserve"/>
+      </w:r>
+      <w:r>
+        <w:rPr>
+          <w:rFonts w:ascii="Helvetica" w:hAnsi="Helvetica" w:cs="Helvetica"/>
+          <w:sz w:val="29"/>
+          <w:sz-cs w:val="29"/>
+          <w:b/>
+          <w:spacing w:val="0"/>
+          <w:color w:val="181E2A"/>
+        </w:rPr>
+        <w:t xml:space="preserve">Build Catalogue Render Payload</w:t>
+      </w:r>
+      <w:r>
+        <w:rPr>
+          <w:rFonts w:ascii="Helvetica" w:hAnsi="Helvetica" w:cs="Helvetica"/>
+          <w:sz w:val="29"/>
+          <w:sz-cs w:val="29"/>
+          <w:spacing w:val="0"/>
+          <w:color w:val="181E2A"/>
+        </w:rPr>
+        <w:t xml:space="preserve"> : fabrique le payload complet pour </w:t>
+      </w:r>
+      <w:r>
+        <w:rPr>
+          <w:rFonts w:ascii="Menlo" w:hAnsi="Menlo" w:cs="Menlo"/>
+          <w:sz w:val="25"/>
+          <w:sz-cs w:val="25"/>
+          <w:spacing w:val="0"/>
+          <w:color w:val="181E2A"/>
+        </w:rPr>
+        <w:t xml:space="preserve">catalogue-renderer</w:t>
+      </w:r>
+      <w:r>
+        <w:rPr>
+          <w:rFonts w:ascii="Helvetica" w:hAnsi="Helvetica" w:cs="Helvetica"/>
+          <w:sz w:val="29"/>
+          <w:sz-cs w:val="29"/>
+          <w:spacing w:val="0"/>
+          <w:color w:val="181E2A"/>
+        </w:rPr>
+        <w:t xml:space="preserve">.</w:t>
+      </w:r>
+    </w:p>
+    <w:p>
+      <w:pPr>
+        <w:ind w:left="720" w:first-line="-720"/>
+        <w:spacing w:after="106"/>
+      </w:pPr>
+      <w:r>
+        <w:rPr>
+          <w:rFonts w:ascii="Helvetica" w:hAnsi="Helvetica" w:cs="Helvetica"/>
+          <w:sz w:val="29"/>
+          <w:sz-cs w:val="29"/>
+          <w:b/>
+          <w:color w:val="181E2A"/>
+        </w:rPr>
+        <w:t xml:space="preserve"/>
+        <w:tab/>
+        <w:t xml:space="preserve">•</w:t>
+        <w:tab/>
+        <w:t xml:space="preserve"/>
+      </w:r>
+      <w:r>
+        <w:rPr>
+          <w:rFonts w:ascii="Helvetica" w:hAnsi="Helvetica" w:cs="Helvetica"/>
+          <w:sz w:val="29"/>
+          <w:sz-cs w:val="29"/>
+          <w:b/>
+          <w:spacing w:val="0"/>
+          <w:color w:val="181E2A"/>
+        </w:rPr>
+        <w:t xml:space="preserve">render Catalogue Artifact</w:t>
+      </w:r>
+      <w:r>
+        <w:rPr>
+          <w:rFonts w:ascii="Helvetica" w:hAnsi="Helvetica" w:cs="Helvetica"/>
+          <w:sz w:val="29"/>
+          <w:sz-cs w:val="29"/>
+          <w:spacing w:val="0"/>
+          <w:color w:val="181E2A"/>
+        </w:rPr>
+        <w:t xml:space="preserve"> : génère le PDF et le DOCX par </w:t>
+      </w:r>
+      <w:r>
+        <w:rPr>
+          <w:rFonts w:ascii="Menlo" w:hAnsi="Menlo" w:cs="Menlo"/>
+          <w:sz w:val="25"/>
+          <w:sz-cs w:val="25"/>
+          <w:spacing w:val="0"/>
+          <w:color w:val="181E2A"/>
+        </w:rPr>
+        <w:t xml:space="preserve">pack_id</w:t>
+      </w:r>
+      <w:r>
+        <w:rPr>
+          <w:rFonts w:ascii="Helvetica" w:hAnsi="Helvetica" w:cs="Helvetica"/>
+          <w:sz w:val="29"/>
+          <w:sz-cs w:val="29"/>
+          <w:spacing w:val="0"/>
+          <w:color w:val="181E2A"/>
+        </w:rPr>
+        <w:t xml:space="preserve">. Dans </w:t>
+      </w:r>
+      <w:r>
+        <w:rPr>
+          <w:rFonts w:ascii="Menlo" w:hAnsi="Menlo" w:cs="Menlo"/>
+          <w:sz w:val="25"/>
+          <w:sz-cs w:val="25"/>
+          <w:spacing w:val="0"/>
+          <w:color w:val="181E2A"/>
+        </w:rPr>
+        <w:t xml:space="preserve">FINAL-10</w:t>
+      </w:r>
+      <w:r>
+        <w:rPr>
+          <w:rFonts w:ascii="Helvetica" w:hAnsi="Helvetica" w:cs="Helvetica"/>
+          <w:sz w:val="29"/>
+          <w:sz-cs w:val="29"/>
+          <w:spacing w:val="0"/>
+          <w:color w:val="181E2A"/>
+        </w:rPr>
+        <w:t xml:space="preserve">, le nom du nœud commence bien par un </w:t>
+      </w:r>
+      <w:r>
+        <w:rPr>
+          <w:rFonts w:ascii="Menlo" w:hAnsi="Menlo" w:cs="Menlo"/>
+          <w:sz w:val="25"/>
+          <w:sz-cs w:val="25"/>
+          <w:spacing w:val="0"/>
+          <w:color w:val="181E2A"/>
+        </w:rPr>
+        <w:t xml:space="preserve">r</w:t>
+      </w:r>
+      <w:r>
+        <w:rPr>
+          <w:rFonts w:ascii="Helvetica" w:hAnsi="Helvetica" w:cs="Helvetica"/>
+          <w:sz w:val="29"/>
+          <w:sz-cs w:val="29"/>
+          <w:spacing w:val="0"/>
+          <w:color w:val="181E2A"/>
+        </w:rPr>
+        <w:t xml:space="preserve"> minuscule.</w:t>
+      </w:r>
+    </w:p>
+    <w:p>
+      <w:pPr>
+        <w:ind w:left="720" w:first-line="-720"/>
+        <w:spacing w:after="106"/>
+      </w:pPr>
+      <w:r>
+        <w:rPr>
+          <w:rFonts w:ascii="Helvetica" w:hAnsi="Helvetica" w:cs="Helvetica"/>
+          <w:sz w:val="29"/>
+          <w:sz-cs w:val="29"/>
+          <w:b/>
+          <w:color w:val="181E2A"/>
+        </w:rPr>
+        <w:t xml:space="preserve"/>
+        <w:tab/>
+        <w:t xml:space="preserve">•</w:t>
+        <w:tab/>
+        <w:t xml:space="preserve"/>
+      </w:r>
+      <w:r>
+        <w:rPr>
+          <w:rFonts w:ascii="Helvetica" w:hAnsi="Helvetica" w:cs="Helvetica"/>
+          <w:sz w:val="29"/>
+          <w:sz-cs w:val="29"/>
+          <w:b/>
+          <w:spacing w:val="0"/>
+          <w:color w:val="181E2A"/>
+        </w:rPr>
+        <w:t xml:space="preserve">Merge Catalogue Artifact</w:t>
+      </w:r>
+      <w:r>
+        <w:rPr>
+          <w:rFonts w:ascii="Helvetica" w:hAnsi="Helvetica" w:cs="Helvetica"/>
+          <w:sz w:val="29"/>
+          <w:sz-cs w:val="29"/>
+          <w:spacing w:val="0"/>
+          <w:color w:val="181E2A"/>
+        </w:rPr>
+        <w:t xml:space="preserve"> : injecte les URLs réelles du catalogue dans le pack.</w:t>
+      </w:r>
+    </w:p>
+    <w:p>
+      <w:pPr>
+        <w:ind w:left="720" w:first-line="-720"/>
+        <w:spacing w:after="106"/>
+      </w:pPr>
+      <w:r>
+        <w:rPr>
+          <w:rFonts w:ascii="Helvetica" w:hAnsi="Helvetica" w:cs="Helvetica"/>
+          <w:sz w:val="29"/>
+          <w:sz-cs w:val="29"/>
+          <w:b/>
+          <w:color w:val="181E2A"/>
+        </w:rPr>
+        <w:t xml:space="preserve"/>
+        <w:tab/>
+        <w:t xml:space="preserve">•</w:t>
+        <w:tab/>
+        <w:t xml:space="preserve"/>
+      </w:r>
+      <w:r>
+        <w:rPr>
+          <w:rFonts w:ascii="Helvetica" w:hAnsi="Helvetica" w:cs="Helvetica"/>
+          <w:sz w:val="29"/>
+          <w:sz-cs w:val="29"/>
+          <w:b/>
+          <w:spacing w:val="0"/>
+          <w:color w:val="181E2A"/>
+        </w:rPr>
+        <w:t xml:space="preserve">Build Deck Render Payload</w:t>
+      </w:r>
+      <w:r>
+        <w:rPr>
+          <w:rFonts w:ascii="Helvetica" w:hAnsi="Helvetica" w:cs="Helvetica"/>
+          <w:sz w:val="29"/>
+          <w:sz-cs w:val="29"/>
+          <w:spacing w:val="0"/>
+          <w:color w:val="181E2A"/>
+        </w:rPr>
+        <w:t xml:space="preserve"> : prépare le payload PPTX à partir du pack enrichi catalogue.</w:t>
+      </w:r>
+    </w:p>
+    <w:p>
+      <w:pPr>
+        <w:ind w:left="720" w:first-line="-720"/>
+        <w:spacing w:after="106"/>
+      </w:pPr>
+      <w:r>
+        <w:rPr>
+          <w:rFonts w:ascii="Helvetica" w:hAnsi="Helvetica" w:cs="Helvetica"/>
+          <w:sz w:val="29"/>
+          <w:sz-cs w:val="29"/>
+          <w:b/>
+          <w:color w:val="181E2A"/>
+        </w:rPr>
+        <w:t xml:space="preserve"/>
+        <w:tab/>
+        <w:t xml:space="preserve">•</w:t>
+        <w:tab/>
+        <w:t xml:space="preserve"/>
+      </w:r>
+      <w:r>
+        <w:rPr>
+          <w:rFonts w:ascii="Helvetica" w:hAnsi="Helvetica" w:cs="Helvetica"/>
+          <w:sz w:val="29"/>
+          <w:sz-cs w:val="29"/>
+          <w:b/>
+          <w:spacing w:val="0"/>
+          <w:color w:val="181E2A"/>
+        </w:rPr>
+        <w:t xml:space="preserve">Render Deck Artifact</w:t>
+      </w:r>
+      <w:r>
+        <w:rPr>
+          <w:rFonts w:ascii="Helvetica" w:hAnsi="Helvetica" w:cs="Helvetica"/>
+          <w:sz w:val="29"/>
+          <w:sz-cs w:val="29"/>
+          <w:spacing w:val="0"/>
+          <w:color w:val="181E2A"/>
+        </w:rPr>
+        <w:t xml:space="preserve"> : appelle </w:t>
+      </w:r>
+      <w:r>
+        <w:rPr>
+          <w:rFonts w:ascii="Menlo" w:hAnsi="Menlo" w:cs="Menlo"/>
+          <w:sz w:val="25"/>
+          <w:sz-cs w:val="25"/>
+          <w:spacing w:val="0"/>
+          <w:color w:val="181E2A"/>
+        </w:rPr>
+        <w:t xml:space="preserve">deck-renderer</w:t>
+      </w:r>
+      <w:r>
+        <w:rPr>
+          <w:rFonts w:ascii="Helvetica" w:hAnsi="Helvetica" w:cs="Helvetica"/>
+          <w:sz w:val="29"/>
+          <w:sz-cs w:val="29"/>
+          <w:spacing w:val="0"/>
+          <w:color w:val="181E2A"/>
+        </w:rPr>
+        <w:t xml:space="preserve"> pour produire le fichier </w:t>
+      </w:r>
+      <w:r>
+        <w:rPr>
+          <w:rFonts w:ascii="Menlo" w:hAnsi="Menlo" w:cs="Menlo"/>
+          <w:sz w:val="25"/>
+          <w:sz-cs w:val="25"/>
+          <w:spacing w:val="0"/>
+          <w:color w:val="181E2A"/>
+        </w:rPr>
+        <w:t xml:space="preserve">.pptx</w:t>
+      </w:r>
+      <w:r>
+        <w:rPr>
+          <w:rFonts w:ascii="Helvetica" w:hAnsi="Helvetica" w:cs="Helvetica"/>
+          <w:sz w:val="29"/>
+          <w:sz-cs w:val="29"/>
+          <w:spacing w:val="0"/>
+          <w:color w:val="181E2A"/>
+        </w:rPr>
+        <w:t xml:space="preserve">.</w:t>
+      </w:r>
+    </w:p>
+    <w:p>
+      <w:pPr>
+        <w:ind w:left="720" w:first-line="-720"/>
+        <w:spacing w:after="106"/>
+      </w:pPr>
+      <w:r>
+        <w:rPr>
+          <w:rFonts w:ascii="Helvetica" w:hAnsi="Helvetica" w:cs="Helvetica"/>
+          <w:sz w:val="29"/>
+          <w:sz-cs w:val="29"/>
+          <w:b/>
+          <w:color w:val="181E2A"/>
+        </w:rPr>
+        <w:t xml:space="preserve"/>
+        <w:tab/>
+        <w:t xml:space="preserve">•</w:t>
+        <w:tab/>
+        <w:t xml:space="preserve"/>
+      </w:r>
+      <w:r>
+        <w:rPr>
+          <w:rFonts w:ascii="Helvetica" w:hAnsi="Helvetica" w:cs="Helvetica"/>
+          <w:sz w:val="29"/>
+          <w:sz-cs w:val="29"/>
+          <w:b/>
+          <w:spacing w:val="0"/>
+          <w:color w:val="181E2A"/>
+        </w:rPr>
+        <w:t xml:space="preserve">Merge Deck Artifact</w:t>
+      </w:r>
+      <w:r>
+        <w:rPr>
+          <w:rFonts w:ascii="Helvetica" w:hAnsi="Helvetica" w:cs="Helvetica"/>
+          <w:sz w:val="29"/>
+          <w:sz-cs w:val="29"/>
+          <w:spacing w:val="0"/>
+          <w:color w:val="181E2A"/>
+        </w:rPr>
+        <w:t xml:space="preserve"> : fusionne le deck avec le pack et concatène les pièces jointes catalogue + deck.</w:t>
+      </w:r>
+    </w:p>
+    <w:p>
+      <w:pPr>
+        <w:ind w:left="720" w:first-line="-720"/>
+        <w:spacing w:after="106"/>
+      </w:pPr>
+      <w:r>
+        <w:rPr>
+          <w:rFonts w:ascii="Helvetica" w:hAnsi="Helvetica" w:cs="Helvetica"/>
+          <w:sz w:val="29"/>
+          <w:sz-cs w:val="29"/>
+          <w:b/>
+          <w:color w:val="181E2A"/>
+        </w:rPr>
+        <w:t xml:space="preserve"/>
+        <w:tab/>
+        <w:t xml:space="preserve">•</w:t>
+        <w:tab/>
+        <w:t xml:space="preserve"/>
+      </w:r>
+      <w:r>
+        <w:rPr>
+          <w:rFonts w:ascii="Helvetica" w:hAnsi="Helvetica" w:cs="Helvetica"/>
+          <w:sz w:val="29"/>
+          <w:sz-cs w:val="29"/>
+          <w:b/>
+          <w:spacing w:val="0"/>
+          <w:color w:val="181E2A"/>
+        </w:rPr>
+        <w:t xml:space="preserve">Store Pack In Supabase</w:t>
+      </w:r>
+      <w:r>
+        <w:rPr>
+          <w:rFonts w:ascii="Helvetica" w:hAnsi="Helvetica" w:cs="Helvetica"/>
+          <w:sz w:val="29"/>
+          <w:sz-cs w:val="29"/>
+          <w:spacing w:val="0"/>
+          <w:color w:val="181E2A"/>
+        </w:rPr>
+        <w:t xml:space="preserve"> : stocke le pack final avec </w:t>
+      </w:r>
+      <w:r>
+        <w:rPr>
+          <w:rFonts w:ascii="Menlo" w:hAnsi="Menlo" w:cs="Menlo"/>
+          <w:sz w:val="25"/>
+          <w:sz-cs w:val="25"/>
+          <w:spacing w:val="0"/>
+          <w:color w:val="181E2A"/>
+        </w:rPr>
+        <w:t xml:space="preserve">catalogue_artifact</w:t>
+      </w:r>
+      <w:r>
+        <w:rPr>
+          <w:rFonts w:ascii="Helvetica" w:hAnsi="Helvetica" w:cs="Helvetica"/>
+          <w:sz w:val="29"/>
+          <w:sz-cs w:val="29"/>
+          <w:spacing w:val="0"/>
+          <w:color w:val="181E2A"/>
+        </w:rPr>
+        <w:t xml:space="preserve">, </w:t>
+      </w:r>
+      <w:r>
+        <w:rPr>
+          <w:rFonts w:ascii="Menlo" w:hAnsi="Menlo" w:cs="Menlo"/>
+          <w:sz w:val="25"/>
+          <w:sz-cs w:val="25"/>
+          <w:spacing w:val="0"/>
+          <w:color w:val="181E2A"/>
+        </w:rPr>
+        <w:t xml:space="preserve">deck_artifact</w:t>
+      </w:r>
+      <w:r>
+        <w:rPr>
+          <w:rFonts w:ascii="Helvetica" w:hAnsi="Helvetica" w:cs="Helvetica"/>
+          <w:sz w:val="29"/>
+          <w:sz-cs w:val="29"/>
+          <w:spacing w:val="0"/>
+          <w:color w:val="181E2A"/>
+        </w:rPr>
+        <w:t xml:space="preserve">, </w:t>
+      </w:r>
+      <w:r>
+        <w:rPr>
+          <w:rFonts w:ascii="Menlo" w:hAnsi="Menlo" w:cs="Menlo"/>
+          <w:sz w:val="25"/>
+          <w:sz-cs w:val="25"/>
+          <w:spacing w:val="0"/>
+          <w:color w:val="181E2A"/>
+        </w:rPr>
+        <w:t xml:space="preserve">mail_attachments</w:t>
       </w:r>
       <w:r>
         <w:rPr>
@@ -3414,7 +3876,7 @@
           <w:spacing w:val="0"/>
           <w:color w:val="181E2A"/>
         </w:rPr>
-        <w:t xml:space="preserve">used_tailored_markdown = true</w:t>
+        <w:t xml:space="preserve">attachments_count</w:t>
       </w:r>
       <w:r>
         <w:rPr>
@@ -3437,94 +3899,25 @@
           <w:rFonts w:ascii="Helvetica" w:hAnsi="Helvetica" w:cs="Helvetica"/>
           <w:sz w:val="29"/>
           <w:sz-cs w:val="29"/>
-          <w:color w:val="181E2A"/>
-        </w:rPr>
-        <w:t xml:space="preserve"/>
-        <w:tab/>
-        <w:t xml:space="preserve">4</w:t>
-        <w:tab/>
-        <w:t xml:space="preserve"/>
-      </w:r>
-      <w:r>
-        <w:rPr>
-          <w:rFonts w:ascii="Helvetica" w:hAnsi="Helvetica" w:cs="Helvetica"/>
-          <w:sz w:val="29"/>
-          <w:sz-cs w:val="29"/>
-          <w:spacing w:val="0"/>
-          <w:color w:val="181E2A"/>
-        </w:rPr>
-        <w:t xml:space="preserve">Vérifier que </w:t>
-      </w:r>
-      <w:r>
-        <w:rPr>
-          <w:rFonts w:ascii="Helvetica" w:hAnsi="Helvetica" w:cs="Helvetica"/>
-          <w:sz w:val="29"/>
-          <w:sz-cs w:val="29"/>
-          <w:b/>
-          <w:spacing w:val="0"/>
-          <w:color w:val="181E2A"/>
-        </w:rPr>
-        <w:t xml:space="preserve">Render Deck Artifact</w:t>
-      </w:r>
-      <w:r>
-        <w:rPr>
-          <w:rFonts w:ascii="Helvetica" w:hAnsi="Helvetica" w:cs="Helvetica"/>
-          <w:sz w:val="29"/>
-          <w:sz-cs w:val="29"/>
-          <w:spacing w:val="0"/>
-          <w:color w:val="181E2A"/>
-        </w:rPr>
-        <w:t xml:space="preserve"> retourne </w:t>
-      </w:r>
-      <w:r>
-        <w:rPr>
-          <w:rFonts w:ascii="Menlo" w:hAnsi="Menlo" w:cs="Menlo"/>
-          <w:sz w:val="25"/>
-          <w:sz-cs w:val="25"/>
-          <w:spacing w:val="0"/>
-          <w:color w:val="181E2A"/>
-        </w:rPr>
-        <w:t xml:space="preserve">success = true</w:t>
-      </w:r>
-      <w:r>
-        <w:rPr>
-          <w:rFonts w:ascii="Helvetica" w:hAnsi="Helvetica" w:cs="Helvetica"/>
-          <w:sz w:val="29"/>
-          <w:sz-cs w:val="29"/>
-          <w:spacing w:val="0"/>
-          <w:color w:val="181E2A"/>
-        </w:rPr>
-        <w:t xml:space="preserve"> avec un </w:t>
-      </w:r>
-      <w:r>
-        <w:rPr>
-          <w:rFonts w:ascii="Menlo" w:hAnsi="Menlo" w:cs="Menlo"/>
-          <w:sz w:val="25"/>
-          <w:sz-cs w:val="25"/>
-          <w:spacing w:val="0"/>
-          <w:color w:val="181E2A"/>
-        </w:rPr>
-        <w:t xml:space="preserve">deck_artifact</w:t>
-      </w:r>
-      <w:r>
-        <w:rPr>
-          <w:rFonts w:ascii="Helvetica" w:hAnsi="Helvetica" w:cs="Helvetica"/>
-          <w:sz w:val="29"/>
-          <w:sz-cs w:val="29"/>
-          <w:spacing w:val="0"/>
-          <w:color w:val="181E2A"/>
-        </w:rPr>
-        <w:t xml:space="preserve"> contenant </w:t>
-      </w:r>
-      <w:r>
-        <w:rPr>
-          <w:rFonts w:ascii="Menlo" w:hAnsi="Menlo" w:cs="Menlo"/>
-          <w:sz w:val="25"/>
-          <w:sz-cs w:val="25"/>
-          <w:spacing w:val="0"/>
-          <w:color w:val="181E2A"/>
-        </w:rPr>
-        <w:t xml:space="preserve">filename_pptx</w:t>
+          <w:b/>
+          <w:color w:val="181E2A"/>
+        </w:rPr>
+        <w:t xml:space="preserve"/>
+        <w:tab/>
+        <w:t xml:space="preserve">•</w:t>
+        <w:tab/>
+        <w:t xml:space="preserve"/>
+      </w:r>
+      <w:r>
+        <w:rPr>
+          <w:rFonts w:ascii="Helvetica" w:hAnsi="Helvetica" w:cs="Helvetica"/>
+          <w:sz w:val="29"/>
+          <w:sz-cs w:val="29"/>
+          <w:b/>
+          <w:spacing w:val="0"/>
+          <w:color w:val="181E2A"/>
+        </w:rPr>
+        <w:t xml:space="preserve">Build Approval Email</w:t>
       </w:r>
       <w:r>
         <w:rPr>
@@ -3538,222 +3931,55 @@
       </w:r>
       <w:r>
         <w:rPr>
-          <w:rFonts w:ascii="Menlo" w:hAnsi="Menlo" w:cs="Menlo"/>
-          <w:sz w:val="25"/>
-          <w:sz-cs w:val="25"/>
-          <w:spacing w:val="0"/>
-          <w:color w:val="181E2A"/>
-        </w:rPr>
-        <w:t xml:space="preserve">pptx_url</w:t>
-      </w:r>
-      <w:r>
-        <w:rPr>
-          <w:rFonts w:ascii="Helvetica" w:hAnsi="Helvetica" w:cs="Helvetica"/>
-          <w:sz w:val="29"/>
-          <w:sz-cs w:val="29"/>
-          <w:spacing w:val="0"/>
-          <w:color w:val="181E2A"/>
-        </w:rPr>
-        <w:t xml:space="preserve">.</w:t>
-      </w:r>
-    </w:p>
-    <w:p>
-      <w:pPr>
-        <w:ind w:left="720" w:first-line="-720"/>
-        <w:spacing w:after="106"/>
-      </w:pPr>
-      <w:r>
-        <w:rPr>
-          <w:rFonts w:ascii="Helvetica" w:hAnsi="Helvetica" w:cs="Helvetica"/>
-          <w:sz w:val="29"/>
-          <w:sz-cs w:val="29"/>
-          <w:color w:val="181E2A"/>
-        </w:rPr>
-        <w:t xml:space="preserve"/>
-        <w:tab/>
-        <w:t xml:space="preserve">5</w:t>
-        <w:tab/>
-        <w:t xml:space="preserve"/>
-      </w:r>
-      <w:r>
-        <w:rPr>
-          <w:rFonts w:ascii="Helvetica" w:hAnsi="Helvetica" w:cs="Helvetica"/>
-          <w:sz w:val="29"/>
-          <w:sz-cs w:val="29"/>
-          <w:spacing w:val="0"/>
-          <w:color w:val="181E2A"/>
-        </w:rPr>
-        <w:t xml:space="preserve">Vérifier dans les diagnostics du deck que la variante, la langue et le nombre de slides de cas d’usage sont cohérents avec le prospect. Le rendu cible doit rester dans une fourchette de 8 à 10 slides selon la densité du contenu.</w:t>
-      </w:r>
-    </w:p>
-    <w:p>
-      <w:pPr>
-        <w:ind w:left="720" w:first-line="-720"/>
-        <w:spacing w:after="106"/>
-      </w:pPr>
-      <w:r>
-        <w:rPr>
-          <w:rFonts w:ascii="Helvetica" w:hAnsi="Helvetica" w:cs="Helvetica"/>
-          <w:sz w:val="29"/>
-          <w:sz-cs w:val="29"/>
-          <w:color w:val="181E2A"/>
-        </w:rPr>
-        <w:t xml:space="preserve"/>
-        <w:tab/>
-        <w:t xml:space="preserve">6</w:t>
-        <w:tab/>
-        <w:t xml:space="preserve"/>
-      </w:r>
-      <w:r>
-        <w:rPr>
-          <w:rFonts w:ascii="Helvetica" w:hAnsi="Helvetica" w:cs="Helvetica"/>
-          <w:sz w:val="29"/>
-          <w:sz-cs w:val="29"/>
-          <w:spacing w:val="0"/>
-          <w:color w:val="181E2A"/>
-        </w:rPr>
-        <w:t xml:space="preserve">Vérifier dans </w:t>
-      </w:r>
-      <w:r>
-        <w:rPr>
-          <w:rFonts w:ascii="Helvetica" w:hAnsi="Helvetica" w:cs="Helvetica"/>
-          <w:sz w:val="29"/>
-          <w:sz-cs w:val="29"/>
-          <w:b/>
-          <w:spacing w:val="0"/>
-          <w:color w:val="181E2A"/>
-        </w:rPr>
-        <w:t xml:space="preserve">Merge Deck Artifact</w:t>
-      </w:r>
-      <w:r>
-        <w:rPr>
-          <w:rFonts w:ascii="Helvetica" w:hAnsi="Helvetica" w:cs="Helvetica"/>
-          <w:sz w:val="29"/>
-          <w:sz-cs w:val="29"/>
-          <w:spacing w:val="0"/>
-          <w:color w:val="181E2A"/>
-        </w:rPr>
-        <w:t xml:space="preserve"> que </w:t>
-      </w:r>
-      <w:r>
-        <w:rPr>
-          <w:rFonts w:ascii="Menlo" w:hAnsi="Menlo" w:cs="Menlo"/>
-          <w:sz w:val="25"/>
-          <w:sz-cs w:val="25"/>
-          <w:spacing w:val="0"/>
-          <w:color w:val="181E2A"/>
-        </w:rPr>
-        <w:t xml:space="preserve">mail_attachments</w:t>
-      </w:r>
-      <w:r>
-        <w:rPr>
-          <w:rFonts w:ascii="Helvetica" w:hAnsi="Helvetica" w:cs="Helvetica"/>
-          <w:sz w:val="29"/>
-          <w:sz-cs w:val="29"/>
-          <w:spacing w:val="0"/>
-          <w:color w:val="181E2A"/>
-        </w:rPr>
-        <w:t xml:space="preserve"> contient exactement deux fichiers : un </w:t>
-      </w:r>
-      <w:r>
-        <w:rPr>
-          <w:rFonts w:ascii="Menlo" w:hAnsi="Menlo" w:cs="Menlo"/>
-          <w:sz w:val="25"/>
-          <w:sz-cs w:val="25"/>
-          <w:spacing w:val="0"/>
-          <w:color w:val="181E2A"/>
-        </w:rPr>
-        <w:t xml:space="preserve">.pdf</w:t>
-      </w:r>
-      <w:r>
-        <w:rPr>
-          <w:rFonts w:ascii="Helvetica" w:hAnsi="Helvetica" w:cs="Helvetica"/>
-          <w:sz w:val="29"/>
-          <w:sz-cs w:val="29"/>
-          <w:spacing w:val="0"/>
-          <w:color w:val="181E2A"/>
-        </w:rPr>
-        <w:t xml:space="preserve"> et un </w:t>
-      </w:r>
-      <w:r>
-        <w:rPr>
-          <w:rFonts w:ascii="Menlo" w:hAnsi="Menlo" w:cs="Menlo"/>
-          <w:sz w:val="25"/>
-          <w:sz-cs w:val="25"/>
-          <w:spacing w:val="0"/>
-          <w:color w:val="181E2A"/>
-        </w:rPr>
-        <w:t xml:space="preserve">.pptx</w:t>
-      </w:r>
-      <w:r>
-        <w:rPr>
-          <w:rFonts w:ascii="Helvetica" w:hAnsi="Helvetica" w:cs="Helvetica"/>
-          <w:sz w:val="29"/>
-          <w:sz-cs w:val="29"/>
-          <w:spacing w:val="0"/>
-          <w:color w:val="181E2A"/>
-        </w:rPr>
-        <w:t xml:space="preserve">.</w:t>
-      </w:r>
-    </w:p>
-    <w:p>
-      <w:pPr>
-        <w:ind w:left="720" w:first-line="-720"/>
-        <w:spacing w:after="106"/>
-      </w:pPr>
-      <w:r>
-        <w:rPr>
-          <w:rFonts w:ascii="Helvetica" w:hAnsi="Helvetica" w:cs="Helvetica"/>
-          <w:sz w:val="29"/>
-          <w:sz-cs w:val="29"/>
-          <w:color w:val="181E2A"/>
-        </w:rPr>
-        <w:t xml:space="preserve"/>
-        <w:tab/>
-        <w:t xml:space="preserve">7</w:t>
-        <w:tab/>
-        <w:t xml:space="preserve"/>
-      </w:r>
-      <w:r>
-        <w:rPr>
-          <w:rFonts w:ascii="Helvetica" w:hAnsi="Helvetica" w:cs="Helvetica"/>
-          <w:sz w:val="29"/>
-          <w:sz-cs w:val="29"/>
-          <w:spacing w:val="0"/>
-          <w:color w:val="181E2A"/>
-        </w:rPr>
-        <w:t xml:space="preserve">Vérifier que </w:t>
-      </w:r>
-      <w:r>
-        <w:rPr>
-          <w:rFonts w:ascii="Helvetica" w:hAnsi="Helvetica" w:cs="Helvetica"/>
-          <w:sz w:val="29"/>
-          <w:sz-cs w:val="29"/>
-          <w:b/>
-          <w:spacing w:val="0"/>
-          <w:color w:val="181E2A"/>
-        </w:rPr>
-        <w:t xml:space="preserve">Store Pack In Supabase</w:t>
-      </w:r>
-      <w:r>
-        <w:rPr>
-          <w:rFonts w:ascii="Helvetica" w:hAnsi="Helvetica" w:cs="Helvetica"/>
-          <w:sz w:val="29"/>
-          <w:sz-cs w:val="29"/>
-          <w:spacing w:val="0"/>
-          <w:color w:val="181E2A"/>
-        </w:rPr>
-        <w:t xml:space="preserve"> stocke bien </w:t>
-      </w:r>
-      <w:r>
-        <w:rPr>
-          <w:rFonts w:ascii="Menlo" w:hAnsi="Menlo" w:cs="Menlo"/>
-          <w:sz w:val="25"/>
-          <w:sz-cs w:val="25"/>
-          <w:spacing w:val="0"/>
-          <w:color w:val="181E2A"/>
-        </w:rPr>
-        <w:t xml:space="preserve">catalogue_artifact</w:t>
+          <w:rFonts w:ascii="Helvetica" w:hAnsi="Helvetica" w:cs="Helvetica"/>
+          <w:sz w:val="29"/>
+          <w:sz-cs w:val="29"/>
+          <w:b/>
+          <w:spacing w:val="0"/>
+          <w:color w:val="181E2A"/>
+        </w:rPr>
+        <w:t xml:space="preserve">Send Internal Approval Email</w:t>
+      </w:r>
+      <w:r>
+        <w:rPr>
+          <w:rFonts w:ascii="Helvetica" w:hAnsi="Helvetica" w:cs="Helvetica"/>
+          <w:sz w:val="29"/>
+          <w:sz-cs w:val="29"/>
+          <w:spacing w:val="0"/>
+          <w:color w:val="181E2A"/>
+        </w:rPr>
+        <w:t xml:space="preserve"> : validation interne.</w:t>
+      </w:r>
+    </w:p>
+    <w:p>
+      <w:pPr>
+        <w:ind w:left="720" w:first-line="-720"/>
+        <w:spacing w:after="106"/>
+      </w:pPr>
+      <w:r>
+        <w:rPr>
+          <w:rFonts w:ascii="Helvetica" w:hAnsi="Helvetica" w:cs="Helvetica"/>
+          <w:sz w:val="29"/>
+          <w:sz-cs w:val="29"/>
+          <w:b/>
+          <w:color w:val="181E2A"/>
+        </w:rPr>
+        <w:t xml:space="preserve"/>
+        <w:tab/>
+        <w:t xml:space="preserve">•</w:t>
+        <w:tab/>
+        <w:t xml:space="preserve"/>
+      </w:r>
+      <w:r>
+        <w:rPr>
+          <w:rFonts w:ascii="Helvetica" w:hAnsi="Helvetica" w:cs="Helvetica"/>
+          <w:sz w:val="29"/>
+          <w:sz-cs w:val="29"/>
+          <w:b/>
+          <w:spacing w:val="0"/>
+          <w:color w:val="181E2A"/>
+        </w:rPr>
+        <w:t xml:space="preserve">Approval Webhook</w:t>
       </w:r>
       <w:r>
         <w:rPr>
@@ -3767,13 +3993,14 @@
       </w:r>
       <w:r>
         <w:rPr>
-          <w:rFonts w:ascii="Menlo" w:hAnsi="Menlo" w:cs="Menlo"/>
-          <w:sz w:val="25"/>
-          <w:sz-cs w:val="25"/>
-          <w:spacing w:val="0"/>
-          <w:color w:val="181E2A"/>
-        </w:rPr>
-        <w:t xml:space="preserve">deck_artifact</w:t>
+          <w:rFonts w:ascii="Helvetica" w:hAnsi="Helvetica" w:cs="Helvetica"/>
+          <w:sz w:val="29"/>
+          <w:sz-cs w:val="29"/>
+          <w:b/>
+          <w:spacing w:val="0"/>
+          <w:color w:val="181E2A"/>
+        </w:rPr>
+        <w:t xml:space="preserve">Extract Pack Payload</w:t>
       </w:r>
       <w:r>
         <w:rPr>
@@ -3787,243 +4014,6 @@
       </w:r>
       <w:r>
         <w:rPr>
-          <w:rFonts w:ascii="Menlo" w:hAnsi="Menlo" w:cs="Menlo"/>
-          <w:sz w:val="25"/>
-          <w:sz-cs w:val="25"/>
-          <w:spacing w:val="0"/>
-          <w:color w:val="181E2A"/>
-        </w:rPr>
-        <w:t xml:space="preserve">mail_attachments</w:t>
-      </w:r>
-      <w:r>
-        <w:rPr>
-          <w:rFonts w:ascii="Helvetica" w:hAnsi="Helvetica" w:cs="Helvetica"/>
-          <w:sz w:val="29"/>
-          <w:sz-cs w:val="29"/>
-          <w:spacing w:val="0"/>
-          <w:color w:val="181E2A"/>
-        </w:rPr>
-        <w:t xml:space="preserve"> et </w:t>
-      </w:r>
-      <w:r>
-        <w:rPr>
-          <w:rFonts w:ascii="Menlo" w:hAnsi="Menlo" w:cs="Menlo"/>
-          <w:sz w:val="25"/>
-          <w:sz-cs w:val="25"/>
-          <w:spacing w:val="0"/>
-          <w:color w:val="181E2A"/>
-        </w:rPr>
-        <w:t xml:space="preserve">attachments_count = 2</w:t>
-      </w:r>
-      <w:r>
-        <w:rPr>
-          <w:rFonts w:ascii="Helvetica" w:hAnsi="Helvetica" w:cs="Helvetica"/>
-          <w:sz w:val="29"/>
-          <w:sz-cs w:val="29"/>
-          <w:spacing w:val="0"/>
-          <w:color w:val="181E2A"/>
-        </w:rPr>
-        <w:t xml:space="preserve">.</w:t>
-      </w:r>
-    </w:p>
-    <w:p>
-      <w:pPr>
-        <w:ind w:left="720" w:first-line="-720"/>
-        <w:spacing w:after="106"/>
-      </w:pPr>
-      <w:r>
-        <w:rPr>
-          <w:rFonts w:ascii="Helvetica" w:hAnsi="Helvetica" w:cs="Helvetica"/>
-          <w:sz w:val="29"/>
-          <w:sz-cs w:val="29"/>
-          <w:color w:val="181E2A"/>
-        </w:rPr>
-        <w:t xml:space="preserve"/>
-        <w:tab/>
-        <w:t xml:space="preserve">8</w:t>
-        <w:tab/>
-        <w:t xml:space="preserve"/>
-      </w:r>
-      <w:r>
-        <w:rPr>
-          <w:rFonts w:ascii="Helvetica" w:hAnsi="Helvetica" w:cs="Helvetica"/>
-          <w:sz w:val="29"/>
-          <w:sz-cs w:val="29"/>
-          <w:spacing w:val="0"/>
-          <w:color w:val="181E2A"/>
-        </w:rPr>
-        <w:t xml:space="preserve">Recevoir et relire l’email interne de validation. La ligne </w:t>
-      </w:r>
-      <w:r>
-        <w:rPr>
-          <w:rFonts w:ascii="Menlo" w:hAnsi="Menlo" w:cs="Menlo"/>
-          <w:sz w:val="25"/>
-          <w:sz-cs w:val="25"/>
-          <w:spacing w:val="0"/>
-          <w:color w:val="181E2A"/>
-        </w:rPr>
-        <w:t xml:space="preserve">Pièces jointes préparées</w:t>
-      </w:r>
-      <w:r>
-        <w:rPr>
-          <w:rFonts w:ascii="Helvetica" w:hAnsi="Helvetica" w:cs="Helvetica"/>
-          <w:sz w:val="29"/>
-          <w:sz-cs w:val="29"/>
-          <w:spacing w:val="0"/>
-          <w:color w:val="181E2A"/>
-        </w:rPr>
-        <w:t xml:space="preserve"> doit afficher </w:t>
-      </w:r>
-      <w:r>
-        <w:rPr>
-          <w:rFonts w:ascii="Menlo" w:hAnsi="Menlo" w:cs="Menlo"/>
-          <w:sz w:val="25"/>
-          <w:sz-cs w:val="25"/>
-          <w:spacing w:val="0"/>
-          <w:color w:val="181E2A"/>
-        </w:rPr>
-        <w:t xml:space="preserve">2</w:t>
-      </w:r>
-      <w:r>
-        <w:rPr>
-          <w:rFonts w:ascii="Helvetica" w:hAnsi="Helvetica" w:cs="Helvetica"/>
-          <w:sz w:val="29"/>
-          <w:sz-cs w:val="29"/>
-          <w:spacing w:val="0"/>
-          <w:color w:val="181E2A"/>
-        </w:rPr>
-        <w:t xml:space="preserve"> et la ligne </w:t>
-      </w:r>
-      <w:r>
-        <w:rPr>
-          <w:rFonts w:ascii="Menlo" w:hAnsi="Menlo" w:cs="Menlo"/>
-          <w:sz w:val="25"/>
-          <w:sz-cs w:val="25"/>
-          <w:spacing w:val="0"/>
-          <w:color w:val="181E2A"/>
-        </w:rPr>
-        <w:t xml:space="preserve">Fichiers</w:t>
-      </w:r>
-      <w:r>
-        <w:rPr>
-          <w:rFonts w:ascii="Helvetica" w:hAnsi="Helvetica" w:cs="Helvetica"/>
-          <w:sz w:val="29"/>
-          <w:sz-cs w:val="29"/>
-          <w:spacing w:val="0"/>
-          <w:color w:val="181E2A"/>
-        </w:rPr>
-        <w:t xml:space="preserve"> doit mentionner le PDF puis le PPTX.</w:t>
-      </w:r>
-    </w:p>
-    <w:p>
-      <w:pPr>
-        <w:ind w:left="720" w:first-line="-720"/>
-        <w:spacing w:after="106"/>
-      </w:pPr>
-      <w:r>
-        <w:rPr>
-          <w:rFonts w:ascii="Helvetica" w:hAnsi="Helvetica" w:cs="Helvetica"/>
-          <w:sz w:val="29"/>
-          <w:sz-cs w:val="29"/>
-          <w:color w:val="181E2A"/>
-        </w:rPr>
-        <w:t xml:space="preserve"/>
-        <w:tab/>
-        <w:t xml:space="preserve">9</w:t>
-        <w:tab/>
-        <w:t xml:space="preserve"/>
-      </w:r>
-      <w:r>
-        <w:rPr>
-          <w:rFonts w:ascii="Helvetica" w:hAnsi="Helvetica" w:cs="Helvetica"/>
-          <w:sz w:val="29"/>
-          <w:sz-cs w:val="29"/>
-          <w:spacing w:val="0"/>
-          <w:color w:val="181E2A"/>
-        </w:rPr>
-        <w:t xml:space="preserve">Approuver uniquement le dernier email reçu.</w:t>
-      </w:r>
-    </w:p>
-    <w:p>
-      <w:pPr>
-        <w:ind w:left="720" w:first-line="-720"/>
-        <w:spacing w:after="106"/>
-      </w:pPr>
-      <w:r>
-        <w:rPr>
-          <w:rFonts w:ascii="Helvetica" w:hAnsi="Helvetica" w:cs="Helvetica"/>
-          <w:sz w:val="29"/>
-          <w:sz-cs w:val="29"/>
-          <w:color w:val="181E2A"/>
-        </w:rPr>
-        <w:t xml:space="preserve"/>
-        <w:tab/>
-        <w:t xml:space="preserve">10</w:t>
-        <w:tab/>
-        <w:t xml:space="preserve"/>
-      </w:r>
-      <w:r>
-        <w:rPr>
-          <w:rFonts w:ascii="Helvetica" w:hAnsi="Helvetica" w:cs="Helvetica"/>
-          <w:sz w:val="29"/>
-          <w:sz-cs w:val="29"/>
-          <w:spacing w:val="0"/>
-          <w:color w:val="181E2A"/>
-        </w:rPr>
-        <w:t xml:space="preserve">Vérifier la nouvelle exécution webhook dans </w:t>
-      </w:r>
-      <w:r>
-        <w:rPr>
-          <w:rFonts w:ascii="Helvetica" w:hAnsi="Helvetica" w:cs="Helvetica"/>
-          <w:sz w:val="29"/>
-          <w:sz-cs w:val="29"/>
-          <w:b/>
-          <w:spacing w:val="0"/>
-          <w:color w:val="181E2A"/>
-        </w:rPr>
-        <w:t xml:space="preserve">Executions</w:t>
-      </w:r>
-      <w:r>
-        <w:rPr>
-          <w:rFonts w:ascii="Helvetica" w:hAnsi="Helvetica" w:cs="Helvetica"/>
-          <w:sz w:val="29"/>
-          <w:sz-cs w:val="29"/>
-          <w:spacing w:val="0"/>
-          <w:color w:val="181E2A"/>
-        </w:rPr>
-        <w:t xml:space="preserve">.</w:t>
-      </w:r>
-    </w:p>
-    <w:p>
-      <w:pPr>
-        <w:ind w:left="720" w:first-line="-720"/>
-        <w:spacing w:after="106"/>
-      </w:pPr>
-      <w:r>
-        <w:rPr>
-          <w:rFonts w:ascii="Helvetica" w:hAnsi="Helvetica" w:cs="Helvetica"/>
-          <w:sz w:val="29"/>
-          <w:sz-cs w:val="29"/>
-          <w:color w:val="181E2A"/>
-        </w:rPr>
-        <w:t xml:space="preserve"/>
-        <w:tab/>
-        <w:t xml:space="preserve">11</w:t>
-        <w:tab/>
-        <w:t xml:space="preserve"/>
-      </w:r>
-      <w:r>
-        <w:rPr>
-          <w:rFonts w:ascii="Helvetica" w:hAnsi="Helvetica" w:cs="Helvetica"/>
-          <w:sz w:val="29"/>
-          <w:sz-cs w:val="29"/>
-          <w:spacing w:val="0"/>
-          <w:color w:val="181E2A"/>
-        </w:rPr>
-        <w:t xml:space="preserve">Vérifier que </w:t>
-      </w:r>
-      <w:r>
-        <w:rPr>
           <w:rFonts w:ascii="Helvetica" w:hAnsi="Helvetica" w:cs="Helvetica"/>
           <w:sz w:val="29"/>
           <w:sz-cs w:val="29"/>
@@ -4041,76 +4031,7 @@
           <w:spacing w:val="0"/>
           <w:color w:val="181E2A"/>
         </w:rPr>
-        <w:t xml:space="preserve"> retourne </w:t>
-      </w:r>
-      <w:r>
-        <w:rPr>
-          <w:rFonts w:ascii="Menlo" w:hAnsi="Menlo" w:cs="Menlo"/>
-          <w:sz w:val="25"/>
-          <w:sz-cs w:val="25"/>
-          <w:spacing w:val="0"/>
-          <w:color w:val="181E2A"/>
-        </w:rPr>
-        <w:t xml:space="preserve">attachments_count = 2</w:t>
-      </w:r>
-      <w:r>
-        <w:rPr>
-          <w:rFonts w:ascii="Helvetica" w:hAnsi="Helvetica" w:cs="Helvetica"/>
-          <w:sz w:val="29"/>
-          <w:sz-cs w:val="29"/>
-          <w:spacing w:val="0"/>
-          <w:color w:val="181E2A"/>
-        </w:rPr>
-        <w:t xml:space="preserve"> et </w:t>
-      </w:r>
-      <w:r>
-        <w:rPr>
-          <w:rFonts w:ascii="Menlo" w:hAnsi="Menlo" w:cs="Menlo"/>
-          <w:sz w:val="25"/>
-          <w:sz-cs w:val="25"/>
-          <w:spacing w:val="0"/>
-          <w:color w:val="181E2A"/>
-        </w:rPr>
-        <w:t xml:space="preserve">can_send = true</w:t>
-      </w:r>
-      <w:r>
-        <w:rPr>
-          <w:rFonts w:ascii="Helvetica" w:hAnsi="Helvetica" w:cs="Helvetica"/>
-          <w:sz w:val="29"/>
-          <w:sz-cs w:val="29"/>
-          <w:spacing w:val="0"/>
-          <w:color w:val="181E2A"/>
-        </w:rPr>
-        <w:t xml:space="preserve">.</w:t>
-      </w:r>
-    </w:p>
-    <w:p>
-      <w:pPr>
-        <w:ind w:left="720" w:first-line="-720"/>
-        <w:spacing w:after="106"/>
-      </w:pPr>
-      <w:r>
-        <w:rPr>
-          <w:rFonts w:ascii="Helvetica" w:hAnsi="Helvetica" w:cs="Helvetica"/>
-          <w:sz w:val="29"/>
-          <w:sz-cs w:val="29"/>
-          <w:color w:val="181E2A"/>
-        </w:rPr>
-        <w:t xml:space="preserve"/>
-        <w:tab/>
-        <w:t xml:space="preserve">12</w:t>
-        <w:tab/>
-        <w:t xml:space="preserve"/>
-      </w:r>
-      <w:r>
-        <w:rPr>
-          <w:rFonts w:ascii="Helvetica" w:hAnsi="Helvetica" w:cs="Helvetica"/>
-          <w:sz w:val="29"/>
-          <w:sz-cs w:val="29"/>
-          <w:spacing w:val="0"/>
-          <w:color w:val="181E2A"/>
-        </w:rPr>
-        <w:t xml:space="preserve">Vérifier la réponse de </w:t>
+        <w:t xml:space="preserve">, </w:t>
       </w:r>
       <w:r>
         <w:rPr>
@@ -4131,7 +4052,7 @@
           <w:spacing w:val="0"/>
           <w:color w:val="181E2A"/>
         </w:rPr>
-        <w:t xml:space="preserve">.</w:t>
+        <w:t xml:space="preserve"> : envoi prospect.</w:t>
       </w:r>
     </w:p>
     <w:p>
@@ -4147,7 +4068,1050 @@
           <w:spacing w:val="0"/>
           <w:color w:val="0F3A6E"/>
         </w:rPr>
-        <w:t xml:space="preserve">7.4 Règles de qualité du deck premium</w:t>
+        <w:t xml:space="preserve">7.3 Chaîne principale de référence</w:t>
+      </w:r>
+    </w:p>
+    <w:p>
+      <w:pPr>
+        <w:spacing w:after="213"/>
+      </w:pPr>
+      <w:r>
+        <w:rPr>
+          <w:rFonts w:ascii="Helvetica" w:hAnsi="Helvetica" w:cs="Helvetica"/>
+          <w:sz w:val="29"/>
+          <w:sz-cs w:val="29"/>
+          <w:spacing w:val="0"/>
+          <w:color w:val="181E2A"/>
+        </w:rPr>
+        <w:t xml:space="preserve">Dans l’export </w:t>
+      </w:r>
+      <w:r>
+        <w:rPr>
+          <w:rFonts w:ascii="Menlo" w:hAnsi="Menlo" w:cs="Menlo"/>
+          <w:sz w:val="25"/>
+          <w:sz-cs w:val="25"/>
+          <w:spacing w:val="0"/>
+          <w:color w:val="181E2A"/>
+        </w:rPr>
+        <w:t xml:space="preserve">FINAL-10</w:t>
+      </w:r>
+      <w:r>
+        <w:rPr>
+          <w:rFonts w:ascii="Helvetica" w:hAnsi="Helvetica" w:cs="Helvetica"/>
+          <w:sz w:val="29"/>
+          <w:sz-cs w:val="29"/>
+          <w:spacing w:val="0"/>
+          <w:color w:val="181E2A"/>
+        </w:rPr>
+        <w:t xml:space="preserve">, la chaîne fonctionnelle à suivre pour la phase 1 deck PPTX est la suivante :</w:t>
+      </w:r>
+    </w:p>
+    <w:p>
+      <w:pPr>
+        <w:spacing w:after="213"/>
+      </w:pPr>
+      <w:r>
+        <w:rPr>
+          <w:rFonts w:ascii="Menlo" w:hAnsi="Menlo" w:cs="Menlo"/>
+          <w:sz w:val="25"/>
+          <w:sz-cs w:val="25"/>
+          <w:spacing w:val="0"/>
+          <w:color w:val="181E2A"/>
+        </w:rPr>
+        <w:t xml:space="preserve">Assemble Prospect Pack -&gt; Resolve Domain Catalogue -&gt; Build Catalogue Render Payload -&gt; render Catalogue Artifact -&gt; Merge Catalogue Artifact -&gt; Build Deck Render Payload -&gt; Render Deck Artifact -&gt; Merge Deck Artifact -&gt; Store Pack In Supabase -&gt; Build Approval Email -&gt; Send Internal Approval Email</w:t>
+      </w:r>
+      <w:r>
+        <w:rPr>
+          <w:rFonts w:ascii="Helvetica" w:hAnsi="Helvetica" w:cs="Helvetica"/>
+          <w:sz w:val="29"/>
+          <w:sz-cs w:val="29"/>
+          <w:spacing w:val="0"/>
+          <w:color w:val="181E2A"/>
+        </w:rPr>
+        <w:t xml:space="preserve"/>
+      </w:r>
+    </w:p>
+    <w:p>
+      <w:pPr>
+        <w:spacing w:after="213"/>
+      </w:pPr>
+      <w:r>
+        <w:rPr>
+          <w:rFonts w:ascii="Helvetica" w:hAnsi="Helvetica" w:cs="Helvetica"/>
+          <w:sz w:val="25"/>
+          <w:sz-cs w:val="25"/>
+          <w:spacing w:val="0"/>
+          <w:color w:val="3B4350"/>
+        </w:rPr>
+        <w:t xml:space="preserve">Le nœud </w:t>
+      </w:r>
+      <w:r>
+        <w:rPr>
+          <w:rFonts w:ascii="Menlo" w:hAnsi="Menlo" w:cs="Menlo"/>
+          <w:sz w:val="25"/>
+          <w:sz-cs w:val="25"/>
+          <w:spacing w:val="0"/>
+          <w:color w:val="3B4350"/>
+        </w:rPr>
+        <w:t xml:space="preserve">Resolve Domain Catalogue</w:t>
+      </w:r>
+      <w:r>
+        <w:rPr>
+          <w:rFonts w:ascii="Helvetica" w:hAnsi="Helvetica" w:cs="Helvetica"/>
+          <w:sz w:val="25"/>
+          <w:sz-cs w:val="25"/>
+          <w:spacing w:val="0"/>
+          <w:color w:val="3B4350"/>
+        </w:rPr>
+        <w:t xml:space="preserve"> reste en amont dans le workflow exporté. En revanche, la source finale d’attachments utilisée pour l’envoi prospect doit bien venir de </w:t>
+      </w:r>
+      <w:r>
+        <w:rPr>
+          <w:rFonts w:ascii="Menlo" w:hAnsi="Menlo" w:cs="Menlo"/>
+          <w:sz w:val="25"/>
+          <w:sz-cs w:val="25"/>
+          <w:spacing w:val="0"/>
+          <w:color w:val="3B4350"/>
+        </w:rPr>
+        <w:t xml:space="preserve">Merge Deck Artifact</w:t>
+      </w:r>
+      <w:r>
+        <w:rPr>
+          <w:rFonts w:ascii="Helvetica" w:hAnsi="Helvetica" w:cs="Helvetica"/>
+          <w:sz w:val="25"/>
+          <w:sz-cs w:val="25"/>
+          <w:spacing w:val="0"/>
+          <w:color w:val="3B4350"/>
+        </w:rPr>
+        <w:t xml:space="preserve">, et non de l’ancienne paire </w:t>
+      </w:r>
+      <w:r>
+        <w:rPr>
+          <w:rFonts w:ascii="Menlo" w:hAnsi="Menlo" w:cs="Menlo"/>
+          <w:sz w:val="25"/>
+          <w:sz-cs w:val="25"/>
+          <w:spacing w:val="0"/>
+          <w:color w:val="3B4350"/>
+        </w:rPr>
+        <w:t xml:space="preserve">Download Catalogue PDF</w:t>
+      </w:r>
+      <w:r>
+        <w:rPr>
+          <w:rFonts w:ascii="Helvetica" w:hAnsi="Helvetica" w:cs="Helvetica"/>
+          <w:sz w:val="25"/>
+          <w:sz-cs w:val="25"/>
+          <w:spacing w:val="0"/>
+          <w:color w:val="3B4350"/>
+        </w:rPr>
+        <w:t xml:space="preserve"> / </w:t>
+      </w:r>
+      <w:r>
+        <w:rPr>
+          <w:rFonts w:ascii="Menlo" w:hAnsi="Menlo" w:cs="Menlo"/>
+          <w:sz w:val="25"/>
+          <w:sz-cs w:val="25"/>
+          <w:spacing w:val="0"/>
+          <w:color w:val="3B4350"/>
+        </w:rPr>
+        <w:t xml:space="preserve">Assemble Mail Attachments</w:t>
+      </w:r>
+      <w:r>
+        <w:rPr>
+          <w:rFonts w:ascii="Helvetica" w:hAnsi="Helvetica" w:cs="Helvetica"/>
+          <w:sz w:val="25"/>
+          <w:sz-cs w:val="25"/>
+          <w:spacing w:val="0"/>
+          <w:color w:val="3B4350"/>
+        </w:rPr>
+        <w:t xml:space="preserve">.</w:t>
+      </w:r>
+    </w:p>
+    <w:p>
+      <w:pPr>
+        <w:spacing w:after="160"/>
+      </w:pPr>
+      <w:r>
+        <w:rPr>
+          <w:rFonts w:ascii="Helvetica" w:hAnsi="Helvetica" w:cs="Helvetica"/>
+          <w:sz w:val="32"/>
+          <w:sz-cs w:val="32"/>
+          <w:b/>
+          <w:spacing w:val="0"/>
+          <w:color w:val="0F3A6E"/>
+        </w:rPr>
+        <w:t xml:space="preserve">7.4 Procédure normale d’utilisation</w:t>
+      </w:r>
+    </w:p>
+    <w:p>
+      <w:pPr>
+        <w:ind w:left="720" w:first-line="-720"/>
+        <w:spacing w:after="106"/>
+      </w:pPr>
+      <w:r>
+        <w:rPr>
+          <w:rFonts w:ascii="Helvetica" w:hAnsi="Helvetica" w:cs="Helvetica"/>
+          <w:sz w:val="29"/>
+          <w:sz-cs w:val="29"/>
+          <w:color w:val="181E2A"/>
+        </w:rPr>
+        <w:t xml:space="preserve"/>
+        <w:tab/>
+        <w:t xml:space="preserve">1</w:t>
+        <w:tab/>
+        <w:t xml:space="preserve"/>
+      </w:r>
+      <w:r>
+        <w:rPr>
+          <w:rFonts w:ascii="Helvetica" w:hAnsi="Helvetica" w:cs="Helvetica"/>
+          <w:sz w:val="29"/>
+          <w:sz-cs w:val="29"/>
+          <w:spacing w:val="0"/>
+          <w:color w:val="181E2A"/>
+        </w:rPr>
+        <w:t xml:space="preserve">Vérifier le prospect cible dans </w:t>
+      </w:r>
+      <w:r>
+        <w:rPr>
+          <w:rFonts w:ascii="Helvetica" w:hAnsi="Helvetica" w:cs="Helvetica"/>
+          <w:sz w:val="29"/>
+          <w:sz-cs w:val="29"/>
+          <w:b/>
+          <w:spacing w:val="0"/>
+          <w:color w:val="181E2A"/>
+        </w:rPr>
+        <w:t xml:space="preserve">Set Target</w:t>
+      </w:r>
+      <w:r>
+        <w:rPr>
+          <w:rFonts w:ascii="Helvetica" w:hAnsi="Helvetica" w:cs="Helvetica"/>
+          <w:sz w:val="29"/>
+          <w:sz-cs w:val="29"/>
+          <w:spacing w:val="0"/>
+          <w:color w:val="181E2A"/>
+        </w:rPr>
+        <w:t xml:space="preserve"> ou dans sa source CRM.</w:t>
+      </w:r>
+    </w:p>
+    <w:p>
+      <w:pPr>
+        <w:ind w:left="720" w:first-line="-720"/>
+        <w:spacing w:after="106"/>
+      </w:pPr>
+      <w:r>
+        <w:rPr>
+          <w:rFonts w:ascii="Helvetica" w:hAnsi="Helvetica" w:cs="Helvetica"/>
+          <w:sz w:val="29"/>
+          <w:sz-cs w:val="29"/>
+          <w:color w:val="181E2A"/>
+        </w:rPr>
+        <w:t xml:space="preserve"/>
+        <w:tab/>
+        <w:t xml:space="preserve">2</w:t>
+        <w:tab/>
+        <w:t xml:space="preserve"/>
+      </w:r>
+      <w:r>
+        <w:rPr>
+          <w:rFonts w:ascii="Helvetica" w:hAnsi="Helvetica" w:cs="Helvetica"/>
+          <w:sz w:val="29"/>
+          <w:sz-cs w:val="29"/>
+          <w:spacing w:val="0"/>
+          <w:color w:val="181E2A"/>
+        </w:rPr>
+        <w:t xml:space="preserve">Lancer le workflow de génération.</w:t>
+      </w:r>
+    </w:p>
+    <w:p>
+      <w:pPr>
+        <w:ind w:left="720" w:first-line="-720"/>
+        <w:spacing w:after="106"/>
+      </w:pPr>
+      <w:r>
+        <w:rPr>
+          <w:rFonts w:ascii="Helvetica" w:hAnsi="Helvetica" w:cs="Helvetica"/>
+          <w:sz w:val="29"/>
+          <w:sz-cs w:val="29"/>
+          <w:color w:val="181E2A"/>
+        </w:rPr>
+        <w:t xml:space="preserve"/>
+        <w:tab/>
+        <w:t xml:space="preserve">3</w:t>
+        <w:tab/>
+        <w:t xml:space="preserve"/>
+      </w:r>
+      <w:r>
+        <w:rPr>
+          <w:rFonts w:ascii="Helvetica" w:hAnsi="Helvetica" w:cs="Helvetica"/>
+          <w:sz w:val="29"/>
+          <w:sz-cs w:val="29"/>
+          <w:spacing w:val="0"/>
+          <w:color w:val="181E2A"/>
+        </w:rPr>
+        <w:t xml:space="preserve">Vérifier que </w:t>
+      </w:r>
+      <w:r>
+        <w:rPr>
+          <w:rFonts w:ascii="Helvetica" w:hAnsi="Helvetica" w:cs="Helvetica"/>
+          <w:sz w:val="29"/>
+          <w:sz-cs w:val="29"/>
+          <w:b/>
+          <w:spacing w:val="0"/>
+          <w:color w:val="181E2A"/>
+        </w:rPr>
+        <w:t xml:space="preserve">render Catalogue Artifact</w:t>
+      </w:r>
+      <w:r>
+        <w:rPr>
+          <w:rFonts w:ascii="Helvetica" w:hAnsi="Helvetica" w:cs="Helvetica"/>
+          <w:sz w:val="29"/>
+          <w:sz-cs w:val="29"/>
+          <w:spacing w:val="0"/>
+          <w:color w:val="181E2A"/>
+        </w:rPr>
+        <w:t xml:space="preserve"> retourne </w:t>
+      </w:r>
+      <w:r>
+        <w:rPr>
+          <w:rFonts w:ascii="Menlo" w:hAnsi="Menlo" w:cs="Menlo"/>
+          <w:sz w:val="25"/>
+          <w:sz-cs w:val="25"/>
+          <w:spacing w:val="0"/>
+          <w:color w:val="181E2A"/>
+        </w:rPr>
+        <w:t xml:space="preserve">success = true</w:t>
+      </w:r>
+      <w:r>
+        <w:rPr>
+          <w:rFonts w:ascii="Helvetica" w:hAnsi="Helvetica" w:cs="Helvetica"/>
+          <w:sz w:val="29"/>
+          <w:sz-cs w:val="29"/>
+          <w:spacing w:val="0"/>
+          <w:color w:val="181E2A"/>
+        </w:rPr>
+        <w:t xml:space="preserve"> et </w:t>
+      </w:r>
+      <w:r>
+        <w:rPr>
+          <w:rFonts w:ascii="Menlo" w:hAnsi="Menlo" w:cs="Menlo"/>
+          <w:sz w:val="25"/>
+          <w:sz-cs w:val="25"/>
+          <w:spacing w:val="0"/>
+          <w:color w:val="181E2A"/>
+        </w:rPr>
+        <w:t xml:space="preserve">used_tailored_markdown = true</w:t>
+      </w:r>
+      <w:r>
+        <w:rPr>
+          <w:rFonts w:ascii="Helvetica" w:hAnsi="Helvetica" w:cs="Helvetica"/>
+          <w:sz w:val="29"/>
+          <w:sz-cs w:val="29"/>
+          <w:spacing w:val="0"/>
+          <w:color w:val="181E2A"/>
+        </w:rPr>
+        <w:t xml:space="preserve">.</w:t>
+      </w:r>
+    </w:p>
+    <w:p>
+      <w:pPr>
+        <w:ind w:left="720" w:first-line="-720"/>
+        <w:spacing w:after="106"/>
+      </w:pPr>
+      <w:r>
+        <w:rPr>
+          <w:rFonts w:ascii="Helvetica" w:hAnsi="Helvetica" w:cs="Helvetica"/>
+          <w:sz w:val="29"/>
+          <w:sz-cs w:val="29"/>
+          <w:color w:val="181E2A"/>
+        </w:rPr>
+        <w:t xml:space="preserve"/>
+        <w:tab/>
+        <w:t xml:space="preserve">4</w:t>
+        <w:tab/>
+        <w:t xml:space="preserve"/>
+      </w:r>
+      <w:r>
+        <w:rPr>
+          <w:rFonts w:ascii="Helvetica" w:hAnsi="Helvetica" w:cs="Helvetica"/>
+          <w:sz w:val="29"/>
+          <w:sz-cs w:val="29"/>
+          <w:spacing w:val="0"/>
+          <w:color w:val="181E2A"/>
+        </w:rPr>
+        <w:t xml:space="preserve">Vérifier que </w:t>
+      </w:r>
+      <w:r>
+        <w:rPr>
+          <w:rFonts w:ascii="Helvetica" w:hAnsi="Helvetica" w:cs="Helvetica"/>
+          <w:sz w:val="29"/>
+          <w:sz-cs w:val="29"/>
+          <w:b/>
+          <w:spacing w:val="0"/>
+          <w:color w:val="181E2A"/>
+        </w:rPr>
+        <w:t xml:space="preserve">Render Deck Artifact</w:t>
+      </w:r>
+      <w:r>
+        <w:rPr>
+          <w:rFonts w:ascii="Helvetica" w:hAnsi="Helvetica" w:cs="Helvetica"/>
+          <w:sz w:val="29"/>
+          <w:sz-cs w:val="29"/>
+          <w:spacing w:val="0"/>
+          <w:color w:val="181E2A"/>
+        </w:rPr>
+        <w:t xml:space="preserve"> retourne </w:t>
+      </w:r>
+      <w:r>
+        <w:rPr>
+          <w:rFonts w:ascii="Menlo" w:hAnsi="Menlo" w:cs="Menlo"/>
+          <w:sz w:val="25"/>
+          <w:sz-cs w:val="25"/>
+          <w:spacing w:val="0"/>
+          <w:color w:val="181E2A"/>
+        </w:rPr>
+        <w:t xml:space="preserve">success = true</w:t>
+      </w:r>
+      <w:r>
+        <w:rPr>
+          <w:rFonts w:ascii="Helvetica" w:hAnsi="Helvetica" w:cs="Helvetica"/>
+          <w:sz w:val="29"/>
+          <w:sz-cs w:val="29"/>
+          <w:spacing w:val="0"/>
+          <w:color w:val="181E2A"/>
+        </w:rPr>
+        <w:t xml:space="preserve"> avec un </w:t>
+      </w:r>
+      <w:r>
+        <w:rPr>
+          <w:rFonts w:ascii="Menlo" w:hAnsi="Menlo" w:cs="Menlo"/>
+          <w:sz w:val="25"/>
+          <w:sz-cs w:val="25"/>
+          <w:spacing w:val="0"/>
+          <w:color w:val="181E2A"/>
+        </w:rPr>
+        <w:t xml:space="preserve">deck_artifact</w:t>
+      </w:r>
+      <w:r>
+        <w:rPr>
+          <w:rFonts w:ascii="Helvetica" w:hAnsi="Helvetica" w:cs="Helvetica"/>
+          <w:sz w:val="29"/>
+          <w:sz-cs w:val="29"/>
+          <w:spacing w:val="0"/>
+          <w:color w:val="181E2A"/>
+        </w:rPr>
+        <w:t xml:space="preserve"> contenant </w:t>
+      </w:r>
+      <w:r>
+        <w:rPr>
+          <w:rFonts w:ascii="Menlo" w:hAnsi="Menlo" w:cs="Menlo"/>
+          <w:sz w:val="25"/>
+          <w:sz-cs w:val="25"/>
+          <w:spacing w:val="0"/>
+          <w:color w:val="181E2A"/>
+        </w:rPr>
+        <w:t xml:space="preserve">filename_pptx</w:t>
+      </w:r>
+      <w:r>
+        <w:rPr>
+          <w:rFonts w:ascii="Helvetica" w:hAnsi="Helvetica" w:cs="Helvetica"/>
+          <w:sz w:val="29"/>
+          <w:sz-cs w:val="29"/>
+          <w:spacing w:val="0"/>
+          <w:color w:val="181E2A"/>
+        </w:rPr>
+        <w:t xml:space="preserve"> et </w:t>
+      </w:r>
+      <w:r>
+        <w:rPr>
+          <w:rFonts w:ascii="Menlo" w:hAnsi="Menlo" w:cs="Menlo"/>
+          <w:sz w:val="25"/>
+          <w:sz-cs w:val="25"/>
+          <w:spacing w:val="0"/>
+          <w:color w:val="181E2A"/>
+        </w:rPr>
+        <w:t xml:space="preserve">pptx_url</w:t>
+      </w:r>
+      <w:r>
+        <w:rPr>
+          <w:rFonts w:ascii="Helvetica" w:hAnsi="Helvetica" w:cs="Helvetica"/>
+          <w:sz w:val="29"/>
+          <w:sz-cs w:val="29"/>
+          <w:spacing w:val="0"/>
+          <w:color w:val="181E2A"/>
+        </w:rPr>
+        <w:t xml:space="preserve">.</w:t>
+      </w:r>
+    </w:p>
+    <w:p>
+      <w:pPr>
+        <w:ind w:left="720" w:first-line="-720"/>
+        <w:spacing w:after="106"/>
+      </w:pPr>
+      <w:r>
+        <w:rPr>
+          <w:rFonts w:ascii="Helvetica" w:hAnsi="Helvetica" w:cs="Helvetica"/>
+          <w:sz w:val="29"/>
+          <w:sz-cs w:val="29"/>
+          <w:color w:val="181E2A"/>
+        </w:rPr>
+        <w:t xml:space="preserve"/>
+        <w:tab/>
+        <w:t xml:space="preserve">5</w:t>
+        <w:tab/>
+        <w:t xml:space="preserve"/>
+      </w:r>
+      <w:r>
+        <w:rPr>
+          <w:rFonts w:ascii="Helvetica" w:hAnsi="Helvetica" w:cs="Helvetica"/>
+          <w:sz w:val="29"/>
+          <w:sz-cs w:val="29"/>
+          <w:spacing w:val="0"/>
+          <w:color w:val="181E2A"/>
+        </w:rPr>
+        <w:t xml:space="preserve">Vérifier dans les diagnostics du deck que la variante, la langue et le nombre de slides de cas d’usage sont cohérents avec le prospect. Le rendu cible doit rester dans une fourchette de 8 à 10 slides selon la densité du contenu.</w:t>
+      </w:r>
+    </w:p>
+    <w:p>
+      <w:pPr>
+        <w:ind w:left="720" w:first-line="-720"/>
+        <w:spacing w:after="106"/>
+      </w:pPr>
+      <w:r>
+        <w:rPr>
+          <w:rFonts w:ascii="Helvetica" w:hAnsi="Helvetica" w:cs="Helvetica"/>
+          <w:sz w:val="29"/>
+          <w:sz-cs w:val="29"/>
+          <w:color w:val="181E2A"/>
+        </w:rPr>
+        <w:t xml:space="preserve"/>
+        <w:tab/>
+        <w:t xml:space="preserve">6</w:t>
+        <w:tab/>
+        <w:t xml:space="preserve"/>
+      </w:r>
+      <w:r>
+        <w:rPr>
+          <w:rFonts w:ascii="Helvetica" w:hAnsi="Helvetica" w:cs="Helvetica"/>
+          <w:sz w:val="29"/>
+          <w:sz-cs w:val="29"/>
+          <w:spacing w:val="0"/>
+          <w:color w:val="181E2A"/>
+        </w:rPr>
+        <w:t xml:space="preserve">Vérifier dans </w:t>
+      </w:r>
+      <w:r>
+        <w:rPr>
+          <w:rFonts w:ascii="Helvetica" w:hAnsi="Helvetica" w:cs="Helvetica"/>
+          <w:sz w:val="29"/>
+          <w:sz-cs w:val="29"/>
+          <w:b/>
+          <w:spacing w:val="0"/>
+          <w:color w:val="181E2A"/>
+        </w:rPr>
+        <w:t xml:space="preserve">Merge Deck Artifact</w:t>
+      </w:r>
+      <w:r>
+        <w:rPr>
+          <w:rFonts w:ascii="Helvetica" w:hAnsi="Helvetica" w:cs="Helvetica"/>
+          <w:sz w:val="29"/>
+          <w:sz-cs w:val="29"/>
+          <w:spacing w:val="0"/>
+          <w:color w:val="181E2A"/>
+        </w:rPr>
+        <w:t xml:space="preserve"> que </w:t>
+      </w:r>
+      <w:r>
+        <w:rPr>
+          <w:rFonts w:ascii="Menlo" w:hAnsi="Menlo" w:cs="Menlo"/>
+          <w:sz w:val="25"/>
+          <w:sz-cs w:val="25"/>
+          <w:spacing w:val="0"/>
+          <w:color w:val="181E2A"/>
+        </w:rPr>
+        <w:t xml:space="preserve">mail_attachments</w:t>
+      </w:r>
+      <w:r>
+        <w:rPr>
+          <w:rFonts w:ascii="Helvetica" w:hAnsi="Helvetica" w:cs="Helvetica"/>
+          <w:sz w:val="29"/>
+          <w:sz-cs w:val="29"/>
+          <w:spacing w:val="0"/>
+          <w:color w:val="181E2A"/>
+        </w:rPr>
+        <w:t xml:space="preserve"> contient exactement deux fichiers : un </w:t>
+      </w:r>
+      <w:r>
+        <w:rPr>
+          <w:rFonts w:ascii="Menlo" w:hAnsi="Menlo" w:cs="Menlo"/>
+          <w:sz w:val="25"/>
+          <w:sz-cs w:val="25"/>
+          <w:spacing w:val="0"/>
+          <w:color w:val="181E2A"/>
+        </w:rPr>
+        <w:t xml:space="preserve">.pdf</w:t>
+      </w:r>
+      <w:r>
+        <w:rPr>
+          <w:rFonts w:ascii="Helvetica" w:hAnsi="Helvetica" w:cs="Helvetica"/>
+          <w:sz w:val="29"/>
+          <w:sz-cs w:val="29"/>
+          <w:spacing w:val="0"/>
+          <w:color w:val="181E2A"/>
+        </w:rPr>
+        <w:t xml:space="preserve"> et un </w:t>
+      </w:r>
+      <w:r>
+        <w:rPr>
+          <w:rFonts w:ascii="Menlo" w:hAnsi="Menlo" w:cs="Menlo"/>
+          <w:sz w:val="25"/>
+          <w:sz-cs w:val="25"/>
+          <w:spacing w:val="0"/>
+          <w:color w:val="181E2A"/>
+        </w:rPr>
+        <w:t xml:space="preserve">.pptx</w:t>
+      </w:r>
+      <w:r>
+        <w:rPr>
+          <w:rFonts w:ascii="Helvetica" w:hAnsi="Helvetica" w:cs="Helvetica"/>
+          <w:sz w:val="29"/>
+          <w:sz-cs w:val="29"/>
+          <w:spacing w:val="0"/>
+          <w:color w:val="181E2A"/>
+        </w:rPr>
+        <w:t xml:space="preserve">.</w:t>
+      </w:r>
+    </w:p>
+    <w:p>
+      <w:pPr>
+        <w:ind w:left="720" w:first-line="-720"/>
+        <w:spacing w:after="106"/>
+      </w:pPr>
+      <w:r>
+        <w:rPr>
+          <w:rFonts w:ascii="Helvetica" w:hAnsi="Helvetica" w:cs="Helvetica"/>
+          <w:sz w:val="29"/>
+          <w:sz-cs w:val="29"/>
+          <w:color w:val="181E2A"/>
+        </w:rPr>
+        <w:t xml:space="preserve"/>
+        <w:tab/>
+        <w:t xml:space="preserve">7</w:t>
+        <w:tab/>
+        <w:t xml:space="preserve"/>
+      </w:r>
+      <w:r>
+        <w:rPr>
+          <w:rFonts w:ascii="Helvetica" w:hAnsi="Helvetica" w:cs="Helvetica"/>
+          <w:sz w:val="29"/>
+          <w:sz-cs w:val="29"/>
+          <w:spacing w:val="0"/>
+          <w:color w:val="181E2A"/>
+        </w:rPr>
+        <w:t xml:space="preserve">Vérifier que </w:t>
+      </w:r>
+      <w:r>
+        <w:rPr>
+          <w:rFonts w:ascii="Helvetica" w:hAnsi="Helvetica" w:cs="Helvetica"/>
+          <w:sz w:val="29"/>
+          <w:sz-cs w:val="29"/>
+          <w:b/>
+          <w:spacing w:val="0"/>
+          <w:color w:val="181E2A"/>
+        </w:rPr>
+        <w:t xml:space="preserve">Store Pack In Supabase</w:t>
+      </w:r>
+      <w:r>
+        <w:rPr>
+          <w:rFonts w:ascii="Helvetica" w:hAnsi="Helvetica" w:cs="Helvetica"/>
+          <w:sz w:val="29"/>
+          <w:sz-cs w:val="29"/>
+          <w:spacing w:val="0"/>
+          <w:color w:val="181E2A"/>
+        </w:rPr>
+        <w:t xml:space="preserve"> stocke bien </w:t>
+      </w:r>
+      <w:r>
+        <w:rPr>
+          <w:rFonts w:ascii="Menlo" w:hAnsi="Menlo" w:cs="Menlo"/>
+          <w:sz w:val="25"/>
+          <w:sz-cs w:val="25"/>
+          <w:spacing w:val="0"/>
+          <w:color w:val="181E2A"/>
+        </w:rPr>
+        <w:t xml:space="preserve">catalogue_artifact</w:t>
+      </w:r>
+      <w:r>
+        <w:rPr>
+          <w:rFonts w:ascii="Helvetica" w:hAnsi="Helvetica" w:cs="Helvetica"/>
+          <w:sz w:val="29"/>
+          <w:sz-cs w:val="29"/>
+          <w:spacing w:val="0"/>
+          <w:color w:val="181E2A"/>
+        </w:rPr>
+        <w:t xml:space="preserve">, </w:t>
+      </w:r>
+      <w:r>
+        <w:rPr>
+          <w:rFonts w:ascii="Menlo" w:hAnsi="Menlo" w:cs="Menlo"/>
+          <w:sz w:val="25"/>
+          <w:sz-cs w:val="25"/>
+          <w:spacing w:val="0"/>
+          <w:color w:val="181E2A"/>
+        </w:rPr>
+        <w:t xml:space="preserve">deck_artifact</w:t>
+      </w:r>
+      <w:r>
+        <w:rPr>
+          <w:rFonts w:ascii="Helvetica" w:hAnsi="Helvetica" w:cs="Helvetica"/>
+          <w:sz w:val="29"/>
+          <w:sz-cs w:val="29"/>
+          <w:spacing w:val="0"/>
+          <w:color w:val="181E2A"/>
+        </w:rPr>
+        <w:t xml:space="preserve">, </w:t>
+      </w:r>
+      <w:r>
+        <w:rPr>
+          <w:rFonts w:ascii="Menlo" w:hAnsi="Menlo" w:cs="Menlo"/>
+          <w:sz w:val="25"/>
+          <w:sz-cs w:val="25"/>
+          <w:spacing w:val="0"/>
+          <w:color w:val="181E2A"/>
+        </w:rPr>
+        <w:t xml:space="preserve">mail_attachments</w:t>
+      </w:r>
+      <w:r>
+        <w:rPr>
+          <w:rFonts w:ascii="Helvetica" w:hAnsi="Helvetica" w:cs="Helvetica"/>
+          <w:sz w:val="29"/>
+          <w:sz-cs w:val="29"/>
+          <w:spacing w:val="0"/>
+          <w:color w:val="181E2A"/>
+        </w:rPr>
+        <w:t xml:space="preserve"> et </w:t>
+      </w:r>
+      <w:r>
+        <w:rPr>
+          <w:rFonts w:ascii="Menlo" w:hAnsi="Menlo" w:cs="Menlo"/>
+          <w:sz w:val="25"/>
+          <w:sz-cs w:val="25"/>
+          <w:spacing w:val="0"/>
+          <w:color w:val="181E2A"/>
+        </w:rPr>
+        <w:t xml:space="preserve">attachments_count = 2</w:t>
+      </w:r>
+      <w:r>
+        <w:rPr>
+          <w:rFonts w:ascii="Helvetica" w:hAnsi="Helvetica" w:cs="Helvetica"/>
+          <w:sz w:val="29"/>
+          <w:sz-cs w:val="29"/>
+          <w:spacing w:val="0"/>
+          <w:color w:val="181E2A"/>
+        </w:rPr>
+        <w:t xml:space="preserve">.</w:t>
+      </w:r>
+    </w:p>
+    <w:p>
+      <w:pPr>
+        <w:ind w:left="720" w:first-line="-720"/>
+        <w:spacing w:after="106"/>
+      </w:pPr>
+      <w:r>
+        <w:rPr>
+          <w:rFonts w:ascii="Helvetica" w:hAnsi="Helvetica" w:cs="Helvetica"/>
+          <w:sz w:val="29"/>
+          <w:sz-cs w:val="29"/>
+          <w:color w:val="181E2A"/>
+        </w:rPr>
+        <w:t xml:space="preserve"/>
+        <w:tab/>
+        <w:t xml:space="preserve">8</w:t>
+        <w:tab/>
+        <w:t xml:space="preserve"/>
+      </w:r>
+      <w:r>
+        <w:rPr>
+          <w:rFonts w:ascii="Helvetica" w:hAnsi="Helvetica" w:cs="Helvetica"/>
+          <w:sz w:val="29"/>
+          <w:sz-cs w:val="29"/>
+          <w:spacing w:val="0"/>
+          <w:color w:val="181E2A"/>
+        </w:rPr>
+        <w:t xml:space="preserve">Recevoir et relire l’email interne de validation. Dans l’export actuel, la ligne visible peut encore s’afficher sous la forme </w:t>
+      </w:r>
+      <w:r>
+        <w:rPr>
+          <w:rFonts w:ascii="Menlo" w:hAnsi="Menlo" w:cs="Menlo"/>
+          <w:sz w:val="25"/>
+          <w:sz-cs w:val="25"/>
+          <w:spacing w:val="0"/>
+          <w:color w:val="181E2A"/>
+        </w:rPr>
+        <w:t xml:space="preserve">Pieces jointes preparees</w:t>
+      </w:r>
+      <w:r>
+        <w:rPr>
+          <w:rFonts w:ascii="Helvetica" w:hAnsi="Helvetica" w:cs="Helvetica"/>
+          <w:sz w:val="29"/>
+          <w:sz-cs w:val="29"/>
+          <w:spacing w:val="0"/>
+          <w:color w:val="181E2A"/>
+        </w:rPr>
+        <w:t xml:space="preserve"> sans accents. La valeur attendue reste néanmoins </w:t>
+      </w:r>
+      <w:r>
+        <w:rPr>
+          <w:rFonts w:ascii="Menlo" w:hAnsi="Menlo" w:cs="Menlo"/>
+          <w:sz w:val="25"/>
+          <w:sz-cs w:val="25"/>
+          <w:spacing w:val="0"/>
+          <w:color w:val="181E2A"/>
+        </w:rPr>
+        <w:t xml:space="preserve">2</w:t>
+      </w:r>
+      <w:r>
+        <w:rPr>
+          <w:rFonts w:ascii="Helvetica" w:hAnsi="Helvetica" w:cs="Helvetica"/>
+          <w:sz w:val="29"/>
+          <w:sz-cs w:val="29"/>
+          <w:spacing w:val="0"/>
+          <w:color w:val="181E2A"/>
+        </w:rPr>
+        <w:t xml:space="preserve">.</w:t>
+      </w:r>
+    </w:p>
+    <w:p>
+      <w:pPr>
+        <w:ind w:left="720" w:first-line="-720"/>
+        <w:spacing w:after="106"/>
+      </w:pPr>
+      <w:r>
+        <w:rPr>
+          <w:rFonts w:ascii="Helvetica" w:hAnsi="Helvetica" w:cs="Helvetica"/>
+          <w:sz w:val="29"/>
+          <w:sz-cs w:val="29"/>
+          <w:color w:val="181E2A"/>
+        </w:rPr>
+        <w:t xml:space="preserve"/>
+        <w:tab/>
+        <w:t xml:space="preserve">9</w:t>
+        <w:tab/>
+        <w:t xml:space="preserve"/>
+      </w:r>
+      <w:r>
+        <w:rPr>
+          <w:rFonts w:ascii="Helvetica" w:hAnsi="Helvetica" w:cs="Helvetica"/>
+          <w:sz w:val="29"/>
+          <w:sz-cs w:val="29"/>
+          <w:spacing w:val="0"/>
+          <w:color w:val="181E2A"/>
+        </w:rPr>
+        <w:t xml:space="preserve">Approuver uniquement le dernier email reçu.</w:t>
+      </w:r>
+    </w:p>
+    <w:p>
+      <w:pPr>
+        <w:ind w:left="720" w:first-line="-720"/>
+        <w:spacing w:after="106"/>
+      </w:pPr>
+      <w:r>
+        <w:rPr>
+          <w:rFonts w:ascii="Helvetica" w:hAnsi="Helvetica" w:cs="Helvetica"/>
+          <w:sz w:val="29"/>
+          <w:sz-cs w:val="29"/>
+          <w:color w:val="181E2A"/>
+        </w:rPr>
+        <w:t xml:space="preserve"/>
+        <w:tab/>
+        <w:t xml:space="preserve">10</w:t>
+        <w:tab/>
+        <w:t xml:space="preserve"/>
+      </w:r>
+      <w:r>
+        <w:rPr>
+          <w:rFonts w:ascii="Helvetica" w:hAnsi="Helvetica" w:cs="Helvetica"/>
+          <w:sz w:val="29"/>
+          <w:sz-cs w:val="29"/>
+          <w:spacing w:val="0"/>
+          <w:color w:val="181E2A"/>
+        </w:rPr>
+        <w:t xml:space="preserve">Vérifier la nouvelle exécution webhook dans </w:t>
+      </w:r>
+      <w:r>
+        <w:rPr>
+          <w:rFonts w:ascii="Helvetica" w:hAnsi="Helvetica" w:cs="Helvetica"/>
+          <w:sz w:val="29"/>
+          <w:sz-cs w:val="29"/>
+          <w:b/>
+          <w:spacing w:val="0"/>
+          <w:color w:val="181E2A"/>
+        </w:rPr>
+        <w:t xml:space="preserve">Executions</w:t>
+      </w:r>
+      <w:r>
+        <w:rPr>
+          <w:rFonts w:ascii="Helvetica" w:hAnsi="Helvetica" w:cs="Helvetica"/>
+          <w:sz w:val="29"/>
+          <w:sz-cs w:val="29"/>
+          <w:spacing w:val="0"/>
+          <w:color w:val="181E2A"/>
+        </w:rPr>
+        <w:t xml:space="preserve">.</w:t>
+      </w:r>
+    </w:p>
+    <w:p>
+      <w:pPr>
+        <w:ind w:left="720" w:first-line="-720"/>
+        <w:spacing w:after="106"/>
+      </w:pPr>
+      <w:r>
+        <w:rPr>
+          <w:rFonts w:ascii="Helvetica" w:hAnsi="Helvetica" w:cs="Helvetica"/>
+          <w:sz w:val="29"/>
+          <w:sz-cs w:val="29"/>
+          <w:color w:val="181E2A"/>
+        </w:rPr>
+        <w:t xml:space="preserve"/>
+        <w:tab/>
+        <w:t xml:space="preserve">11</w:t>
+        <w:tab/>
+        <w:t xml:space="preserve"/>
+      </w:r>
+      <w:r>
+        <w:rPr>
+          <w:rFonts w:ascii="Helvetica" w:hAnsi="Helvetica" w:cs="Helvetica"/>
+          <w:sz w:val="29"/>
+          <w:sz-cs w:val="29"/>
+          <w:spacing w:val="0"/>
+          <w:color w:val="181E2A"/>
+        </w:rPr>
+        <w:t xml:space="preserve">Vérifier que </w:t>
+      </w:r>
+      <w:r>
+        <w:rPr>
+          <w:rFonts w:ascii="Helvetica" w:hAnsi="Helvetica" w:cs="Helvetica"/>
+          <w:sz w:val="29"/>
+          <w:sz-cs w:val="29"/>
+          <w:b/>
+          <w:spacing w:val="0"/>
+          <w:color w:val="181E2A"/>
+        </w:rPr>
+        <w:t xml:space="preserve">Build Send Context</w:t>
+      </w:r>
+      <w:r>
+        <w:rPr>
+          <w:rFonts w:ascii="Helvetica" w:hAnsi="Helvetica" w:cs="Helvetica"/>
+          <w:sz w:val="29"/>
+          <w:sz-cs w:val="29"/>
+          <w:spacing w:val="0"/>
+          <w:color w:val="181E2A"/>
+        </w:rPr>
+        <w:t xml:space="preserve"> retourne </w:t>
+      </w:r>
+      <w:r>
+        <w:rPr>
+          <w:rFonts w:ascii="Menlo" w:hAnsi="Menlo" w:cs="Menlo"/>
+          <w:sz w:val="25"/>
+          <w:sz-cs w:val="25"/>
+          <w:spacing w:val="0"/>
+          <w:color w:val="181E2A"/>
+        </w:rPr>
+        <w:t xml:space="preserve">attachments_count = 2</w:t>
+      </w:r>
+      <w:r>
+        <w:rPr>
+          <w:rFonts w:ascii="Helvetica" w:hAnsi="Helvetica" w:cs="Helvetica"/>
+          <w:sz w:val="29"/>
+          <w:sz-cs w:val="29"/>
+          <w:spacing w:val="0"/>
+          <w:color w:val="181E2A"/>
+        </w:rPr>
+        <w:t xml:space="preserve"> et </w:t>
+      </w:r>
+      <w:r>
+        <w:rPr>
+          <w:rFonts w:ascii="Menlo" w:hAnsi="Menlo" w:cs="Menlo"/>
+          <w:sz w:val="25"/>
+          <w:sz-cs w:val="25"/>
+          <w:spacing w:val="0"/>
+          <w:color w:val="181E2A"/>
+        </w:rPr>
+        <w:t xml:space="preserve">can_send = true</w:t>
+      </w:r>
+      <w:r>
+        <w:rPr>
+          <w:rFonts w:ascii="Helvetica" w:hAnsi="Helvetica" w:cs="Helvetica"/>
+          <w:sz w:val="29"/>
+          <w:sz-cs w:val="29"/>
+          <w:spacing w:val="0"/>
+          <w:color w:val="181E2A"/>
+        </w:rPr>
+        <w:t xml:space="preserve">.</w:t>
+      </w:r>
+    </w:p>
+    <w:p>
+      <w:pPr>
+        <w:ind w:left="720" w:first-line="-720"/>
+        <w:spacing w:after="106"/>
+      </w:pPr>
+      <w:r>
+        <w:rPr>
+          <w:rFonts w:ascii="Helvetica" w:hAnsi="Helvetica" w:cs="Helvetica"/>
+          <w:sz w:val="29"/>
+          <w:sz-cs w:val="29"/>
+          <w:color w:val="181E2A"/>
+        </w:rPr>
+        <w:t xml:space="preserve"/>
+        <w:tab/>
+        <w:t xml:space="preserve">12</w:t>
+        <w:tab/>
+        <w:t xml:space="preserve"/>
+      </w:r>
+      <w:r>
+        <w:rPr>
+          <w:rFonts w:ascii="Helvetica" w:hAnsi="Helvetica" w:cs="Helvetica"/>
+          <w:sz w:val="29"/>
+          <w:sz-cs w:val="29"/>
+          <w:spacing w:val="0"/>
+          <w:color w:val="181E2A"/>
+        </w:rPr>
+        <w:t xml:space="preserve">Vérifier la réponse de </w:t>
+      </w:r>
+      <w:r>
+        <w:rPr>
+          <w:rFonts w:ascii="Helvetica" w:hAnsi="Helvetica" w:cs="Helvetica"/>
+          <w:sz w:val="29"/>
+          <w:sz-cs w:val="29"/>
+          <w:b/>
+          <w:spacing w:val="0"/>
+          <w:color w:val="181E2A"/>
+        </w:rPr>
+        <w:t xml:space="preserve">Send External Prospect Email</w:t>
+      </w:r>
+      <w:r>
+        <w:rPr>
+          <w:rFonts w:ascii="Helvetica" w:hAnsi="Helvetica" w:cs="Helvetica"/>
+          <w:sz w:val="29"/>
+          <w:sz-cs w:val="29"/>
+          <w:spacing w:val="0"/>
+          <w:color w:val="181E2A"/>
+        </w:rPr>
+        <w:t xml:space="preserve">.</w:t>
+      </w:r>
+    </w:p>
+    <w:p>
+      <w:pPr>
+        <w:spacing w:after="160"/>
+      </w:pPr>
+      <w:r>
+        <w:rPr>
+          <w:rFonts w:ascii="Helvetica" w:hAnsi="Helvetica" w:cs="Helvetica"/>
+          <w:sz w:val="32"/>
+          <w:sz-cs w:val="32"/>
+          <w:b/>
+          <w:spacing w:val="0"/>
+          <w:color w:val="0F3A6E"/>
+        </w:rPr>
+        <w:t xml:space="preserve">7.5 Règles de qualité du deck premium</w:t>
       </w:r>
     </w:p>
     <w:p>
@@ -4337,7 +5301,7 @@
           <w:spacing w:val="0"/>
           <w:color w:val="0F3A6E"/>
         </w:rPr>
-        <w:t xml:space="preserve">8. Procedure de lecture des executions</w:t>
+        <w:t xml:space="preserve">8. Procédure de lecture des exécutions</w:t>
       </w:r>
     </w:p>
     <w:p>
@@ -4373,7 +5337,7 @@
           <w:spacing w:val="0"/>
           <w:color w:val="181E2A"/>
         </w:rPr>
-        <w:t xml:space="preserve">, pas seulement dans l editeur de noeuds.</w:t>
+        <w:t xml:space="preserve">, pas seulement dans l éditeur de nœuds.</w:t>
       </w:r>
     </w:p>
     <w:p>
@@ -4402,7 +5366,7 @@
           <w:spacing w:val="0"/>
           <w:color w:val="181E2A"/>
         </w:rPr>
-        <w:t xml:space="preserve">Ouvrir la derniere execution du workflow principal apres generation.</w:t>
+        <w:t xml:space="preserve">Ouvrir la dernière exécution du workflow principal après génération.</w:t>
       </w:r>
     </w:p>
     <w:p>
@@ -4431,7 +5395,7 @@
           <w:spacing w:val="0"/>
           <w:color w:val="181E2A"/>
         </w:rPr>
-        <w:t xml:space="preserve">Ouvrir la derniere execution webhook apres clic sur </w:t>
+        <w:t xml:space="preserve">Ouvrir la dernière exécution webhook après clic sur </w:t>
       </w:r>
       <w:r>
         <w:rPr>
@@ -4481,7 +5445,7 @@
           <w:spacing w:val="0"/>
           <w:color w:val="181E2A"/>
         </w:rPr>
-        <w:t xml:space="preserve">Verifier la branche </w:t>
+        <w:t xml:space="preserve">Vérifier la branche </w:t>
       </w:r>
       <w:r>
         <w:rPr>
@@ -4572,7 +5536,7 @@
           <w:spacing w:val="0"/>
           <w:color w:val="181E2A"/>
         </w:rPr>
-        <w:t xml:space="preserve">Verifier le nombre de pieces jointes dans </w:t>
+        <w:t xml:space="preserve">Vérifier le nombre de pièces jointes dans </w:t>
       </w:r>
       <w:r>
         <w:rPr>
@@ -4952,6 +5916,125 @@
           <w:spacing w:val="0"/>
           <w:color w:val="181E2A"/>
         </w:rPr>
+        <w:t xml:space="preserve">Dans </w:t>
+      </w:r>
+      <w:r>
+        <w:rPr>
+          <w:rFonts w:ascii="Menlo" w:hAnsi="Menlo" w:cs="Menlo"/>
+          <w:sz w:val="25"/>
+          <w:sz-cs w:val="25"/>
+          <w:spacing w:val="0"/>
+          <w:color w:val="181E2A"/>
+        </w:rPr>
+        <w:t xml:space="preserve">FINAL-10</w:t>
+      </w:r>
+      <w:r>
+        <w:rPr>
+          <w:rFonts w:ascii="Helvetica" w:hAnsi="Helvetica" w:cs="Helvetica"/>
+          <w:sz w:val="29"/>
+          <w:sz-cs w:val="29"/>
+          <w:spacing w:val="0"/>
+          <w:color w:val="181E2A"/>
+        </w:rPr>
+        <w:t xml:space="preserve">, la branche d’envoi prospect se base bien sur </w:t>
+      </w:r>
+      <w:r>
+        <w:rPr>
+          <w:rFonts w:ascii="Menlo" w:hAnsi="Menlo" w:cs="Menlo"/>
+          <w:sz w:val="25"/>
+          <w:sz-cs w:val="25"/>
+          <w:spacing w:val="0"/>
+          <w:color w:val="181E2A"/>
+        </w:rPr>
+        <w:t xml:space="preserve">Build Send Context</w:t>
+      </w:r>
+      <w:r>
+        <w:rPr>
+          <w:rFonts w:ascii="Helvetica" w:hAnsi="Helvetica" w:cs="Helvetica"/>
+          <w:sz w:val="29"/>
+          <w:sz-cs w:val="29"/>
+          <w:spacing w:val="0"/>
+          <w:color w:val="181E2A"/>
+        </w:rPr>
+        <w:t xml:space="preserve">, qui accepte des attachments avec </w:t>
+      </w:r>
+      <w:r>
+        <w:rPr>
+          <w:rFonts w:ascii="Menlo" w:hAnsi="Menlo" w:cs="Menlo"/>
+          <w:sz w:val="25"/>
+          <w:sz-cs w:val="25"/>
+          <w:spacing w:val="0"/>
+          <w:color w:val="181E2A"/>
+        </w:rPr>
+        <w:t xml:space="preserve">content</w:t>
+      </w:r>
+      <w:r>
+        <w:rPr>
+          <w:rFonts w:ascii="Helvetica" w:hAnsi="Helvetica" w:cs="Helvetica"/>
+          <w:sz w:val="29"/>
+          <w:sz-cs w:val="29"/>
+          <w:spacing w:val="0"/>
+          <w:color w:val="181E2A"/>
+        </w:rPr>
+        <w:t xml:space="preserve"> ou </w:t>
+      </w:r>
+      <w:r>
+        <w:rPr>
+          <w:rFonts w:ascii="Menlo" w:hAnsi="Menlo" w:cs="Menlo"/>
+          <w:sz w:val="25"/>
+          <w:sz-cs w:val="25"/>
+          <w:spacing w:val="0"/>
+          <w:color w:val="181E2A"/>
+        </w:rPr>
+        <w:t xml:space="preserve">path</w:t>
+      </w:r>
+      <w:r>
+        <w:rPr>
+          <w:rFonts w:ascii="Helvetica" w:hAnsi="Helvetica" w:cs="Helvetica"/>
+          <w:sz w:val="29"/>
+          <w:sz-cs w:val="29"/>
+          <w:spacing w:val="0"/>
+          <w:color w:val="181E2A"/>
+        </w:rPr>
+        <w:t xml:space="preserve"> et exige un PDF plus un PPTX.</w:t>
+      </w:r>
+      <w:r>
+        <w:rPr>
+          <w:rFonts w:ascii="Helvetica" w:hAnsi="Helvetica" w:cs="Helvetica"/>
+          <w:sz w:val="29"/>
+          <w:sz-cs w:val="29"/>
+          <w:spacing w:val="0"/>
+          <w:color w:val="181E2A"/>
+        </w:rPr>
+        <w:t xml:space="preserve"/>
+      </w:r>
+    </w:p>
+    <w:p>
+      <w:pPr>
+        <w:ind w:left="720" w:first-line="-720"/>
+        <w:spacing w:after="106"/>
+      </w:pPr>
+      <w:r>
+        <w:rPr>
+          <w:rFonts w:ascii="Helvetica" w:hAnsi="Helvetica" w:cs="Helvetica"/>
+          <w:sz w:val="29"/>
+          <w:sz-cs w:val="29"/>
+          <w:color w:val="181E2A"/>
+        </w:rPr>
+        <w:t xml:space="preserve"/>
+        <w:tab/>
+        <w:t xml:space="preserve">•</w:t>
+        <w:tab/>
+        <w:t xml:space="preserve"/>
+      </w:r>
+      <w:r>
+        <w:rPr>
+          <w:rFonts w:ascii="Helvetica" w:hAnsi="Helvetica" w:cs="Helvetica"/>
+          <w:sz w:val="29"/>
+          <w:sz-cs w:val="29"/>
+          <w:spacing w:val="0"/>
+          <w:color w:val="181E2A"/>
+        </w:rPr>
         <w:t xml:space="preserve">Le résumé d’approbation interne reflète désormais </w:t>
       </w:r>
       <w:r>
@@ -4972,7 +6055,7 @@
           <w:spacing w:val="0"/>
           <w:color w:val="181E2A"/>
         </w:rPr>
-        <w:t xml:space="preserve">, le nom des fichiers joints et les meilleurs fallbacks commerciaux disponibles.</w:t>
+        <w:t xml:space="preserve"> et le nombre attendu de pièces jointes, même si certains libellés visibles dans l’export restent encore écrits sans accents.</w:t>
       </w:r>
       <w:r>
         <w:rPr>
@@ -5071,6 +6154,45 @@
           <w:color w:val="181E2A"/>
         </w:rPr>
         <w:t xml:space="preserve">Le renderer deck premium gère désormais la localisation FR / EN / ES, les accents visibles, la réduction intelligente des CTA et la répartition dynamique des cas d’usage pour limiter les chevauchements.</w:t>
+      </w:r>
+      <w:r>
+        <w:rPr>
+          <w:rFonts w:ascii="Helvetica" w:hAnsi="Helvetica" w:cs="Helvetica"/>
+          <w:sz w:val="29"/>
+          <w:sz-cs w:val="29"/>
+          <w:spacing w:val="0"/>
+          <w:color w:val="181E2A"/>
+        </w:rPr>
+        <w:t xml:space="preserve"/>
+      </w:r>
+    </w:p>
+    <w:p>
+      <w:pPr>
+        <w:ind w:left="720" w:first-line="-720"/>
+        <w:spacing w:after="106"/>
+      </w:pPr>
+      <w:r>
+        <w:rPr>
+          <w:rFonts w:ascii="Helvetica" w:hAnsi="Helvetica" w:cs="Helvetica"/>
+          <w:sz w:val="29"/>
+          <w:sz-cs w:val="29"/>
+          <w:color w:val="181E2A"/>
+        </w:rPr>
+        <w:t xml:space="preserve"/>
+        <w:tab/>
+        <w:t xml:space="preserve">•</w:t>
+        <w:tab/>
+        <w:t xml:space="preserve"/>
+      </w:r>
+      <w:r>
+        <w:rPr>
+          <w:rFonts w:ascii="Helvetica" w:hAnsi="Helvetica" w:cs="Helvetica"/>
+          <w:sz w:val="29"/>
+          <w:sz-cs w:val="29"/>
+          <w:spacing w:val="0"/>
+          <w:color w:val="181E2A"/>
+        </w:rPr>
+        <w:t xml:space="preserve">Le workflow exporté conserve encore des nœuds historiques catalogue statique, mais ils ne définissent plus la cible fonctionnelle du flux V3 phase 1 deck PPTX.</w:t>
       </w:r>
       <w:r>
         <w:rPr>
@@ -5265,7 +6387,7 @@
           <w:spacing w:val="0"/>
           <w:color w:val="0F3A6E"/>
         </w:rPr>
-        <w:t xml:space="preserve">11. Regles commerciales et d exploitation</w:t>
+        <w:t xml:space="preserve">11. Règles commerciales et d’exploitation</w:t>
       </w:r>
     </w:p>
     <w:p>
@@ -5294,7 +6416,7 @@
           <w:spacing w:val="0"/>
           <w:color w:val="181E2A"/>
         </w:rPr>
-        <w:t xml:space="preserve">La V4 pilote les quotas quotidiens et les regles d arret.</w:t>
+        <w:t xml:space="preserve">La V4 pilote les quotas quotidiens et les règles d’arrêt.</w:t>
       </w:r>
     </w:p>
     <w:p>
@@ -5323,7 +6445,7 @@
           <w:spacing w:val="0"/>
           <w:color w:val="181E2A"/>
         </w:rPr>
-        <w:t xml:space="preserve">La V5 grossit la base CRM sans envoyer elle-meme les courriers.</w:t>
+        <w:t xml:space="preserve">La V5 grossit la base CRM sans envoyer elle-même les courriers.</w:t>
       </w:r>
     </w:p>
     <w:p>
@@ -5352,7 +6474,7 @@
           <w:spacing w:val="0"/>
           <w:color w:val="181E2A"/>
         </w:rPr>
-        <w:t xml:space="preserve">Le flux V3 doit rester reserve aux prospects valides et eligibles.</w:t>
+        <w:t xml:space="preserve">Le flux V3 doit rester réservé aux prospects validés et éligibles.</w:t>
       </w:r>
     </w:p>
     <w:p>
@@ -5381,7 +6503,7 @@
           <w:spacing w:val="0"/>
           <w:color w:val="181E2A"/>
         </w:rPr>
-        <w:t xml:space="preserve">Ne pas augmenter les volumes tant que les boucles de reponse et les signaux de niche ne sont pas stabilises.</w:t>
+        <w:t xml:space="preserve">Ne pas augmenter les volumes tant que les boucles de réponse et les signaux de niche ne sont pas stabilisés.</w:t>
       </w:r>
     </w:p>
     <w:p>
@@ -5752,6 +6874,72 @@
           <w:spacing w:val="0"/>
           <w:color w:val="181E2A"/>
         </w:rPr>
+        <w:t xml:space="preserve">Externaliser toutes les clés encore écrites en dur dans l’export </w:t>
+      </w:r>
+      <w:r>
+        <w:rPr>
+          <w:rFonts w:ascii="Menlo" w:hAnsi="Menlo" w:cs="Menlo"/>
+          <w:sz w:val="25"/>
+          <w:sz-cs w:val="25"/>
+          <w:spacing w:val="0"/>
+          <w:color w:val="181E2A"/>
+        </w:rPr>
+        <w:t xml:space="preserve">FINAL-10</w:t>
+      </w:r>
+      <w:r>
+        <w:rPr>
+          <w:rFonts w:ascii="Helvetica" w:hAnsi="Helvetica" w:cs="Helvetica"/>
+          <w:sz w:val="29"/>
+          <w:sz-cs w:val="29"/>
+          <w:spacing w:val="0"/>
+          <w:color w:val="181E2A"/>
+        </w:rPr>
+        <w:t xml:space="preserve"> : Supabase, Resend et </w:t>
+      </w:r>
+      <w:r>
+        <w:rPr>
+          <w:rFonts w:ascii="Menlo" w:hAnsi="Menlo" w:cs="Menlo"/>
+          <w:sz w:val="25"/>
+          <w:sz-cs w:val="25"/>
+          <w:spacing w:val="0"/>
+          <w:color w:val="181E2A"/>
+        </w:rPr>
+        <w:t xml:space="preserve">x-admin-token</w:t>
+      </w:r>
+      <w:r>
+        <w:rPr>
+          <w:rFonts w:ascii="Helvetica" w:hAnsi="Helvetica" w:cs="Helvetica"/>
+          <w:sz w:val="29"/>
+          <w:sz-cs w:val="29"/>
+          <w:spacing w:val="0"/>
+          <w:color w:val="181E2A"/>
+        </w:rPr>
+        <w:t xml:space="preserve"/>
+      </w:r>
+    </w:p>
+    <w:p>
+      <w:pPr/>
+      <w:r>
+        <w:rPr>
+          <w:rFonts w:ascii="Helvetica" w:hAnsi="Helvetica" w:cs="Helvetica"/>
+          <w:sz w:val="29"/>
+          <w:sz-cs w:val="29"/>
+          <w:spacing w:val="0"/>
+          <w:color w:val="181E2A"/>
+        </w:rPr>
+        <w:t xml:space="preserve">Urgent</w:t>
+      </w:r>
+    </w:p>
+    <w:p>
+      <w:pPr/>
+      <w:r>
+        <w:rPr>
+          <w:rFonts w:ascii="Helvetica" w:hAnsi="Helvetica" w:cs="Helvetica"/>
+          <w:sz w:val="29"/>
+          <w:sz-cs w:val="29"/>
+          <w:spacing w:val="0"/>
+          <w:color w:val="181E2A"/>
+        </w:rPr>
         <w:t xml:space="preserve">Rendre le formulaire d audit reellement dynamique via </w:t>
       </w:r>
       <w:r>
@@ -5916,7 +7104,7 @@
           <w:spacing w:val="0"/>
           <w:color w:val="181E2A"/>
         </w:rPr>
-        <w:t xml:space="preserve">Tester francais, anglais et espagnol sur des cas reels distincts</w:t>
+        <w:t xml:space="preserve">Tester français, anglais et espagnol sur des cas réels distincts</w:t>
       </w:r>
     </w:p>
     <w:p>
@@ -6012,7 +7200,27 @@
           <w:spacing w:val="0"/>
           <w:color w:val="181E2A"/>
         </w:rPr>
-        <w:t xml:space="preserve">Le système TransferAI est maintenant composé d’une couche amont CRM, d’une couche de batch et d’une couche de prospection personnalisée avec validation humaine. La génération du catalogue par pack est validée. Le deck PPTX premium dynamique est désormais actif côté backend, avec stockage Supabase, localisation par langue, gestion des accents et mécanismes de réduction de densité pour tenir dans 8 à 10 slides lisibles. Le chantier structurant qui reste ouvert en priorité est la finalisation d’un audit web dynamique réellement exploité par </w:t>
+        <w:t xml:space="preserve">Le système TransferAI est maintenant composé d’une couche amont CRM, d’une couche de batch et d’une couche de prospection personnalisée avec validation humaine. Dans l’export </w:t>
+      </w:r>
+      <w:r>
+        <w:rPr>
+          <w:rFonts w:ascii="Menlo" w:hAnsi="Menlo" w:cs="Menlo"/>
+          <w:sz w:val="25"/>
+          <w:sz-cs w:val="25"/>
+          <w:spacing w:val="0"/>
+          <w:color w:val="181E2A"/>
+        </w:rPr>
+        <w:t xml:space="preserve">FINAL-10</w:t>
+      </w:r>
+      <w:r>
+        <w:rPr>
+          <w:rFonts w:ascii="Helvetica" w:hAnsi="Helvetica" w:cs="Helvetica"/>
+          <w:sz w:val="29"/>
+          <w:sz-cs w:val="29"/>
+          <w:spacing w:val="0"/>
+          <w:color w:val="181E2A"/>
+        </w:rPr>
+        <w:t xml:space="preserve">, la génération du catalogue par pack et du deck PPTX premium dynamique est opérationnelle, avec stockage Supabase, localisation par langue, gestion des accents et mécanismes de réduction de densité pour tenir dans 8 à 10 slides lisibles. Les deux chantiers prioritaires qui restent ouverts sont l’externalisation des secrets encore écrits en dur et la finalisation d’un audit web dynamique réellement exploité par </w:t>
       </w:r>
       <w:r>
         <w:rPr>
@@ -6032,7 +7240,7 @@
           <w:spacing w:val="0"/>
           <w:color w:val="181E2A"/>
         </w:rPr>
-        <w:t xml:space="preserve"> ainsi que la validation continue du rendu premium sur plusieurs secteurs réels.</w:t>
+        <w:t xml:space="preserve">, tout en poursuivant la validation visuelle du rendu premium sur plusieurs secteurs réels.</w:t>
       </w:r>
     </w:p>
     <w:p>

</xml_diff>